<commit_message>
Mejora del Project Charter
</commit_message>
<xml_diff>
--- a/docs/Kickoff Project Charter.docx
+++ b/docs/Kickoff Project Charter.docx
@@ -1,6 +1,6 @@
 
 <file path=word/document.xml><?xml version="1.0" encoding="utf-8"?>
-<w:document xmlns:wpc="http://schemas.microsoft.com/office/word/2010/wordprocessingCanvas" xmlns:cx="http://schemas.microsoft.com/office/drawing/2014/chartex" xmlns:cx1="http://schemas.microsoft.com/office/drawing/2015/9/8/chartex" xmlns:cx2="http://schemas.microsoft.com/office/drawing/2015/10/21/chartex" xmlns:cx3="http://schemas.microsoft.com/office/drawing/2016/5/9/chartex" xmlns:cx4="http://schemas.microsoft.com/office/drawing/2016/5/10/chartex" xmlns:cx5="http://schemas.microsoft.com/office/drawing/2016/5/11/chartex" xmlns:cx6="http://schemas.microsoft.com/office/drawing/2016/5/12/chartex" xmlns:cx7="http://schemas.microsoft.com/office/drawing/2016/5/13/chartex" xmlns:cx8="http://schemas.microsoft.com/office/drawing/2016/5/14/chartex" xmlns:mc="http://schemas.openxmlformats.org/markup-compatibility/2006" xmlns:aink="http://schemas.microsoft.com/office/drawing/2016/ink" xmlns:am3d="http://schemas.microsoft.com/office/drawing/2017/model3d" xmlns:o="urn:schemas-microsoft-com:office:office" xmlns:oel="http://schemas.microsoft.com/office/2019/extlst" xmlns:r="http://schemas.openxmlformats.org/officeDocument/2006/relationships" xmlns:m="http://schemas.openxmlformats.org/officeDocument/2006/math" xmlns:v="urn:schemas-microsoft-com:vml" xmlns:wp14="http://schemas.microsoft.com/office/word/2010/wordprocessingDrawing" xmlns:wp="http://schemas.openxmlformats.org/drawingml/2006/wordprocessingDrawing" xmlns:w10="urn:schemas-microsoft-com:office:word" xmlns:w="http://schemas.openxmlformats.org/wordprocessingml/2006/main" xmlns:w14="http://schemas.microsoft.com/office/word/2010/wordml" xmlns:w15="http://schemas.microsoft.com/office/word/2012/wordml" xmlns:w16cex="http://schemas.microsoft.com/office/word/2018/wordml/cex" xmlns:w16cid="http://schemas.microsoft.com/office/word/2016/wordml/cid" xmlns:w16="http://schemas.microsoft.com/office/word/2018/wordml" xmlns:w16du="http://schemas.microsoft.com/office/word/2023/wordml/word16du" xmlns:w16sdtdh="http://schemas.microsoft.com/office/word/2020/wordml/sdtdatahash" xmlns:w16sdtfl="http://schemas.microsoft.com/office/word/2024/wordml/sdtformatlock" xmlns:w16se="http://schemas.microsoft.com/office/word/2015/wordml/symex" xmlns:wpg="http://schemas.microsoft.com/office/word/2010/wordprocessingGroup" xmlns:wpi="http://schemas.microsoft.com/office/word/2010/wordprocessingInk" xmlns:wne="http://schemas.microsoft.com/office/word/2006/wordml" xmlns:wps="http://schemas.microsoft.com/office/word/2010/wordprocessingShape" mc:Ignorable="w14 w15 w16se w16cid w16 w16cex w16sdtdh w16sdtfl w16du wp14">
+<w:document xmlns:wpc="http://schemas.microsoft.com/office/word/2010/wordprocessingCanvas" xmlns:cx="http://schemas.microsoft.com/office/drawing/2014/chartex" xmlns:cx1="http://schemas.microsoft.com/office/drawing/2015/9/8/chartex" xmlns:cx2="http://schemas.microsoft.com/office/drawing/2015/10/21/chartex" xmlns:cx3="http://schemas.microsoft.com/office/drawing/2016/5/9/chartex" xmlns:cx4="http://schemas.microsoft.com/office/drawing/2016/5/10/chartex" xmlns:cx5="http://schemas.microsoft.com/office/drawing/2016/5/11/chartex" xmlns:cx6="http://schemas.microsoft.com/office/drawing/2016/5/12/chartex" xmlns:cx7="http://schemas.microsoft.com/office/drawing/2016/5/13/chartex" xmlns:cx8="http://schemas.microsoft.com/office/drawing/2016/5/14/chartex" xmlns:mc="http://schemas.openxmlformats.org/markup-compatibility/2006" xmlns:aink="http://schemas.microsoft.com/office/drawing/2016/ink" xmlns:am3d="http://schemas.microsoft.com/office/drawing/2017/model3d" xmlns:o="urn:schemas-microsoft-com:office:office" xmlns:r="http://schemas.openxmlformats.org/officeDocument/2006/relationships" xmlns:m="http://schemas.openxmlformats.org/officeDocument/2006/math" xmlns:v="urn:schemas-microsoft-com:vml" xmlns:wp14="http://schemas.microsoft.com/office/word/2010/wordprocessingDrawing" xmlns:wp="http://schemas.openxmlformats.org/drawingml/2006/wordprocessingDrawing" xmlns:w10="urn:schemas-microsoft-com:office:word" xmlns:w="http://schemas.openxmlformats.org/wordprocessingml/2006/main" xmlns:w14="http://schemas.microsoft.com/office/word/2010/wordml" xmlns:w15="http://schemas.microsoft.com/office/word/2012/wordml" xmlns:w16cid="http://schemas.microsoft.com/office/word/2016/wordml/cid" xmlns:w16se="http://schemas.microsoft.com/office/word/2015/wordml/symex" xmlns:wpg="http://schemas.microsoft.com/office/word/2010/wordprocessingGroup" xmlns:wpi="http://schemas.microsoft.com/office/word/2010/wordprocessingInk" xmlns:wne="http://schemas.microsoft.com/office/word/2006/wordml" xmlns:wps="http://schemas.microsoft.com/office/word/2010/wordprocessingShape" mc:Ignorable="w14 w15 w16se w16cid wp14">
   <w:background w:color="FCFBF5"/>
   <w:body>
     <w:p>
@@ -58,14 +58,34 @@
                 <w:szCs w:val="44"/>
               </w:rPr>
             </w:pPr>
+            <w:proofErr w:type="spellStart"/>
             <w:r>
               <w:rPr>
                 <w:rFonts w:ascii="Arial" w:eastAsia="Arial" w:hAnsi="Arial" w:cs="Arial"/>
                 <w:sz w:val="44"/>
                 <w:szCs w:val="44"/>
               </w:rPr>
-              <w:t>Titulo de proyecto</w:t>
-            </w:r>
+              <w:t>Titulo</w:t>
+            </w:r>
+            <w:proofErr w:type="spellEnd"/>
+            <w:r>
+              <w:rPr>
+                <w:rFonts w:ascii="Arial" w:eastAsia="Arial" w:hAnsi="Arial" w:cs="Arial"/>
+                <w:sz w:val="44"/>
+                <w:szCs w:val="44"/>
+              </w:rPr>
+              <w:t xml:space="preserve"> de </w:t>
+            </w:r>
+            <w:proofErr w:type="spellStart"/>
+            <w:r>
+              <w:rPr>
+                <w:rFonts w:ascii="Arial" w:eastAsia="Arial" w:hAnsi="Arial" w:cs="Arial"/>
+                <w:sz w:val="44"/>
+                <w:szCs w:val="44"/>
+              </w:rPr>
+              <w:t>proyecto</w:t>
+            </w:r>
+            <w:proofErr w:type="spellEnd"/>
             <w:r>
               <w:rPr>
                 <w:rFonts w:ascii="Arial" w:eastAsia="Arial" w:hAnsi="Arial" w:cs="Arial"/>
@@ -248,8 +268,20 @@
           <w:sz w:val="98"/>
           <w:szCs w:val="98"/>
         </w:rPr>
-        <w:t>Carta del proyecto</w:t>
+        <w:t xml:space="preserve">Carta del </w:t>
       </w:r>
+      <w:proofErr w:type="spellStart"/>
+      <w:r>
+        <w:rPr>
+          <w:rFonts w:ascii="Arial" w:eastAsia="Arial" w:hAnsi="Arial" w:cs="Arial"/>
+          <w:sz w:val="98"/>
+          <w:szCs w:val="98"/>
+        </w:rPr>
+        <w:t>proyecto</w:t>
+      </w:r>
+      <w:bookmarkStart w:id="0" w:name="_GoBack"/>
+      <w:bookmarkEnd w:id="0"/>
+      <w:proofErr w:type="spellEnd"/>
       <w:r>
         <w:rPr>
           <w:noProof/>
@@ -316,7 +348,15 @@
                                 <w:color w:val="FFFFFF"/>
                                 <w:sz w:val="24"/>
                               </w:rPr>
-                              <w:t>Capture the below details about your project. Make sure you involve your sponsor(s) to help articulate each part of the project.</w:t>
+                              <w:t>Capture the below details about your project. Make sure you involve your sponsor(s) to help articulate each part</w:t>
+                            </w:r>
+                            <w:r>
+                              <w:rPr>
+                                <w:rFonts w:ascii="Arial" w:eastAsia="Arial" w:hAnsi="Arial" w:cs="Arial"/>
+                                <w:color w:val="FFFFFF"/>
+                                <w:sz w:val="24"/>
+                              </w:rPr>
+                              <w:t xml:space="preserve"> of the project.</w:t>
                             </w:r>
                           </w:p>
                           <w:p>
@@ -338,7 +378,7 @@
           </mc:Choice>
           <mc:Fallback>
             <w:pict>
-              <v:rect w14:anchorId="647B15B2" id="Rectángulo 225" o:spid="_x0000_s1026" style="position:absolute;margin-left:1.15pt;margin-top:77.1pt;width:537.75pt;height:77.3pt;z-index:251658240;visibility:visible;mso-wrap-style:square;mso-wrap-distance-left:9pt;mso-wrap-distance-top:3.6pt;mso-wrap-distance-right:9pt;mso-wrap-distance-bottom:3.6pt;mso-position-horizontal:absolute;mso-position-horizontal-relative:text;mso-position-vertical:absolute;mso-position-vertical-relative:text;v-text-anchor:top" o:gfxdata="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" fillcolor="#59d4eb" stroked="f">
+              <v:rect w14:anchorId="647B15B2" id="Rectángulo 225" o:spid="_x0000_s1026" style="position:absolute;margin-left:1.15pt;margin-top:77.1pt;width:537.75pt;height:77.3pt;z-index:251658240;visibility:visible;mso-wrap-style:square;mso-wrap-distance-left:9pt;mso-wrap-distance-top:3.6pt;mso-wrap-distance-right:9pt;mso-wrap-distance-bottom:3.6pt;mso-position-horizontal:absolute;mso-position-horizontal-relative:text;mso-position-vertical:absolute;mso-position-vertical-relative:text;v-text-anchor:top" o:gfxdata="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" fillcolor="#59d4eb" stroked="f">
                 <v:textbox inset="2.53958mm,1.2694mm,2.53958mm,1.2694mm">
                   <w:txbxContent>
                     <w:p>
@@ -366,7 +406,15 @@
                           <w:color w:val="FFFFFF"/>
                           <w:sz w:val="24"/>
                         </w:rPr>
-                        <w:t>Capture the below details about your project. Make sure you involve your sponsor(s) to help articulate each part of the project.</w:t>
+                        <w:t>Capture the below details about your project. Make sure you involve your sponsor(s) to help articulate each part</w:t>
+                      </w:r>
+                      <w:r>
+                        <w:rPr>
+                          <w:rFonts w:ascii="Arial" w:eastAsia="Arial" w:hAnsi="Arial" w:cs="Arial"/>
+                          <w:color w:val="FFFFFF"/>
+                          <w:sz w:val="24"/>
+                        </w:rPr>
+                        <w:t xml:space="preserve"> of the project.</w:t>
                       </w:r>
                     </w:p>
                     <w:p>
@@ -518,7 +566,7 @@
                 </mc:Choice>
                 <mc:Fallback>
                   <w:pict>
-                    <v:shape w14:anchorId="49BFD545" id="Forma libre: forma 219" o:spid="_x0000_s1027" style="width:27.25pt;height:24.4pt;visibility:visible;mso-wrap-style:square;mso-left-percent:-10001;mso-top-percent:-10001;mso-position-horizontal:absolute;mso-position-horizontal-relative:char;mso-position-vertical:absolute;mso-position-vertical-relative:line;mso-left-percent:-10001;mso-top-percent:-10001;v-text-anchor:middle" coordsize="271148,228600" o:spt="100" o:gfxdata="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" adj="-11796480,,5400" path="m,l175897,v25453,3260,42922,10367,58373,25274c249721,40181,262883,55556,268605,89444v5722,33888,,92771,,139156l,228600,,xe" fillcolor="#4f17a8" stroked="f">
+                    <v:shape w14:anchorId="49BFD545" id="Forma libre: forma 219" o:spid="_x0000_s1027" style="width:27.25pt;height:24.4pt;visibility:visible;mso-wrap-style:square;mso-left-percent:-10001;mso-top-percent:-10001;mso-position-horizontal:absolute;mso-position-horizontal-relative:char;mso-position-vertical:absolute;mso-position-vertical-relative:line;mso-left-percent:-10001;mso-top-percent:-10001;v-text-anchor:middle" coordsize="271148,228600" o:spt="100" o:gfxdata="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" adj="-11796480,,5400" path="m,l175897,v25453,3260,42922,10367,58373,25274c249721,40181,262883,55556,268605,89444v5722,33888,,92771,,139156l,228600,,xe" fillcolor="#4f17a8" stroked="f">
                       <v:stroke joinstyle="miter"/>
                       <v:formulas/>
                       <v:path arrowok="t" o:extrusionok="f" o:connecttype="custom" textboxrect="0,0,271148,228600"/>
@@ -566,6 +614,7 @@
                 <w:szCs w:val="44"/>
               </w:rPr>
             </w:pPr>
+            <w:proofErr w:type="spellStart"/>
             <w:r>
               <w:rPr>
                 <w:rFonts w:ascii="Arial" w:eastAsia="Arial" w:hAnsi="Arial" w:cs="Arial"/>
@@ -575,8 +624,33 @@
                 <w:sz w:val="44"/>
                 <w:szCs w:val="44"/>
               </w:rPr>
-              <w:t>Detalles de proyecto</w:t>
-            </w:r>
+              <w:t>Detalles</w:t>
+            </w:r>
+            <w:proofErr w:type="spellEnd"/>
+            <w:r>
+              <w:rPr>
+                <w:rFonts w:ascii="Arial" w:eastAsia="Arial" w:hAnsi="Arial" w:cs="Arial"/>
+                <w:i w:val="0"/>
+                <w:iCs w:val="0"/>
+                <w:color w:val="4F17A8"/>
+                <w:sz w:val="44"/>
+                <w:szCs w:val="44"/>
+              </w:rPr>
+              <w:t xml:space="preserve"> de </w:t>
+            </w:r>
+            <w:proofErr w:type="spellStart"/>
+            <w:r>
+              <w:rPr>
+                <w:rFonts w:ascii="Arial" w:eastAsia="Arial" w:hAnsi="Arial" w:cs="Arial"/>
+                <w:i w:val="0"/>
+                <w:iCs w:val="0"/>
+                <w:color w:val="4F17A8"/>
+                <w:sz w:val="44"/>
+                <w:szCs w:val="44"/>
+              </w:rPr>
+              <w:t>proyecto</w:t>
+            </w:r>
+            <w:proofErr w:type="spellEnd"/>
           </w:p>
         </w:tc>
       </w:tr>
@@ -736,16 +810,101 @@
                 <w:lang w:val="en-US"/>
               </w:rPr>
             </w:pPr>
-            <w:r>
-              <w:rPr>
-                <w:rFonts w:ascii="Arial" w:eastAsia="Arial" w:hAnsi="Arial" w:cs="Arial"/>
-                <w:i w:val="0"/>
-                <w:iCs w:val="0"/>
-                <w:sz w:val="24"/>
-                <w:szCs w:val="24"/>
-                <w:lang w:val="en-US"/>
-              </w:rPr>
-              <w:t xml:space="preserve">Múltiples restricciones académicas y operativas </w:t>
+            <w:proofErr w:type="spellStart"/>
+            <w:r>
+              <w:rPr>
+                <w:rFonts w:ascii="Arial" w:eastAsia="Arial" w:hAnsi="Arial" w:cs="Arial"/>
+                <w:i w:val="0"/>
+                <w:iCs w:val="0"/>
+                <w:sz w:val="24"/>
+                <w:szCs w:val="24"/>
+                <w:lang w:val="en-US"/>
+              </w:rPr>
+              <w:t>Múltiples</w:t>
+            </w:r>
+            <w:proofErr w:type="spellEnd"/>
+            <w:r>
+              <w:rPr>
+                <w:rFonts w:ascii="Arial" w:eastAsia="Arial" w:hAnsi="Arial" w:cs="Arial"/>
+                <w:i w:val="0"/>
+                <w:iCs w:val="0"/>
+                <w:sz w:val="24"/>
+                <w:szCs w:val="24"/>
+                <w:lang w:val="en-US"/>
+              </w:rPr>
+              <w:t xml:space="preserve"> </w:t>
+            </w:r>
+            <w:proofErr w:type="spellStart"/>
+            <w:r>
+              <w:rPr>
+                <w:rFonts w:ascii="Arial" w:eastAsia="Arial" w:hAnsi="Arial" w:cs="Arial"/>
+                <w:i w:val="0"/>
+                <w:iCs w:val="0"/>
+                <w:sz w:val="24"/>
+                <w:szCs w:val="24"/>
+                <w:lang w:val="en-US"/>
+              </w:rPr>
+              <w:t>restricciones</w:t>
+            </w:r>
+            <w:proofErr w:type="spellEnd"/>
+            <w:r>
+              <w:rPr>
+                <w:rFonts w:ascii="Arial" w:eastAsia="Arial" w:hAnsi="Arial" w:cs="Arial"/>
+                <w:i w:val="0"/>
+                <w:iCs w:val="0"/>
+                <w:sz w:val="24"/>
+                <w:szCs w:val="24"/>
+                <w:lang w:val="en-US"/>
+              </w:rPr>
+              <w:t xml:space="preserve"> </w:t>
+            </w:r>
+            <w:proofErr w:type="spellStart"/>
+            <w:r>
+              <w:rPr>
+                <w:rFonts w:ascii="Arial" w:eastAsia="Arial" w:hAnsi="Arial" w:cs="Arial"/>
+                <w:i w:val="0"/>
+                <w:iCs w:val="0"/>
+                <w:sz w:val="24"/>
+                <w:szCs w:val="24"/>
+                <w:lang w:val="en-US"/>
+              </w:rPr>
+              <w:t>académicas</w:t>
+            </w:r>
+            <w:proofErr w:type="spellEnd"/>
+            <w:r>
+              <w:rPr>
+                <w:rFonts w:ascii="Arial" w:eastAsia="Arial" w:hAnsi="Arial" w:cs="Arial"/>
+                <w:i w:val="0"/>
+                <w:iCs w:val="0"/>
+                <w:sz w:val="24"/>
+                <w:szCs w:val="24"/>
+                <w:lang w:val="en-US"/>
+              </w:rPr>
+              <w:t xml:space="preserve"> y </w:t>
+            </w:r>
+            <w:proofErr w:type="spellStart"/>
+            <w:r>
+              <w:rPr>
+                <w:rFonts w:ascii="Arial" w:eastAsia="Arial" w:hAnsi="Arial" w:cs="Arial"/>
+                <w:i w:val="0"/>
+                <w:iCs w:val="0"/>
+                <w:sz w:val="24"/>
+                <w:szCs w:val="24"/>
+                <w:lang w:val="en-US"/>
+              </w:rPr>
+              <w:t>operativas</w:t>
+            </w:r>
+            <w:proofErr w:type="spellEnd"/>
+            <w:r>
+              <w:rPr>
+                <w:rFonts w:ascii="Arial" w:eastAsia="Arial" w:hAnsi="Arial" w:cs="Arial"/>
+                <w:i w:val="0"/>
+                <w:iCs w:val="0"/>
+                <w:sz w:val="24"/>
+                <w:szCs w:val="24"/>
+                <w:lang w:val="en-US"/>
+              </w:rPr>
+              <w:t xml:space="preserve"> </w:t>
             </w:r>
           </w:p>
           <w:p>
@@ -794,16 +953,53 @@
                 <w:lang w:val="en-US"/>
               </w:rPr>
             </w:pPr>
-            <w:r>
-              <w:rPr>
-                <w:rFonts w:ascii="Arial" w:eastAsia="Arial" w:hAnsi="Arial" w:cs="Arial"/>
-                <w:i w:val="0"/>
-                <w:iCs w:val="0"/>
-                <w:sz w:val="24"/>
-                <w:szCs w:val="24"/>
-                <w:lang w:val="en-US"/>
-              </w:rPr>
-              <w:t xml:space="preserve">Limitaciones de infraestructura </w:t>
+            <w:proofErr w:type="spellStart"/>
+            <w:r>
+              <w:rPr>
+                <w:rFonts w:ascii="Arial" w:eastAsia="Arial" w:hAnsi="Arial" w:cs="Arial"/>
+                <w:i w:val="0"/>
+                <w:iCs w:val="0"/>
+                <w:sz w:val="24"/>
+                <w:szCs w:val="24"/>
+                <w:lang w:val="en-US"/>
+              </w:rPr>
+              <w:t>Limitaciones</w:t>
+            </w:r>
+            <w:proofErr w:type="spellEnd"/>
+            <w:r>
+              <w:rPr>
+                <w:rFonts w:ascii="Arial" w:eastAsia="Arial" w:hAnsi="Arial" w:cs="Arial"/>
+                <w:i w:val="0"/>
+                <w:iCs w:val="0"/>
+                <w:sz w:val="24"/>
+                <w:szCs w:val="24"/>
+                <w:lang w:val="en-US"/>
+              </w:rPr>
+              <w:t xml:space="preserve"> de </w:t>
+            </w:r>
+            <w:proofErr w:type="spellStart"/>
+            <w:r>
+              <w:rPr>
+                <w:rFonts w:ascii="Arial" w:eastAsia="Arial" w:hAnsi="Arial" w:cs="Arial"/>
+                <w:i w:val="0"/>
+                <w:iCs w:val="0"/>
+                <w:sz w:val="24"/>
+                <w:szCs w:val="24"/>
+                <w:lang w:val="en-US"/>
+              </w:rPr>
+              <w:t>infraestructura</w:t>
+            </w:r>
+            <w:proofErr w:type="spellEnd"/>
+            <w:r>
+              <w:rPr>
+                <w:rFonts w:ascii="Arial" w:eastAsia="Arial" w:hAnsi="Arial" w:cs="Arial"/>
+                <w:i w:val="0"/>
+                <w:iCs w:val="0"/>
+                <w:sz w:val="24"/>
+                <w:szCs w:val="24"/>
+                <w:lang w:val="en-US"/>
+              </w:rPr>
+              <w:t xml:space="preserve"> </w:t>
             </w:r>
           </w:p>
           <w:p>
@@ -823,16 +1019,77 @@
                 <w:lang w:val="en-US"/>
               </w:rPr>
             </w:pPr>
-            <w:r>
-              <w:rPr>
-                <w:rFonts w:ascii="Arial" w:eastAsia="Arial" w:hAnsi="Arial" w:cs="Arial"/>
-                <w:i w:val="0"/>
-                <w:iCs w:val="0"/>
-                <w:sz w:val="24"/>
-                <w:szCs w:val="24"/>
-                <w:lang w:val="en-US"/>
-              </w:rPr>
-              <w:t xml:space="preserve">Necesidad de optimización eficiente </w:t>
+            <w:proofErr w:type="spellStart"/>
+            <w:r>
+              <w:rPr>
+                <w:rFonts w:ascii="Arial" w:eastAsia="Arial" w:hAnsi="Arial" w:cs="Arial"/>
+                <w:i w:val="0"/>
+                <w:iCs w:val="0"/>
+                <w:sz w:val="24"/>
+                <w:szCs w:val="24"/>
+                <w:lang w:val="en-US"/>
+              </w:rPr>
+              <w:t>Necesidad</w:t>
+            </w:r>
+            <w:proofErr w:type="spellEnd"/>
+            <w:r>
+              <w:rPr>
+                <w:rFonts w:ascii="Arial" w:eastAsia="Arial" w:hAnsi="Arial" w:cs="Arial"/>
+                <w:i w:val="0"/>
+                <w:iCs w:val="0"/>
+                <w:sz w:val="24"/>
+                <w:szCs w:val="24"/>
+                <w:lang w:val="en-US"/>
+              </w:rPr>
+              <w:t xml:space="preserve"> de </w:t>
+            </w:r>
+            <w:proofErr w:type="spellStart"/>
+            <w:r>
+              <w:rPr>
+                <w:rFonts w:ascii="Arial" w:eastAsia="Arial" w:hAnsi="Arial" w:cs="Arial"/>
+                <w:i w:val="0"/>
+                <w:iCs w:val="0"/>
+                <w:sz w:val="24"/>
+                <w:szCs w:val="24"/>
+                <w:lang w:val="en-US"/>
+              </w:rPr>
+              <w:t>optimización</w:t>
+            </w:r>
+            <w:proofErr w:type="spellEnd"/>
+            <w:r>
+              <w:rPr>
+                <w:rFonts w:ascii="Arial" w:eastAsia="Arial" w:hAnsi="Arial" w:cs="Arial"/>
+                <w:i w:val="0"/>
+                <w:iCs w:val="0"/>
+                <w:sz w:val="24"/>
+                <w:szCs w:val="24"/>
+                <w:lang w:val="en-US"/>
+              </w:rPr>
+              <w:t xml:space="preserve"> </w:t>
+            </w:r>
+            <w:proofErr w:type="spellStart"/>
+            <w:r>
+              <w:rPr>
+                <w:rFonts w:ascii="Arial" w:eastAsia="Arial" w:hAnsi="Arial" w:cs="Arial"/>
+                <w:i w:val="0"/>
+                <w:iCs w:val="0"/>
+                <w:sz w:val="24"/>
+                <w:szCs w:val="24"/>
+                <w:lang w:val="en-US"/>
+              </w:rPr>
+              <w:t>eficiente</w:t>
+            </w:r>
+            <w:proofErr w:type="spellEnd"/>
+            <w:r>
+              <w:rPr>
+                <w:rFonts w:ascii="Arial" w:eastAsia="Arial" w:hAnsi="Arial" w:cs="Arial"/>
+                <w:i w:val="0"/>
+                <w:iCs w:val="0"/>
+                <w:sz w:val="24"/>
+                <w:szCs w:val="24"/>
+                <w:lang w:val="en-US"/>
+              </w:rPr>
+              <w:t xml:space="preserve"> </w:t>
             </w:r>
           </w:p>
           <w:p>
@@ -877,16 +1134,53 @@
                 <w:lang w:val="en-US"/>
               </w:rPr>
             </w:pPr>
-            <w:r>
-              <w:rPr>
-                <w:rFonts w:ascii="Arial" w:eastAsia="Arial" w:hAnsi="Arial" w:cs="Arial"/>
-                <w:i w:val="0"/>
-                <w:iCs w:val="0"/>
-                <w:sz w:val="24"/>
-                <w:szCs w:val="24"/>
-                <w:lang w:val="en-US"/>
-              </w:rPr>
-              <w:t xml:space="preserve">Conflictos de horarios </w:t>
+            <w:proofErr w:type="spellStart"/>
+            <w:r>
+              <w:rPr>
+                <w:rFonts w:ascii="Arial" w:eastAsia="Arial" w:hAnsi="Arial" w:cs="Arial"/>
+                <w:i w:val="0"/>
+                <w:iCs w:val="0"/>
+                <w:sz w:val="24"/>
+                <w:szCs w:val="24"/>
+                <w:lang w:val="en-US"/>
+              </w:rPr>
+              <w:t>Conflictos</w:t>
+            </w:r>
+            <w:proofErr w:type="spellEnd"/>
+            <w:r>
+              <w:rPr>
+                <w:rFonts w:ascii="Arial" w:eastAsia="Arial" w:hAnsi="Arial" w:cs="Arial"/>
+                <w:i w:val="0"/>
+                <w:iCs w:val="0"/>
+                <w:sz w:val="24"/>
+                <w:szCs w:val="24"/>
+                <w:lang w:val="en-US"/>
+              </w:rPr>
+              <w:t xml:space="preserve"> de </w:t>
+            </w:r>
+            <w:proofErr w:type="spellStart"/>
+            <w:r>
+              <w:rPr>
+                <w:rFonts w:ascii="Arial" w:eastAsia="Arial" w:hAnsi="Arial" w:cs="Arial"/>
+                <w:i w:val="0"/>
+                <w:iCs w:val="0"/>
+                <w:sz w:val="24"/>
+                <w:szCs w:val="24"/>
+                <w:lang w:val="en-US"/>
+              </w:rPr>
+              <w:t>horarios</w:t>
+            </w:r>
+            <w:proofErr w:type="spellEnd"/>
+            <w:r>
+              <w:rPr>
+                <w:rFonts w:ascii="Arial" w:eastAsia="Arial" w:hAnsi="Arial" w:cs="Arial"/>
+                <w:i w:val="0"/>
+                <w:iCs w:val="0"/>
+                <w:sz w:val="24"/>
+                <w:szCs w:val="24"/>
+                <w:lang w:val="en-US"/>
+              </w:rPr>
+              <w:t xml:space="preserve"> </w:t>
             </w:r>
           </w:p>
           <w:p>
@@ -935,6 +1229,7 @@
                 <w:lang w:val="en-US"/>
               </w:rPr>
             </w:pPr>
+            <w:proofErr w:type="spellStart"/>
             <w:r>
               <w:rPr>
                 <w:rFonts w:ascii="Arial" w:eastAsia="Arial" w:hAnsi="Arial" w:cs="Arial"/>
@@ -945,7 +1240,67 @@
                 <w:lang w:val="en-US"/>
               </w:rPr>
               <w:lastRenderedPageBreak/>
-              <w:t xml:space="preserve">Insatisfacción de estudiantes y docentes </w:t>
+              <w:t>Insatisfacción</w:t>
+            </w:r>
+            <w:proofErr w:type="spellEnd"/>
+            <w:r>
+              <w:rPr>
+                <w:rFonts w:ascii="Arial" w:eastAsia="Arial" w:hAnsi="Arial" w:cs="Arial"/>
+                <w:i w:val="0"/>
+                <w:iCs w:val="0"/>
+                <w:sz w:val="24"/>
+                <w:szCs w:val="24"/>
+                <w:lang w:val="en-US"/>
+              </w:rPr>
+              <w:t xml:space="preserve"> de </w:t>
+            </w:r>
+            <w:proofErr w:type="spellStart"/>
+            <w:r>
+              <w:rPr>
+                <w:rFonts w:ascii="Arial" w:eastAsia="Arial" w:hAnsi="Arial" w:cs="Arial"/>
+                <w:i w:val="0"/>
+                <w:iCs w:val="0"/>
+                <w:sz w:val="24"/>
+                <w:szCs w:val="24"/>
+                <w:lang w:val="en-US"/>
+              </w:rPr>
+              <w:t>estudiantes</w:t>
+            </w:r>
+            <w:proofErr w:type="spellEnd"/>
+            <w:r>
+              <w:rPr>
+                <w:rFonts w:ascii="Arial" w:eastAsia="Arial" w:hAnsi="Arial" w:cs="Arial"/>
+                <w:i w:val="0"/>
+                <w:iCs w:val="0"/>
+                <w:sz w:val="24"/>
+                <w:szCs w:val="24"/>
+                <w:lang w:val="en-US"/>
+              </w:rPr>
+              <w:t xml:space="preserve"> y </w:t>
+            </w:r>
+            <w:proofErr w:type="spellStart"/>
+            <w:r>
+              <w:rPr>
+                <w:rFonts w:ascii="Arial" w:eastAsia="Arial" w:hAnsi="Arial" w:cs="Arial"/>
+                <w:i w:val="0"/>
+                <w:iCs w:val="0"/>
+                <w:sz w:val="24"/>
+                <w:szCs w:val="24"/>
+                <w:lang w:val="en-US"/>
+              </w:rPr>
+              <w:t>docentes</w:t>
+            </w:r>
+            <w:proofErr w:type="spellEnd"/>
+            <w:r>
+              <w:rPr>
+                <w:rFonts w:ascii="Arial" w:eastAsia="Arial" w:hAnsi="Arial" w:cs="Arial"/>
+                <w:i w:val="0"/>
+                <w:iCs w:val="0"/>
+                <w:sz w:val="24"/>
+                <w:szCs w:val="24"/>
+                <w:lang w:val="en-US"/>
+              </w:rPr>
+              <w:t xml:space="preserve"> </w:t>
             </w:r>
           </w:p>
           <w:p>
@@ -961,6 +1316,7 @@
                 <w:lang w:val="en-US"/>
               </w:rPr>
             </w:pPr>
+            <w:proofErr w:type="spellStart"/>
             <w:r>
               <w:rPr>
                 <w:rFonts w:ascii="Arial" w:eastAsia="Arial" w:hAnsi="Arial" w:cs="Arial"/>
@@ -972,7 +1328,49 @@
                 <w:szCs w:val="24"/>
                 <w:lang w:val="en-US"/>
               </w:rPr>
-              <w:t>Objetivo del proyecto:</w:t>
+              <w:t>Objetivo</w:t>
+            </w:r>
+            <w:proofErr w:type="spellEnd"/>
+            <w:r>
+              <w:rPr>
+                <w:rFonts w:ascii="Arial" w:eastAsia="Arial" w:hAnsi="Arial" w:cs="Arial"/>
+                <w:b/>
+                <w:bCs/>
+                <w:i w:val="0"/>
+                <w:iCs w:val="0"/>
+                <w:sz w:val="24"/>
+                <w:szCs w:val="24"/>
+                <w:lang w:val="en-US"/>
+              </w:rPr>
+              <w:t xml:space="preserve"> del </w:t>
+            </w:r>
+            <w:proofErr w:type="spellStart"/>
+            <w:r>
+              <w:rPr>
+                <w:rFonts w:ascii="Arial" w:eastAsia="Arial" w:hAnsi="Arial" w:cs="Arial"/>
+                <w:b/>
+                <w:bCs/>
+                <w:i w:val="0"/>
+                <w:iCs w:val="0"/>
+                <w:sz w:val="24"/>
+                <w:szCs w:val="24"/>
+                <w:lang w:val="en-US"/>
+              </w:rPr>
+              <w:t>proyecto</w:t>
+            </w:r>
+            <w:proofErr w:type="spellEnd"/>
+            <w:r>
+              <w:rPr>
+                <w:rFonts w:ascii="Arial" w:eastAsia="Arial" w:hAnsi="Arial" w:cs="Arial"/>
+                <w:b/>
+                <w:bCs/>
+                <w:i w:val="0"/>
+                <w:iCs w:val="0"/>
+                <w:sz w:val="24"/>
+                <w:szCs w:val="24"/>
+                <w:lang w:val="en-US"/>
+              </w:rPr>
+              <w:t>:</w:t>
             </w:r>
           </w:p>
           <w:p>
@@ -997,7 +1395,79 @@
                 <w:szCs w:val="24"/>
                 <w:lang w:val="es-PE"/>
               </w:rPr>
-              <w:t>Desarrollar una aplicación web inteligente capaz de generar horarios académicos óptimos considerando múltiples restricciones académicas, operativas y contextuales, mediante técnicas de modelado como CSP (Constraint Satisfaction Problem) y optimización combinatoria.</w:t>
+              <w:t>Desarrollar una aplicación web inteligente capaz de generar horarios académicos óptimos considerando múltiples restricciones académicas, operativas y contextuales, mediante técnicas de modelado como CSP (</w:t>
+            </w:r>
+            <w:proofErr w:type="spellStart"/>
+            <w:r>
+              <w:rPr>
+                <w:rFonts w:ascii="Arial" w:eastAsia="Arial" w:hAnsi="Arial" w:cs="Arial"/>
+                <w:i w:val="0"/>
+                <w:iCs w:val="0"/>
+                <w:sz w:val="24"/>
+                <w:szCs w:val="24"/>
+                <w:lang w:val="es-PE"/>
+              </w:rPr>
+              <w:t>Constraint</w:t>
+            </w:r>
+            <w:proofErr w:type="spellEnd"/>
+            <w:r>
+              <w:rPr>
+                <w:rFonts w:ascii="Arial" w:eastAsia="Arial" w:hAnsi="Arial" w:cs="Arial"/>
+                <w:i w:val="0"/>
+                <w:iCs w:val="0"/>
+                <w:sz w:val="24"/>
+                <w:szCs w:val="24"/>
+                <w:lang w:val="es-PE"/>
+              </w:rPr>
+              <w:t xml:space="preserve"> </w:t>
+            </w:r>
+            <w:proofErr w:type="spellStart"/>
+            <w:r>
+              <w:rPr>
+                <w:rFonts w:ascii="Arial" w:eastAsia="Arial" w:hAnsi="Arial" w:cs="Arial"/>
+                <w:i w:val="0"/>
+                <w:iCs w:val="0"/>
+                <w:sz w:val="24"/>
+                <w:szCs w:val="24"/>
+                <w:lang w:val="es-PE"/>
+              </w:rPr>
+              <w:t>Satisfaction</w:t>
+            </w:r>
+            <w:proofErr w:type="spellEnd"/>
+            <w:r>
+              <w:rPr>
+                <w:rFonts w:ascii="Arial" w:eastAsia="Arial" w:hAnsi="Arial" w:cs="Arial"/>
+                <w:i w:val="0"/>
+                <w:iCs w:val="0"/>
+                <w:sz w:val="24"/>
+                <w:szCs w:val="24"/>
+                <w:lang w:val="es-PE"/>
+              </w:rPr>
+              <w:t xml:space="preserve"> </w:t>
+            </w:r>
+            <w:proofErr w:type="spellStart"/>
+            <w:r>
+              <w:rPr>
+                <w:rFonts w:ascii="Arial" w:eastAsia="Arial" w:hAnsi="Arial" w:cs="Arial"/>
+                <w:i w:val="0"/>
+                <w:iCs w:val="0"/>
+                <w:sz w:val="24"/>
+                <w:szCs w:val="24"/>
+                <w:lang w:val="es-PE"/>
+              </w:rPr>
+              <w:t>Problem</w:t>
+            </w:r>
+            <w:proofErr w:type="spellEnd"/>
+            <w:r>
+              <w:rPr>
+                <w:rFonts w:ascii="Arial" w:eastAsia="Arial" w:hAnsi="Arial" w:cs="Arial"/>
+                <w:i w:val="0"/>
+                <w:iCs w:val="0"/>
+                <w:sz w:val="24"/>
+                <w:szCs w:val="24"/>
+                <w:lang w:val="es-PE"/>
+              </w:rPr>
+              <w:t>) y optimización combinatoria.</w:t>
             </w:r>
           </w:p>
         </w:tc>
@@ -1028,6 +1498,7 @@
                 <w:szCs w:val="24"/>
               </w:rPr>
             </w:pPr>
+            <w:proofErr w:type="spellStart"/>
             <w:r>
               <w:rPr>
                 <w:rFonts w:ascii="Arial" w:eastAsia="Arial" w:hAnsi="Arial" w:cs="Arial"/>
@@ -1037,7 +1508,40 @@
                 <w:szCs w:val="32"/>
               </w:rPr>
               <w:lastRenderedPageBreak/>
-              <w:t>Requerimientos del proyecto:</w:t>
+              <w:t>Requerimientos</w:t>
+            </w:r>
+            <w:proofErr w:type="spellEnd"/>
+            <w:r>
+              <w:rPr>
+                <w:rFonts w:ascii="Arial" w:eastAsia="Arial" w:hAnsi="Arial" w:cs="Arial"/>
+                <w:i w:val="0"/>
+                <w:iCs w:val="0"/>
+                <w:sz w:val="32"/>
+                <w:szCs w:val="32"/>
+              </w:rPr>
+              <w:t xml:space="preserve"> del </w:t>
+            </w:r>
+            <w:proofErr w:type="spellStart"/>
+            <w:r>
+              <w:rPr>
+                <w:rFonts w:ascii="Arial" w:eastAsia="Arial" w:hAnsi="Arial" w:cs="Arial"/>
+                <w:i w:val="0"/>
+                <w:iCs w:val="0"/>
+                <w:sz w:val="32"/>
+                <w:szCs w:val="32"/>
+              </w:rPr>
+              <w:t>proyecto</w:t>
+            </w:r>
+            <w:proofErr w:type="spellEnd"/>
+            <w:r>
+              <w:rPr>
+                <w:rFonts w:ascii="Arial" w:eastAsia="Arial" w:hAnsi="Arial" w:cs="Arial"/>
+                <w:i w:val="0"/>
+                <w:iCs w:val="0"/>
+                <w:sz w:val="32"/>
+                <w:szCs w:val="32"/>
+              </w:rPr>
+              <w:t>:</w:t>
             </w:r>
           </w:p>
         </w:tc>
@@ -1061,17 +1565,18 @@
             <w:pPr>
               <w:pStyle w:val="Ttulo3"/>
               <w:jc w:val="left"/>
-              <w:rPr>
-                <w:rFonts w:ascii="Arial" w:eastAsia="Arial" w:hAnsi="Arial" w:cs="Arial"/>
-                <w:i w:val="0"/>
-                <w:iCs w:val="0"/>
-                <w:sz w:val="24"/>
-                <w:szCs w:val="24"/>
-                <w:lang w:val="en-US"/>
-              </w:rPr>
-            </w:pPr>
-            <w:bookmarkStart w:id="0" w:name="_heading=h.ynnkz868d3i3" w:colFirst="0" w:colLast="0"/>
-            <w:bookmarkEnd w:id="0"/>
+              <w:outlineLvl w:val="2"/>
+              <w:rPr>
+                <w:rFonts w:ascii="Arial" w:eastAsia="Arial" w:hAnsi="Arial" w:cs="Arial"/>
+                <w:i w:val="0"/>
+                <w:iCs w:val="0"/>
+                <w:sz w:val="24"/>
+                <w:szCs w:val="24"/>
+                <w:lang w:val="en-US"/>
+              </w:rPr>
+            </w:pPr>
+            <w:bookmarkStart w:id="1" w:name="_heading=h.ynnkz868d3i3" w:colFirst="0" w:colLast="0"/>
+            <w:bookmarkEnd w:id="1"/>
             <w:r>
               <w:rPr>
                 <w:rFonts w:ascii="Arial" w:eastAsia="Arial" w:hAnsi="Arial" w:cs="Arial"/>
@@ -1083,17 +1588,43 @@
               </w:rPr>
               <w:t xml:space="preserve">     </w:t>
             </w:r>
-            <w:r>
-              <w:rPr>
-                <w:rFonts w:ascii="Arial" w:eastAsia="Arial" w:hAnsi="Arial" w:cs="Arial"/>
-                <w:i w:val="0"/>
-                <w:iCs w:val="0"/>
-                <w:sz w:val="24"/>
-                <w:szCs w:val="24"/>
-                <w:lang w:val="en-US"/>
-              </w:rPr>
-              <w:t>Requerimientos funcionales</w:t>
-            </w:r>
+            <w:proofErr w:type="spellStart"/>
+            <w:r>
+              <w:rPr>
+                <w:rFonts w:ascii="Arial" w:eastAsia="Arial" w:hAnsi="Arial" w:cs="Arial"/>
+                <w:i w:val="0"/>
+                <w:iCs w:val="0"/>
+                <w:sz w:val="24"/>
+                <w:szCs w:val="24"/>
+                <w:lang w:val="en-US"/>
+              </w:rPr>
+              <w:t>Requerimientos</w:t>
+            </w:r>
+            <w:proofErr w:type="spellEnd"/>
+            <w:r>
+              <w:rPr>
+                <w:rFonts w:ascii="Arial" w:eastAsia="Arial" w:hAnsi="Arial" w:cs="Arial"/>
+                <w:i w:val="0"/>
+                <w:iCs w:val="0"/>
+                <w:sz w:val="24"/>
+                <w:szCs w:val="24"/>
+                <w:lang w:val="en-US"/>
+              </w:rPr>
+              <w:t xml:space="preserve"> </w:t>
+            </w:r>
+            <w:proofErr w:type="spellStart"/>
+            <w:r>
+              <w:rPr>
+                <w:rFonts w:ascii="Arial" w:eastAsia="Arial" w:hAnsi="Arial" w:cs="Arial"/>
+                <w:i w:val="0"/>
+                <w:iCs w:val="0"/>
+                <w:sz w:val="24"/>
+                <w:szCs w:val="24"/>
+                <w:lang w:val="en-US"/>
+              </w:rPr>
+              <w:t>funcionales</w:t>
+            </w:r>
+            <w:proofErr w:type="spellEnd"/>
           </w:p>
           <w:p>
             <w:pPr>
@@ -1103,6 +1634,7 @@
                 <w:numId w:val="15"/>
               </w:numPr>
               <w:jc w:val="left"/>
+              <w:outlineLvl w:val="2"/>
               <w:rPr>
                 <w:rFonts w:ascii="Arial" w:eastAsia="Arial" w:hAnsi="Arial" w:cs="Arial"/>
                 <w:b w:val="0"/>
@@ -1136,6 +1668,7 @@
                 <w:numId w:val="15"/>
               </w:numPr>
               <w:jc w:val="left"/>
+              <w:outlineLvl w:val="2"/>
               <w:rPr>
                 <w:rFonts w:ascii="Arial" w:eastAsia="Arial" w:hAnsi="Arial" w:cs="Arial"/>
                 <w:b w:val="0"/>
@@ -1169,6 +1702,7 @@
                 <w:numId w:val="15"/>
               </w:numPr>
               <w:jc w:val="left"/>
+              <w:outlineLvl w:val="2"/>
               <w:rPr>
                 <w:rFonts w:ascii="Arial" w:eastAsia="Arial" w:hAnsi="Arial" w:cs="Arial"/>
                 <w:b w:val="0"/>
@@ -1180,6 +1714,7 @@
                 <w:lang w:val="en-US"/>
               </w:rPr>
             </w:pPr>
+            <w:proofErr w:type="spellStart"/>
             <w:r>
               <w:rPr>
                 <w:rFonts w:ascii="Arial" w:eastAsia="Arial" w:hAnsi="Arial" w:cs="Arial"/>
@@ -1191,7 +1726,105 @@
                 <w:szCs w:val="24"/>
                 <w:lang w:val="en-US"/>
               </w:rPr>
-              <w:t xml:space="preserve">Generación automática de horarios académicos </w:t>
+              <w:t>Generación</w:t>
+            </w:r>
+            <w:proofErr w:type="spellEnd"/>
+            <w:r>
+              <w:rPr>
+                <w:rFonts w:ascii="Arial" w:eastAsia="Arial" w:hAnsi="Arial" w:cs="Arial"/>
+                <w:b w:val="0"/>
+                <w:bCs w:val="0"/>
+                <w:i w:val="0"/>
+                <w:iCs w:val="0"/>
+                <w:sz w:val="24"/>
+                <w:szCs w:val="24"/>
+                <w:lang w:val="en-US"/>
+              </w:rPr>
+              <w:t xml:space="preserve"> </w:t>
+            </w:r>
+            <w:proofErr w:type="spellStart"/>
+            <w:r>
+              <w:rPr>
+                <w:rFonts w:ascii="Arial" w:eastAsia="Arial" w:hAnsi="Arial" w:cs="Arial"/>
+                <w:b w:val="0"/>
+                <w:bCs w:val="0"/>
+                <w:i w:val="0"/>
+                <w:iCs w:val="0"/>
+                <w:sz w:val="24"/>
+                <w:szCs w:val="24"/>
+                <w:lang w:val="en-US"/>
+              </w:rPr>
+              <w:t>automática</w:t>
+            </w:r>
+            <w:proofErr w:type="spellEnd"/>
+            <w:r>
+              <w:rPr>
+                <w:rFonts w:ascii="Arial" w:eastAsia="Arial" w:hAnsi="Arial" w:cs="Arial"/>
+                <w:b w:val="0"/>
+                <w:bCs w:val="0"/>
+                <w:i w:val="0"/>
+                <w:iCs w:val="0"/>
+                <w:sz w:val="24"/>
+                <w:szCs w:val="24"/>
+                <w:lang w:val="en-US"/>
+              </w:rPr>
+              <w:t xml:space="preserve"> de </w:t>
+            </w:r>
+            <w:proofErr w:type="spellStart"/>
+            <w:r>
+              <w:rPr>
+                <w:rFonts w:ascii="Arial" w:eastAsia="Arial" w:hAnsi="Arial" w:cs="Arial"/>
+                <w:b w:val="0"/>
+                <w:bCs w:val="0"/>
+                <w:i w:val="0"/>
+                <w:iCs w:val="0"/>
+                <w:sz w:val="24"/>
+                <w:szCs w:val="24"/>
+                <w:lang w:val="en-US"/>
+              </w:rPr>
+              <w:t>horarios</w:t>
+            </w:r>
+            <w:proofErr w:type="spellEnd"/>
+            <w:r>
+              <w:rPr>
+                <w:rFonts w:ascii="Arial" w:eastAsia="Arial" w:hAnsi="Arial" w:cs="Arial"/>
+                <w:b w:val="0"/>
+                <w:bCs w:val="0"/>
+                <w:i w:val="0"/>
+                <w:iCs w:val="0"/>
+                <w:sz w:val="24"/>
+                <w:szCs w:val="24"/>
+                <w:lang w:val="en-US"/>
+              </w:rPr>
+              <w:t xml:space="preserve"> </w:t>
+            </w:r>
+            <w:proofErr w:type="spellStart"/>
+            <w:r>
+              <w:rPr>
+                <w:rFonts w:ascii="Arial" w:eastAsia="Arial" w:hAnsi="Arial" w:cs="Arial"/>
+                <w:b w:val="0"/>
+                <w:bCs w:val="0"/>
+                <w:i w:val="0"/>
+                <w:iCs w:val="0"/>
+                <w:sz w:val="24"/>
+                <w:szCs w:val="24"/>
+                <w:lang w:val="en-US"/>
+              </w:rPr>
+              <w:t>académicos</w:t>
+            </w:r>
+            <w:proofErr w:type="spellEnd"/>
+            <w:r>
+              <w:rPr>
+                <w:rFonts w:ascii="Arial" w:eastAsia="Arial" w:hAnsi="Arial" w:cs="Arial"/>
+                <w:b w:val="0"/>
+                <w:bCs w:val="0"/>
+                <w:i w:val="0"/>
+                <w:iCs w:val="0"/>
+                <w:sz w:val="24"/>
+                <w:szCs w:val="24"/>
+                <w:lang w:val="en-US"/>
+              </w:rPr>
+              <w:t xml:space="preserve"> </w:t>
             </w:r>
           </w:p>
           <w:p>
@@ -1202,6 +1835,7 @@
                 <w:numId w:val="15"/>
               </w:numPr>
               <w:jc w:val="left"/>
+              <w:outlineLvl w:val="2"/>
               <w:rPr>
                 <w:rFonts w:ascii="Arial" w:eastAsia="Arial" w:hAnsi="Arial" w:cs="Arial"/>
                 <w:b w:val="0"/>
@@ -1213,6 +1847,7 @@
                 <w:lang w:val="en-US"/>
               </w:rPr>
             </w:pPr>
+            <w:proofErr w:type="spellStart"/>
             <w:r>
               <w:rPr>
                 <w:rFonts w:ascii="Arial" w:eastAsia="Arial" w:hAnsi="Arial" w:cs="Arial"/>
@@ -1224,7 +1859,77 @@
                 <w:szCs w:val="24"/>
                 <w:lang w:val="en-US"/>
               </w:rPr>
-              <w:t xml:space="preserve">Visualización de horarios generados </w:t>
+              <w:t>Visualización</w:t>
+            </w:r>
+            <w:proofErr w:type="spellEnd"/>
+            <w:r>
+              <w:rPr>
+                <w:rFonts w:ascii="Arial" w:eastAsia="Arial" w:hAnsi="Arial" w:cs="Arial"/>
+                <w:b w:val="0"/>
+                <w:bCs w:val="0"/>
+                <w:i w:val="0"/>
+                <w:iCs w:val="0"/>
+                <w:sz w:val="24"/>
+                <w:szCs w:val="24"/>
+                <w:lang w:val="en-US"/>
+              </w:rPr>
+              <w:t xml:space="preserve"> de </w:t>
+            </w:r>
+            <w:proofErr w:type="spellStart"/>
+            <w:r>
+              <w:rPr>
+                <w:rFonts w:ascii="Arial" w:eastAsia="Arial" w:hAnsi="Arial" w:cs="Arial"/>
+                <w:b w:val="0"/>
+                <w:bCs w:val="0"/>
+                <w:i w:val="0"/>
+                <w:iCs w:val="0"/>
+                <w:sz w:val="24"/>
+                <w:szCs w:val="24"/>
+                <w:lang w:val="en-US"/>
+              </w:rPr>
+              <w:t>horarios</w:t>
+            </w:r>
+            <w:proofErr w:type="spellEnd"/>
+            <w:r>
+              <w:rPr>
+                <w:rFonts w:ascii="Arial" w:eastAsia="Arial" w:hAnsi="Arial" w:cs="Arial"/>
+                <w:b w:val="0"/>
+                <w:bCs w:val="0"/>
+                <w:i w:val="0"/>
+                <w:iCs w:val="0"/>
+                <w:sz w:val="24"/>
+                <w:szCs w:val="24"/>
+                <w:lang w:val="en-US"/>
+              </w:rPr>
+              <w:t xml:space="preserve"> </w:t>
+            </w:r>
+            <w:proofErr w:type="spellStart"/>
+            <w:r>
+              <w:rPr>
+                <w:rFonts w:ascii="Arial" w:eastAsia="Arial" w:hAnsi="Arial" w:cs="Arial"/>
+                <w:b w:val="0"/>
+                <w:bCs w:val="0"/>
+                <w:i w:val="0"/>
+                <w:iCs w:val="0"/>
+                <w:sz w:val="24"/>
+                <w:szCs w:val="24"/>
+                <w:lang w:val="en-US"/>
+              </w:rPr>
+              <w:t>generados</w:t>
+            </w:r>
+            <w:proofErr w:type="spellEnd"/>
+            <w:r>
+              <w:rPr>
+                <w:rFonts w:ascii="Arial" w:eastAsia="Arial" w:hAnsi="Arial" w:cs="Arial"/>
+                <w:b w:val="0"/>
+                <w:bCs w:val="0"/>
+                <w:i w:val="0"/>
+                <w:iCs w:val="0"/>
+                <w:sz w:val="24"/>
+                <w:szCs w:val="24"/>
+                <w:lang w:val="en-US"/>
+              </w:rPr>
+              <w:t xml:space="preserve"> </w:t>
             </w:r>
           </w:p>
           <w:p>
@@ -1235,6 +1940,7 @@
                 <w:numId w:val="15"/>
               </w:numPr>
               <w:jc w:val="left"/>
+              <w:outlineLvl w:val="2"/>
               <w:rPr>
                 <w:rFonts w:ascii="Arial" w:eastAsia="Arial" w:hAnsi="Arial" w:cs="Arial"/>
                 <w:b w:val="0"/>
@@ -1265,6 +1971,7 @@
               <w:pStyle w:val="Ttulo3"/>
               <w:ind w:left="360"/>
               <w:jc w:val="left"/>
+              <w:outlineLvl w:val="2"/>
               <w:rPr>
                 <w:rFonts w:ascii="Arial" w:eastAsia="Arial" w:hAnsi="Arial" w:cs="Arial"/>
                 <w:i w:val="0"/>
@@ -1294,6 +2001,7 @@
                 <w:numId w:val="14"/>
               </w:numPr>
               <w:jc w:val="left"/>
+              <w:outlineLvl w:val="2"/>
               <w:rPr>
                 <w:rFonts w:ascii="Arial" w:eastAsia="Arial" w:hAnsi="Arial" w:cs="Arial"/>
                 <w:b w:val="0"/>
@@ -1327,6 +2035,7 @@
                 <w:numId w:val="14"/>
               </w:numPr>
               <w:jc w:val="left"/>
+              <w:outlineLvl w:val="2"/>
               <w:rPr>
                 <w:rFonts w:ascii="Arial" w:eastAsia="Arial" w:hAnsi="Arial" w:cs="Arial"/>
                 <w:b w:val="0"/>
@@ -1338,6 +2047,7 @@
                 <w:lang w:val="en-US"/>
               </w:rPr>
             </w:pPr>
+            <w:proofErr w:type="spellStart"/>
             <w:r>
               <w:rPr>
                 <w:rFonts w:ascii="Arial" w:eastAsia="Arial" w:hAnsi="Arial" w:cs="Arial"/>
@@ -1349,7 +2059,49 @@
                 <w:szCs w:val="24"/>
                 <w:lang w:val="en-US"/>
               </w:rPr>
-              <w:t xml:space="preserve">Escalabilidad del sistema </w:t>
+              <w:t>Escalabilidad</w:t>
+            </w:r>
+            <w:proofErr w:type="spellEnd"/>
+            <w:r>
+              <w:rPr>
+                <w:rFonts w:ascii="Arial" w:eastAsia="Arial" w:hAnsi="Arial" w:cs="Arial"/>
+                <w:b w:val="0"/>
+                <w:bCs w:val="0"/>
+                <w:i w:val="0"/>
+                <w:iCs w:val="0"/>
+                <w:sz w:val="24"/>
+                <w:szCs w:val="24"/>
+                <w:lang w:val="en-US"/>
+              </w:rPr>
+              <w:t xml:space="preserve"> del </w:t>
+            </w:r>
+            <w:proofErr w:type="spellStart"/>
+            <w:r>
+              <w:rPr>
+                <w:rFonts w:ascii="Arial" w:eastAsia="Arial" w:hAnsi="Arial" w:cs="Arial"/>
+                <w:b w:val="0"/>
+                <w:bCs w:val="0"/>
+                <w:i w:val="0"/>
+                <w:iCs w:val="0"/>
+                <w:sz w:val="24"/>
+                <w:szCs w:val="24"/>
+                <w:lang w:val="en-US"/>
+              </w:rPr>
+              <w:t>sistema</w:t>
+            </w:r>
+            <w:proofErr w:type="spellEnd"/>
+            <w:r>
+              <w:rPr>
+                <w:rFonts w:ascii="Arial" w:eastAsia="Arial" w:hAnsi="Arial" w:cs="Arial"/>
+                <w:b w:val="0"/>
+                <w:bCs w:val="0"/>
+                <w:i w:val="0"/>
+                <w:iCs w:val="0"/>
+                <w:sz w:val="24"/>
+                <w:szCs w:val="24"/>
+                <w:lang w:val="en-US"/>
+              </w:rPr>
+              <w:t xml:space="preserve"> </w:t>
             </w:r>
           </w:p>
           <w:p>
@@ -1360,6 +2112,7 @@
                 <w:numId w:val="14"/>
               </w:numPr>
               <w:jc w:val="left"/>
+              <w:outlineLvl w:val="2"/>
               <w:rPr>
                 <w:rFonts w:ascii="Arial" w:eastAsia="Arial" w:hAnsi="Arial" w:cs="Arial"/>
                 <w:b w:val="0"/>
@@ -1371,6 +2124,7 @@
                 <w:lang w:val="en-US"/>
               </w:rPr>
             </w:pPr>
+            <w:proofErr w:type="spellStart"/>
             <w:r>
               <w:rPr>
                 <w:rFonts w:ascii="Arial" w:eastAsia="Arial" w:hAnsi="Arial" w:cs="Arial"/>
@@ -1382,7 +2136,77 @@
                 <w:szCs w:val="24"/>
                 <w:lang w:val="en-US"/>
               </w:rPr>
-              <w:t xml:space="preserve">Usabilidad (interfaz intuitiva) </w:t>
+              <w:t>Usabilidad</w:t>
+            </w:r>
+            <w:proofErr w:type="spellEnd"/>
+            <w:r>
+              <w:rPr>
+                <w:rFonts w:ascii="Arial" w:eastAsia="Arial" w:hAnsi="Arial" w:cs="Arial"/>
+                <w:b w:val="0"/>
+                <w:bCs w:val="0"/>
+                <w:i w:val="0"/>
+                <w:iCs w:val="0"/>
+                <w:sz w:val="24"/>
+                <w:szCs w:val="24"/>
+                <w:lang w:val="en-US"/>
+              </w:rPr>
+              <w:t xml:space="preserve"> (</w:t>
+            </w:r>
+            <w:proofErr w:type="spellStart"/>
+            <w:r>
+              <w:rPr>
+                <w:rFonts w:ascii="Arial" w:eastAsia="Arial" w:hAnsi="Arial" w:cs="Arial"/>
+                <w:b w:val="0"/>
+                <w:bCs w:val="0"/>
+                <w:i w:val="0"/>
+                <w:iCs w:val="0"/>
+                <w:sz w:val="24"/>
+                <w:szCs w:val="24"/>
+                <w:lang w:val="en-US"/>
+              </w:rPr>
+              <w:t>interfaz</w:t>
+            </w:r>
+            <w:proofErr w:type="spellEnd"/>
+            <w:r>
+              <w:rPr>
+                <w:rFonts w:ascii="Arial" w:eastAsia="Arial" w:hAnsi="Arial" w:cs="Arial"/>
+                <w:b w:val="0"/>
+                <w:bCs w:val="0"/>
+                <w:i w:val="0"/>
+                <w:iCs w:val="0"/>
+                <w:sz w:val="24"/>
+                <w:szCs w:val="24"/>
+                <w:lang w:val="en-US"/>
+              </w:rPr>
+              <w:t xml:space="preserve"> </w:t>
+            </w:r>
+            <w:proofErr w:type="spellStart"/>
+            <w:r>
+              <w:rPr>
+                <w:rFonts w:ascii="Arial" w:eastAsia="Arial" w:hAnsi="Arial" w:cs="Arial"/>
+                <w:b w:val="0"/>
+                <w:bCs w:val="0"/>
+                <w:i w:val="0"/>
+                <w:iCs w:val="0"/>
+                <w:sz w:val="24"/>
+                <w:szCs w:val="24"/>
+                <w:lang w:val="en-US"/>
+              </w:rPr>
+              <w:t>intuitiva</w:t>
+            </w:r>
+            <w:proofErr w:type="spellEnd"/>
+            <w:r>
+              <w:rPr>
+                <w:rFonts w:ascii="Arial" w:eastAsia="Arial" w:hAnsi="Arial" w:cs="Arial"/>
+                <w:b w:val="0"/>
+                <w:bCs w:val="0"/>
+                <w:i w:val="0"/>
+                <w:iCs w:val="0"/>
+                <w:sz w:val="24"/>
+                <w:szCs w:val="24"/>
+                <w:lang w:val="en-US"/>
+              </w:rPr>
+              <w:t xml:space="preserve">) </w:t>
             </w:r>
           </w:p>
           <w:p>
@@ -1393,6 +2217,7 @@
                 <w:numId w:val="14"/>
               </w:numPr>
               <w:jc w:val="left"/>
+              <w:outlineLvl w:val="2"/>
               <w:rPr>
                 <w:rFonts w:ascii="Arial" w:eastAsia="Arial" w:hAnsi="Arial" w:cs="Arial"/>
                 <w:b w:val="0"/>
@@ -1404,6 +2229,7 @@
                 <w:lang w:val="en-US"/>
               </w:rPr>
             </w:pPr>
+            <w:proofErr w:type="spellStart"/>
             <w:r>
               <w:rPr>
                 <w:rFonts w:ascii="Arial" w:eastAsia="Arial" w:hAnsi="Arial" w:cs="Arial"/>
@@ -1415,7 +2241,49 @@
                 <w:szCs w:val="24"/>
                 <w:lang w:val="en-US"/>
               </w:rPr>
-              <w:t xml:space="preserve">Seguridad de la información </w:t>
+              <w:t>Seguridad</w:t>
+            </w:r>
+            <w:proofErr w:type="spellEnd"/>
+            <w:r>
+              <w:rPr>
+                <w:rFonts w:ascii="Arial" w:eastAsia="Arial" w:hAnsi="Arial" w:cs="Arial"/>
+                <w:b w:val="0"/>
+                <w:bCs w:val="0"/>
+                <w:i w:val="0"/>
+                <w:iCs w:val="0"/>
+                <w:sz w:val="24"/>
+                <w:szCs w:val="24"/>
+                <w:lang w:val="en-US"/>
+              </w:rPr>
+              <w:t xml:space="preserve"> de la </w:t>
+            </w:r>
+            <w:proofErr w:type="spellStart"/>
+            <w:r>
+              <w:rPr>
+                <w:rFonts w:ascii="Arial" w:eastAsia="Arial" w:hAnsi="Arial" w:cs="Arial"/>
+                <w:b w:val="0"/>
+                <w:bCs w:val="0"/>
+                <w:i w:val="0"/>
+                <w:iCs w:val="0"/>
+                <w:sz w:val="24"/>
+                <w:szCs w:val="24"/>
+                <w:lang w:val="en-US"/>
+              </w:rPr>
+              <w:t>información</w:t>
+            </w:r>
+            <w:proofErr w:type="spellEnd"/>
+            <w:r>
+              <w:rPr>
+                <w:rFonts w:ascii="Arial" w:eastAsia="Arial" w:hAnsi="Arial" w:cs="Arial"/>
+                <w:b w:val="0"/>
+                <w:bCs w:val="0"/>
+                <w:i w:val="0"/>
+                <w:iCs w:val="0"/>
+                <w:sz w:val="24"/>
+                <w:szCs w:val="24"/>
+                <w:lang w:val="en-US"/>
+              </w:rPr>
+              <w:t xml:space="preserve"> </w:t>
             </w:r>
           </w:p>
           <w:p>
@@ -1426,6 +2294,7 @@
                 <w:numId w:val="14"/>
               </w:numPr>
               <w:jc w:val="left"/>
+              <w:outlineLvl w:val="2"/>
               <w:rPr>
                 <w:rFonts w:ascii="Arial" w:eastAsia="Arial" w:hAnsi="Arial" w:cs="Arial"/>
                 <w:b w:val="0"/>
@@ -1437,6 +2306,7 @@
                 <w:lang w:val="en-US"/>
               </w:rPr>
             </w:pPr>
+            <w:proofErr w:type="spellStart"/>
             <w:r>
               <w:rPr>
                 <w:rFonts w:ascii="Arial" w:eastAsia="Arial" w:hAnsi="Arial" w:cs="Arial"/>
@@ -1448,8 +2318,37 @@
                 <w:szCs w:val="24"/>
                 <w:lang w:val="en-US"/>
               </w:rPr>
-              <w:t>Mantenibilidad del código</w:t>
-            </w:r>
+              <w:t>Mantenibilidad</w:t>
+            </w:r>
+            <w:proofErr w:type="spellEnd"/>
+            <w:r>
+              <w:rPr>
+                <w:rFonts w:ascii="Arial" w:eastAsia="Arial" w:hAnsi="Arial" w:cs="Arial"/>
+                <w:b w:val="0"/>
+                <w:bCs w:val="0"/>
+                <w:i w:val="0"/>
+                <w:iCs w:val="0"/>
+                <w:sz w:val="24"/>
+                <w:szCs w:val="24"/>
+                <w:lang w:val="en-US"/>
+              </w:rPr>
+              <w:t xml:space="preserve"> del </w:t>
+            </w:r>
+            <w:proofErr w:type="spellStart"/>
+            <w:r>
+              <w:rPr>
+                <w:rFonts w:ascii="Arial" w:eastAsia="Arial" w:hAnsi="Arial" w:cs="Arial"/>
+                <w:b w:val="0"/>
+                <w:bCs w:val="0"/>
+                <w:i w:val="0"/>
+                <w:iCs w:val="0"/>
+                <w:sz w:val="24"/>
+                <w:szCs w:val="24"/>
+                <w:lang w:val="en-US"/>
+              </w:rPr>
+              <w:t>código</w:t>
+            </w:r>
+            <w:proofErr w:type="spellEnd"/>
           </w:p>
           <w:p>
             <w:pPr>
@@ -1503,6 +2402,7 @@
                 <w:szCs w:val="32"/>
               </w:rPr>
             </w:pPr>
+            <w:proofErr w:type="spellStart"/>
             <w:r>
               <w:rPr>
                 <w:rFonts w:ascii="Arial" w:eastAsia="Arial" w:hAnsi="Arial" w:cs="Arial"/>
@@ -1511,7 +2411,62 @@
                 <w:sz w:val="32"/>
                 <w:szCs w:val="32"/>
               </w:rPr>
-              <w:t>Descripción del producto /Entregables:</w:t>
+              <w:t>Descripción</w:t>
+            </w:r>
+            <w:proofErr w:type="spellEnd"/>
+            <w:r>
+              <w:rPr>
+                <w:rFonts w:ascii="Arial" w:eastAsia="Arial" w:hAnsi="Arial" w:cs="Arial"/>
+                <w:i w:val="0"/>
+                <w:iCs w:val="0"/>
+                <w:sz w:val="32"/>
+                <w:szCs w:val="32"/>
+              </w:rPr>
+              <w:t xml:space="preserve"> del </w:t>
+            </w:r>
+            <w:proofErr w:type="spellStart"/>
+            <w:r>
+              <w:rPr>
+                <w:rFonts w:ascii="Arial" w:eastAsia="Arial" w:hAnsi="Arial" w:cs="Arial"/>
+                <w:i w:val="0"/>
+                <w:iCs w:val="0"/>
+                <w:sz w:val="32"/>
+                <w:szCs w:val="32"/>
+              </w:rPr>
+              <w:t>producto</w:t>
+            </w:r>
+            <w:proofErr w:type="spellEnd"/>
+            <w:r>
+              <w:rPr>
+                <w:rFonts w:ascii="Arial" w:eastAsia="Arial" w:hAnsi="Arial" w:cs="Arial"/>
+                <w:i w:val="0"/>
+                <w:iCs w:val="0"/>
+                <w:sz w:val="32"/>
+                <w:szCs w:val="32"/>
+              </w:rPr>
+              <w:t xml:space="preserve"> /</w:t>
+            </w:r>
+            <w:proofErr w:type="spellStart"/>
+            <w:r>
+              <w:rPr>
+                <w:rFonts w:ascii="Arial" w:eastAsia="Arial" w:hAnsi="Arial" w:cs="Arial"/>
+                <w:i w:val="0"/>
+                <w:iCs w:val="0"/>
+                <w:sz w:val="32"/>
+                <w:szCs w:val="32"/>
+              </w:rPr>
+              <w:t>Entregables</w:t>
+            </w:r>
+            <w:proofErr w:type="spellEnd"/>
+            <w:r>
+              <w:rPr>
+                <w:rFonts w:ascii="Arial" w:eastAsia="Arial" w:hAnsi="Arial" w:cs="Arial"/>
+                <w:i w:val="0"/>
+                <w:iCs w:val="0"/>
+                <w:sz w:val="32"/>
+                <w:szCs w:val="32"/>
+              </w:rPr>
+              <w:t>:</w:t>
             </w:r>
           </w:p>
         </w:tc>
@@ -1535,17 +2490,19 @@
             <w:pPr>
               <w:pStyle w:val="Ttulo3"/>
               <w:jc w:val="left"/>
-              <w:rPr>
-                <w:rFonts w:ascii="Arial" w:eastAsia="Arial" w:hAnsi="Arial" w:cs="Arial"/>
-                <w:i w:val="0"/>
-                <w:iCs w:val="0"/>
-                <w:sz w:val="24"/>
-                <w:szCs w:val="24"/>
-                <w:lang w:val="en-US"/>
-              </w:rPr>
-            </w:pPr>
-            <w:bookmarkStart w:id="1" w:name="_heading=h.bgb1wgsa5ri8" w:colFirst="0" w:colLast="0"/>
-            <w:bookmarkEnd w:id="1"/>
+              <w:outlineLvl w:val="2"/>
+              <w:rPr>
+                <w:rFonts w:ascii="Arial" w:eastAsia="Arial" w:hAnsi="Arial" w:cs="Arial"/>
+                <w:i w:val="0"/>
+                <w:iCs w:val="0"/>
+                <w:sz w:val="24"/>
+                <w:szCs w:val="24"/>
+                <w:lang w:val="en-US"/>
+              </w:rPr>
+            </w:pPr>
+            <w:bookmarkStart w:id="2" w:name="_heading=h.bgb1wgsa5ri8" w:colFirst="0" w:colLast="0"/>
+            <w:bookmarkEnd w:id="2"/>
+            <w:proofErr w:type="spellStart"/>
             <w:r>
               <w:rPr>
                 <w:rFonts w:ascii="Arial" w:eastAsia="Arial" w:hAnsi="Arial" w:cs="Arial"/>
@@ -1556,13 +2513,39 @@
                 <w:lang w:val="en-US"/>
               </w:rPr>
               <w:lastRenderedPageBreak/>
-              <w:t>Descripción del producto</w:t>
-            </w:r>
+              <w:t>Descripción</w:t>
+            </w:r>
+            <w:proofErr w:type="spellEnd"/>
+            <w:r>
+              <w:rPr>
+                <w:rFonts w:ascii="Arial" w:eastAsia="Arial" w:hAnsi="Arial" w:cs="Arial"/>
+                <w:i w:val="0"/>
+                <w:iCs w:val="0"/>
+                <w:sz w:val="24"/>
+                <w:szCs w:val="24"/>
+                <w:lang w:val="en-US"/>
+              </w:rPr>
+              <w:t xml:space="preserve"> del </w:t>
+            </w:r>
+            <w:proofErr w:type="spellStart"/>
+            <w:r>
+              <w:rPr>
+                <w:rFonts w:ascii="Arial" w:eastAsia="Arial" w:hAnsi="Arial" w:cs="Arial"/>
+                <w:i w:val="0"/>
+                <w:iCs w:val="0"/>
+                <w:sz w:val="24"/>
+                <w:szCs w:val="24"/>
+                <w:lang w:val="en-US"/>
+              </w:rPr>
+              <w:t>producto</w:t>
+            </w:r>
+            <w:proofErr w:type="spellEnd"/>
           </w:p>
           <w:p>
             <w:pPr>
               <w:pStyle w:val="Ttulo3"/>
               <w:jc w:val="left"/>
+              <w:outlineLvl w:val="2"/>
               <w:rPr>
                 <w:rFonts w:ascii="Arial" w:eastAsia="Arial" w:hAnsi="Arial" w:cs="Arial"/>
                 <w:b w:val="0"/>
@@ -1596,6 +2579,7 @@
                 <w:numId w:val="16"/>
               </w:numPr>
               <w:jc w:val="left"/>
+              <w:outlineLvl w:val="2"/>
               <w:rPr>
                 <w:rFonts w:ascii="Arial" w:eastAsia="Arial" w:hAnsi="Arial" w:cs="Arial"/>
                 <w:b w:val="0"/>
@@ -1607,6 +2591,7 @@
                 <w:lang w:val="en-US"/>
               </w:rPr>
             </w:pPr>
+            <w:proofErr w:type="spellStart"/>
             <w:r>
               <w:rPr>
                 <w:rFonts w:ascii="Arial" w:eastAsia="Arial" w:hAnsi="Arial" w:cs="Arial"/>
@@ -1618,7 +2603,105 @@
                 <w:szCs w:val="24"/>
                 <w:lang w:val="en-US"/>
               </w:rPr>
-              <w:t xml:space="preserve">Generar horarios académicos automáticamente </w:t>
+              <w:t>Generar</w:t>
+            </w:r>
+            <w:proofErr w:type="spellEnd"/>
+            <w:r>
+              <w:rPr>
+                <w:rFonts w:ascii="Arial" w:eastAsia="Arial" w:hAnsi="Arial" w:cs="Arial"/>
+                <w:b w:val="0"/>
+                <w:bCs w:val="0"/>
+                <w:i w:val="0"/>
+                <w:iCs w:val="0"/>
+                <w:sz w:val="24"/>
+                <w:szCs w:val="24"/>
+                <w:lang w:val="en-US"/>
+              </w:rPr>
+              <w:t xml:space="preserve"> </w:t>
+            </w:r>
+            <w:proofErr w:type="spellStart"/>
+            <w:r>
+              <w:rPr>
+                <w:rFonts w:ascii="Arial" w:eastAsia="Arial" w:hAnsi="Arial" w:cs="Arial"/>
+                <w:b w:val="0"/>
+                <w:bCs w:val="0"/>
+                <w:i w:val="0"/>
+                <w:iCs w:val="0"/>
+                <w:sz w:val="24"/>
+                <w:szCs w:val="24"/>
+                <w:lang w:val="en-US"/>
+              </w:rPr>
+              <w:t>horarios</w:t>
+            </w:r>
+            <w:proofErr w:type="spellEnd"/>
+            <w:r>
+              <w:rPr>
+                <w:rFonts w:ascii="Arial" w:eastAsia="Arial" w:hAnsi="Arial" w:cs="Arial"/>
+                <w:b w:val="0"/>
+                <w:bCs w:val="0"/>
+                <w:i w:val="0"/>
+                <w:iCs w:val="0"/>
+                <w:sz w:val="24"/>
+                <w:szCs w:val="24"/>
+                <w:lang w:val="en-US"/>
+              </w:rPr>
+              <w:t xml:space="preserve"> </w:t>
+            </w:r>
+            <w:proofErr w:type="spellStart"/>
+            <w:r>
+              <w:rPr>
+                <w:rFonts w:ascii="Arial" w:eastAsia="Arial" w:hAnsi="Arial" w:cs="Arial"/>
+                <w:b w:val="0"/>
+                <w:bCs w:val="0"/>
+                <w:i w:val="0"/>
+                <w:iCs w:val="0"/>
+                <w:sz w:val="24"/>
+                <w:szCs w:val="24"/>
+                <w:lang w:val="en-US"/>
+              </w:rPr>
+              <w:t>académicos</w:t>
+            </w:r>
+            <w:proofErr w:type="spellEnd"/>
+            <w:r>
+              <w:rPr>
+                <w:rFonts w:ascii="Arial" w:eastAsia="Arial" w:hAnsi="Arial" w:cs="Arial"/>
+                <w:b w:val="0"/>
+                <w:bCs w:val="0"/>
+                <w:i w:val="0"/>
+                <w:iCs w:val="0"/>
+                <w:sz w:val="24"/>
+                <w:szCs w:val="24"/>
+                <w:lang w:val="en-US"/>
+              </w:rPr>
+              <w:t xml:space="preserve"> </w:t>
+            </w:r>
+            <w:proofErr w:type="spellStart"/>
+            <w:r>
+              <w:rPr>
+                <w:rFonts w:ascii="Arial" w:eastAsia="Arial" w:hAnsi="Arial" w:cs="Arial"/>
+                <w:b w:val="0"/>
+                <w:bCs w:val="0"/>
+                <w:i w:val="0"/>
+                <w:iCs w:val="0"/>
+                <w:sz w:val="24"/>
+                <w:szCs w:val="24"/>
+                <w:lang w:val="en-US"/>
+              </w:rPr>
+              <w:t>automáticamente</w:t>
+            </w:r>
+            <w:proofErr w:type="spellEnd"/>
+            <w:r>
+              <w:rPr>
+                <w:rFonts w:ascii="Arial" w:eastAsia="Arial" w:hAnsi="Arial" w:cs="Arial"/>
+                <w:b w:val="0"/>
+                <w:bCs w:val="0"/>
+                <w:i w:val="0"/>
+                <w:iCs w:val="0"/>
+                <w:sz w:val="24"/>
+                <w:szCs w:val="24"/>
+                <w:lang w:val="en-US"/>
+              </w:rPr>
+              <w:t xml:space="preserve"> </w:t>
             </w:r>
           </w:p>
           <w:p>
@@ -1629,6 +2712,7 @@
                 <w:numId w:val="16"/>
               </w:numPr>
               <w:jc w:val="left"/>
+              <w:outlineLvl w:val="2"/>
               <w:rPr>
                 <w:rFonts w:ascii="Arial" w:eastAsia="Arial" w:hAnsi="Arial" w:cs="Arial"/>
                 <w:b w:val="0"/>
@@ -1640,6 +2724,7 @@
                 <w:lang w:val="en-US"/>
               </w:rPr>
             </w:pPr>
+            <w:proofErr w:type="spellStart"/>
             <w:r>
               <w:rPr>
                 <w:rFonts w:ascii="Arial" w:eastAsia="Arial" w:hAnsi="Arial" w:cs="Arial"/>
@@ -1651,7 +2736,77 @@
                 <w:szCs w:val="24"/>
                 <w:lang w:val="en-US"/>
               </w:rPr>
-              <w:t xml:space="preserve">Evitar conflictos de solapamiento </w:t>
+              <w:t>Evitar</w:t>
+            </w:r>
+            <w:proofErr w:type="spellEnd"/>
+            <w:r>
+              <w:rPr>
+                <w:rFonts w:ascii="Arial" w:eastAsia="Arial" w:hAnsi="Arial" w:cs="Arial"/>
+                <w:b w:val="0"/>
+                <w:bCs w:val="0"/>
+                <w:i w:val="0"/>
+                <w:iCs w:val="0"/>
+                <w:sz w:val="24"/>
+                <w:szCs w:val="24"/>
+                <w:lang w:val="en-US"/>
+              </w:rPr>
+              <w:t xml:space="preserve"> </w:t>
+            </w:r>
+            <w:proofErr w:type="spellStart"/>
+            <w:r>
+              <w:rPr>
+                <w:rFonts w:ascii="Arial" w:eastAsia="Arial" w:hAnsi="Arial" w:cs="Arial"/>
+                <w:b w:val="0"/>
+                <w:bCs w:val="0"/>
+                <w:i w:val="0"/>
+                <w:iCs w:val="0"/>
+                <w:sz w:val="24"/>
+                <w:szCs w:val="24"/>
+                <w:lang w:val="en-US"/>
+              </w:rPr>
+              <w:t>conflictos</w:t>
+            </w:r>
+            <w:proofErr w:type="spellEnd"/>
+            <w:r>
+              <w:rPr>
+                <w:rFonts w:ascii="Arial" w:eastAsia="Arial" w:hAnsi="Arial" w:cs="Arial"/>
+                <w:b w:val="0"/>
+                <w:bCs w:val="0"/>
+                <w:i w:val="0"/>
+                <w:iCs w:val="0"/>
+                <w:sz w:val="24"/>
+                <w:szCs w:val="24"/>
+                <w:lang w:val="en-US"/>
+              </w:rPr>
+              <w:t xml:space="preserve"> de </w:t>
+            </w:r>
+            <w:proofErr w:type="spellStart"/>
+            <w:r>
+              <w:rPr>
+                <w:rFonts w:ascii="Arial" w:eastAsia="Arial" w:hAnsi="Arial" w:cs="Arial"/>
+                <w:b w:val="0"/>
+                <w:bCs w:val="0"/>
+                <w:i w:val="0"/>
+                <w:iCs w:val="0"/>
+                <w:sz w:val="24"/>
+                <w:szCs w:val="24"/>
+                <w:lang w:val="en-US"/>
+              </w:rPr>
+              <w:t>solapamiento</w:t>
+            </w:r>
+            <w:proofErr w:type="spellEnd"/>
+            <w:r>
+              <w:rPr>
+                <w:rFonts w:ascii="Arial" w:eastAsia="Arial" w:hAnsi="Arial" w:cs="Arial"/>
+                <w:b w:val="0"/>
+                <w:bCs w:val="0"/>
+                <w:i w:val="0"/>
+                <w:iCs w:val="0"/>
+                <w:sz w:val="24"/>
+                <w:szCs w:val="24"/>
+                <w:lang w:val="en-US"/>
+              </w:rPr>
+              <w:t xml:space="preserve"> </w:t>
             </w:r>
           </w:p>
           <w:p>
@@ -1662,6 +2817,7 @@
                 <w:numId w:val="16"/>
               </w:numPr>
               <w:jc w:val="left"/>
+              <w:outlineLvl w:val="2"/>
               <w:rPr>
                 <w:rFonts w:ascii="Arial" w:eastAsia="Arial" w:hAnsi="Arial" w:cs="Arial"/>
                 <w:b w:val="0"/>
@@ -1695,6 +2851,7 @@
                 <w:numId w:val="16"/>
               </w:numPr>
               <w:jc w:val="left"/>
+              <w:outlineLvl w:val="2"/>
               <w:rPr>
                 <w:rFonts w:ascii="Arial" w:eastAsia="Arial" w:hAnsi="Arial" w:cs="Arial"/>
                 <w:b w:val="0"/>
@@ -1706,6 +2863,7 @@
                 <w:lang w:val="en-US"/>
               </w:rPr>
             </w:pPr>
+            <w:proofErr w:type="spellStart"/>
             <w:r>
               <w:rPr>
                 <w:rFonts w:ascii="Arial" w:eastAsia="Arial" w:hAnsi="Arial" w:cs="Arial"/>
@@ -1717,7 +2875,77 @@
                 <w:szCs w:val="24"/>
                 <w:lang w:val="en-US"/>
               </w:rPr>
-              <w:t xml:space="preserve">Optimizar la asignación de recursos </w:t>
+              <w:t>Optimizar</w:t>
+            </w:r>
+            <w:proofErr w:type="spellEnd"/>
+            <w:r>
+              <w:rPr>
+                <w:rFonts w:ascii="Arial" w:eastAsia="Arial" w:hAnsi="Arial" w:cs="Arial"/>
+                <w:b w:val="0"/>
+                <w:bCs w:val="0"/>
+                <w:i w:val="0"/>
+                <w:iCs w:val="0"/>
+                <w:sz w:val="24"/>
+                <w:szCs w:val="24"/>
+                <w:lang w:val="en-US"/>
+              </w:rPr>
+              <w:t xml:space="preserve"> la </w:t>
+            </w:r>
+            <w:proofErr w:type="spellStart"/>
+            <w:r>
+              <w:rPr>
+                <w:rFonts w:ascii="Arial" w:eastAsia="Arial" w:hAnsi="Arial" w:cs="Arial"/>
+                <w:b w:val="0"/>
+                <w:bCs w:val="0"/>
+                <w:i w:val="0"/>
+                <w:iCs w:val="0"/>
+                <w:sz w:val="24"/>
+                <w:szCs w:val="24"/>
+                <w:lang w:val="en-US"/>
+              </w:rPr>
+              <w:t>asignación</w:t>
+            </w:r>
+            <w:proofErr w:type="spellEnd"/>
+            <w:r>
+              <w:rPr>
+                <w:rFonts w:ascii="Arial" w:eastAsia="Arial" w:hAnsi="Arial" w:cs="Arial"/>
+                <w:b w:val="0"/>
+                <w:bCs w:val="0"/>
+                <w:i w:val="0"/>
+                <w:iCs w:val="0"/>
+                <w:sz w:val="24"/>
+                <w:szCs w:val="24"/>
+                <w:lang w:val="en-US"/>
+              </w:rPr>
+              <w:t xml:space="preserve"> de </w:t>
+            </w:r>
+            <w:proofErr w:type="spellStart"/>
+            <w:r>
+              <w:rPr>
+                <w:rFonts w:ascii="Arial" w:eastAsia="Arial" w:hAnsi="Arial" w:cs="Arial"/>
+                <w:b w:val="0"/>
+                <w:bCs w:val="0"/>
+                <w:i w:val="0"/>
+                <w:iCs w:val="0"/>
+                <w:sz w:val="24"/>
+                <w:szCs w:val="24"/>
+                <w:lang w:val="en-US"/>
+              </w:rPr>
+              <w:t>recursos</w:t>
+            </w:r>
+            <w:proofErr w:type="spellEnd"/>
+            <w:r>
+              <w:rPr>
+                <w:rFonts w:ascii="Arial" w:eastAsia="Arial" w:hAnsi="Arial" w:cs="Arial"/>
+                <w:b w:val="0"/>
+                <w:bCs w:val="0"/>
+                <w:i w:val="0"/>
+                <w:iCs w:val="0"/>
+                <w:sz w:val="24"/>
+                <w:szCs w:val="24"/>
+                <w:lang w:val="en-US"/>
+              </w:rPr>
+              <w:t xml:space="preserve"> </w:t>
             </w:r>
           </w:p>
           <w:p>
@@ -1728,6 +2956,7 @@
                 <w:numId w:val="16"/>
               </w:numPr>
               <w:jc w:val="left"/>
+              <w:outlineLvl w:val="2"/>
               <w:rPr>
                 <w:rFonts w:ascii="Arial" w:eastAsia="Arial" w:hAnsi="Arial" w:cs="Arial"/>
                 <w:b w:val="0"/>
@@ -1757,15 +2986,17 @@
             <w:pPr>
               <w:pStyle w:val="Ttulo3"/>
               <w:jc w:val="left"/>
-              <w:rPr>
-                <w:rFonts w:ascii="Arial" w:eastAsia="Arial" w:hAnsi="Arial" w:cs="Arial"/>
-                <w:i w:val="0"/>
-                <w:iCs w:val="0"/>
-                <w:sz w:val="24"/>
-                <w:szCs w:val="24"/>
-                <w:lang w:val="en-US"/>
-              </w:rPr>
-            </w:pPr>
+              <w:outlineLvl w:val="2"/>
+              <w:rPr>
+                <w:rFonts w:ascii="Arial" w:eastAsia="Arial" w:hAnsi="Arial" w:cs="Arial"/>
+                <w:i w:val="0"/>
+                <w:iCs w:val="0"/>
+                <w:sz w:val="24"/>
+                <w:szCs w:val="24"/>
+                <w:lang w:val="en-US"/>
+              </w:rPr>
+            </w:pPr>
+            <w:proofErr w:type="spellStart"/>
             <w:r>
               <w:rPr>
                 <w:rFonts w:ascii="Arial" w:eastAsia="Arial" w:hAnsi="Arial" w:cs="Arial"/>
@@ -1777,6 +3008,7 @@
               </w:rPr>
               <w:t>Entregables</w:t>
             </w:r>
+            <w:proofErr w:type="spellEnd"/>
           </w:p>
           <w:p>
             <w:pPr>
@@ -1786,6 +3018,7 @@
                 <w:numId w:val="17"/>
               </w:numPr>
               <w:jc w:val="left"/>
+              <w:outlineLvl w:val="2"/>
               <w:rPr>
                 <w:rFonts w:ascii="Arial" w:eastAsia="Arial" w:hAnsi="Arial" w:cs="Arial"/>
                 <w:b w:val="0"/>
@@ -1797,6 +3030,7 @@
                 <w:lang w:val="en-US"/>
               </w:rPr>
             </w:pPr>
+            <w:proofErr w:type="spellStart"/>
             <w:r>
               <w:rPr>
                 <w:rFonts w:ascii="Arial" w:eastAsia="Arial" w:hAnsi="Arial" w:cs="Arial"/>
@@ -1808,7 +3042,77 @@
                 <w:szCs w:val="24"/>
                 <w:lang w:val="en-US"/>
               </w:rPr>
-              <w:t xml:space="preserve">Documento de análisis del problema </w:t>
+              <w:t>Documento</w:t>
+            </w:r>
+            <w:proofErr w:type="spellEnd"/>
+            <w:r>
+              <w:rPr>
+                <w:rFonts w:ascii="Arial" w:eastAsia="Arial" w:hAnsi="Arial" w:cs="Arial"/>
+                <w:b w:val="0"/>
+                <w:bCs w:val="0"/>
+                <w:i w:val="0"/>
+                <w:iCs w:val="0"/>
+                <w:sz w:val="24"/>
+                <w:szCs w:val="24"/>
+                <w:lang w:val="en-US"/>
+              </w:rPr>
+              <w:t xml:space="preserve"> de </w:t>
+            </w:r>
+            <w:proofErr w:type="spellStart"/>
+            <w:r>
+              <w:rPr>
+                <w:rFonts w:ascii="Arial" w:eastAsia="Arial" w:hAnsi="Arial" w:cs="Arial"/>
+                <w:b w:val="0"/>
+                <w:bCs w:val="0"/>
+                <w:i w:val="0"/>
+                <w:iCs w:val="0"/>
+                <w:sz w:val="24"/>
+                <w:szCs w:val="24"/>
+                <w:lang w:val="en-US"/>
+              </w:rPr>
+              <w:t>análisis</w:t>
+            </w:r>
+            <w:proofErr w:type="spellEnd"/>
+            <w:r>
+              <w:rPr>
+                <w:rFonts w:ascii="Arial" w:eastAsia="Arial" w:hAnsi="Arial" w:cs="Arial"/>
+                <w:b w:val="0"/>
+                <w:bCs w:val="0"/>
+                <w:i w:val="0"/>
+                <w:iCs w:val="0"/>
+                <w:sz w:val="24"/>
+                <w:szCs w:val="24"/>
+                <w:lang w:val="en-US"/>
+              </w:rPr>
+              <w:t xml:space="preserve"> del </w:t>
+            </w:r>
+            <w:proofErr w:type="spellStart"/>
+            <w:r>
+              <w:rPr>
+                <w:rFonts w:ascii="Arial" w:eastAsia="Arial" w:hAnsi="Arial" w:cs="Arial"/>
+                <w:b w:val="0"/>
+                <w:bCs w:val="0"/>
+                <w:i w:val="0"/>
+                <w:iCs w:val="0"/>
+                <w:sz w:val="24"/>
+                <w:szCs w:val="24"/>
+                <w:lang w:val="en-US"/>
+              </w:rPr>
+              <w:t>problema</w:t>
+            </w:r>
+            <w:proofErr w:type="spellEnd"/>
+            <w:r>
+              <w:rPr>
+                <w:rFonts w:ascii="Arial" w:eastAsia="Arial" w:hAnsi="Arial" w:cs="Arial"/>
+                <w:b w:val="0"/>
+                <w:bCs w:val="0"/>
+                <w:i w:val="0"/>
+                <w:iCs w:val="0"/>
+                <w:sz w:val="24"/>
+                <w:szCs w:val="24"/>
+                <w:lang w:val="en-US"/>
+              </w:rPr>
+              <w:t xml:space="preserve"> </w:t>
             </w:r>
           </w:p>
           <w:p>
@@ -1819,6 +3123,7 @@
                 <w:numId w:val="17"/>
               </w:numPr>
               <w:jc w:val="left"/>
+              <w:outlineLvl w:val="2"/>
               <w:rPr>
                 <w:rFonts w:ascii="Arial" w:eastAsia="Arial" w:hAnsi="Arial" w:cs="Arial"/>
                 <w:b w:val="0"/>
@@ -1852,6 +3157,7 @@
                 <w:numId w:val="17"/>
               </w:numPr>
               <w:jc w:val="left"/>
+              <w:outlineLvl w:val="2"/>
               <w:rPr>
                 <w:rFonts w:ascii="Arial" w:eastAsia="Arial" w:hAnsi="Arial" w:cs="Arial"/>
                 <w:b w:val="0"/>
@@ -1885,6 +3191,7 @@
                 <w:numId w:val="17"/>
               </w:numPr>
               <w:jc w:val="left"/>
+              <w:outlineLvl w:val="2"/>
               <w:rPr>
                 <w:rFonts w:ascii="Arial" w:eastAsia="Arial" w:hAnsi="Arial" w:cs="Arial"/>
                 <w:b w:val="0"/>
@@ -1907,7 +3214,63 @@
                 <w:szCs w:val="24"/>
                 <w:lang w:val="en-US"/>
               </w:rPr>
-              <w:t xml:space="preserve">Código fuente funcional </w:t>
+              <w:t xml:space="preserve">Código </w:t>
+            </w:r>
+            <w:proofErr w:type="spellStart"/>
+            <w:r>
+              <w:rPr>
+                <w:rFonts w:ascii="Arial" w:eastAsia="Arial" w:hAnsi="Arial" w:cs="Arial"/>
+                <w:b w:val="0"/>
+                <w:bCs w:val="0"/>
+                <w:i w:val="0"/>
+                <w:iCs w:val="0"/>
+                <w:sz w:val="24"/>
+                <w:szCs w:val="24"/>
+                <w:lang w:val="en-US"/>
+              </w:rPr>
+              <w:t>fuente</w:t>
+            </w:r>
+            <w:proofErr w:type="spellEnd"/>
+            <w:r>
+              <w:rPr>
+                <w:rFonts w:ascii="Arial" w:eastAsia="Arial" w:hAnsi="Arial" w:cs="Arial"/>
+                <w:b w:val="0"/>
+                <w:bCs w:val="0"/>
+                <w:i w:val="0"/>
+                <w:iCs w:val="0"/>
+                <w:sz w:val="24"/>
+                <w:szCs w:val="24"/>
+                <w:lang w:val="en-US"/>
+              </w:rPr>
+              <w:t xml:space="preserve"> </w:t>
+            </w:r>
+            <w:proofErr w:type="spellStart"/>
+            <w:r>
+              <w:rPr>
+                <w:rFonts w:ascii="Arial" w:eastAsia="Arial" w:hAnsi="Arial" w:cs="Arial"/>
+                <w:b w:val="0"/>
+                <w:bCs w:val="0"/>
+                <w:i w:val="0"/>
+                <w:iCs w:val="0"/>
+                <w:sz w:val="24"/>
+                <w:szCs w:val="24"/>
+                <w:lang w:val="en-US"/>
+              </w:rPr>
+              <w:t>funcional</w:t>
+            </w:r>
+            <w:proofErr w:type="spellEnd"/>
+            <w:r>
+              <w:rPr>
+                <w:rFonts w:ascii="Arial" w:eastAsia="Arial" w:hAnsi="Arial" w:cs="Arial"/>
+                <w:b w:val="0"/>
+                <w:bCs w:val="0"/>
+                <w:i w:val="0"/>
+                <w:iCs w:val="0"/>
+                <w:sz w:val="24"/>
+                <w:szCs w:val="24"/>
+                <w:lang w:val="en-US"/>
+              </w:rPr>
+              <w:t xml:space="preserve"> </w:t>
             </w:r>
           </w:p>
           <w:p>
@@ -1918,6 +3281,7 @@
                 <w:numId w:val="17"/>
               </w:numPr>
               <w:jc w:val="left"/>
+              <w:outlineLvl w:val="2"/>
               <w:rPr>
                 <w:rFonts w:ascii="Arial" w:eastAsia="Arial" w:hAnsi="Arial" w:cs="Arial"/>
                 <w:b w:val="0"/>
@@ -1929,6 +3293,7 @@
                 <w:lang w:val="en-US"/>
               </w:rPr>
             </w:pPr>
+            <w:proofErr w:type="spellStart"/>
             <w:r>
               <w:rPr>
                 <w:rFonts w:ascii="Arial" w:eastAsia="Arial" w:hAnsi="Arial" w:cs="Arial"/>
@@ -1940,7 +3305,77 @@
                 <w:szCs w:val="24"/>
                 <w:lang w:val="en-US"/>
               </w:rPr>
-              <w:t xml:space="preserve">Pruebas (unitarias e integración) </w:t>
+              <w:t>Pruebas</w:t>
+            </w:r>
+            <w:proofErr w:type="spellEnd"/>
+            <w:r>
+              <w:rPr>
+                <w:rFonts w:ascii="Arial" w:eastAsia="Arial" w:hAnsi="Arial" w:cs="Arial"/>
+                <w:b w:val="0"/>
+                <w:bCs w:val="0"/>
+                <w:i w:val="0"/>
+                <w:iCs w:val="0"/>
+                <w:sz w:val="24"/>
+                <w:szCs w:val="24"/>
+                <w:lang w:val="en-US"/>
+              </w:rPr>
+              <w:t xml:space="preserve"> (</w:t>
+            </w:r>
+            <w:proofErr w:type="spellStart"/>
+            <w:r>
+              <w:rPr>
+                <w:rFonts w:ascii="Arial" w:eastAsia="Arial" w:hAnsi="Arial" w:cs="Arial"/>
+                <w:b w:val="0"/>
+                <w:bCs w:val="0"/>
+                <w:i w:val="0"/>
+                <w:iCs w:val="0"/>
+                <w:sz w:val="24"/>
+                <w:szCs w:val="24"/>
+                <w:lang w:val="en-US"/>
+              </w:rPr>
+              <w:t>unitarias</w:t>
+            </w:r>
+            <w:proofErr w:type="spellEnd"/>
+            <w:r>
+              <w:rPr>
+                <w:rFonts w:ascii="Arial" w:eastAsia="Arial" w:hAnsi="Arial" w:cs="Arial"/>
+                <w:b w:val="0"/>
+                <w:bCs w:val="0"/>
+                <w:i w:val="0"/>
+                <w:iCs w:val="0"/>
+                <w:sz w:val="24"/>
+                <w:szCs w:val="24"/>
+                <w:lang w:val="en-US"/>
+              </w:rPr>
+              <w:t xml:space="preserve"> e </w:t>
+            </w:r>
+            <w:proofErr w:type="spellStart"/>
+            <w:r>
+              <w:rPr>
+                <w:rFonts w:ascii="Arial" w:eastAsia="Arial" w:hAnsi="Arial" w:cs="Arial"/>
+                <w:b w:val="0"/>
+                <w:bCs w:val="0"/>
+                <w:i w:val="0"/>
+                <w:iCs w:val="0"/>
+                <w:sz w:val="24"/>
+                <w:szCs w:val="24"/>
+                <w:lang w:val="en-US"/>
+              </w:rPr>
+              <w:t>integración</w:t>
+            </w:r>
+            <w:proofErr w:type="spellEnd"/>
+            <w:r>
+              <w:rPr>
+                <w:rFonts w:ascii="Arial" w:eastAsia="Arial" w:hAnsi="Arial" w:cs="Arial"/>
+                <w:b w:val="0"/>
+                <w:bCs w:val="0"/>
+                <w:i w:val="0"/>
+                <w:iCs w:val="0"/>
+                <w:sz w:val="24"/>
+                <w:szCs w:val="24"/>
+                <w:lang w:val="en-US"/>
+              </w:rPr>
+              <w:t xml:space="preserve">) </w:t>
             </w:r>
           </w:p>
           <w:p>
@@ -1951,6 +3386,7 @@
                 <w:numId w:val="17"/>
               </w:numPr>
               <w:jc w:val="left"/>
+              <w:outlineLvl w:val="2"/>
               <w:rPr>
                 <w:rFonts w:ascii="Arial" w:eastAsia="Arial" w:hAnsi="Arial" w:cs="Arial"/>
                 <w:b w:val="0"/>
@@ -1973,7 +3409,35 @@
                 <w:szCs w:val="24"/>
                 <w:lang w:val="en-US"/>
               </w:rPr>
-              <w:t xml:space="preserve">Video demostrativo </w:t>
+              <w:t xml:space="preserve">Video </w:t>
+            </w:r>
+            <w:proofErr w:type="spellStart"/>
+            <w:r>
+              <w:rPr>
+                <w:rFonts w:ascii="Arial" w:eastAsia="Arial" w:hAnsi="Arial" w:cs="Arial"/>
+                <w:b w:val="0"/>
+                <w:bCs w:val="0"/>
+                <w:i w:val="0"/>
+                <w:iCs w:val="0"/>
+                <w:sz w:val="24"/>
+                <w:szCs w:val="24"/>
+                <w:lang w:val="en-US"/>
+              </w:rPr>
+              <w:t>demostrativo</w:t>
+            </w:r>
+            <w:proofErr w:type="spellEnd"/>
+            <w:r>
+              <w:rPr>
+                <w:rFonts w:ascii="Arial" w:eastAsia="Arial" w:hAnsi="Arial" w:cs="Arial"/>
+                <w:b w:val="0"/>
+                <w:bCs w:val="0"/>
+                <w:i w:val="0"/>
+                <w:iCs w:val="0"/>
+                <w:sz w:val="24"/>
+                <w:szCs w:val="24"/>
+                <w:lang w:val="en-US"/>
+              </w:rPr>
+              <w:t xml:space="preserve"> </w:t>
             </w:r>
           </w:p>
           <w:p>
@@ -1984,6 +3448,7 @@
                 <w:numId w:val="17"/>
               </w:numPr>
               <w:jc w:val="left"/>
+              <w:outlineLvl w:val="2"/>
               <w:rPr>
                 <w:rFonts w:ascii="Arial" w:eastAsia="Arial" w:hAnsi="Arial" w:cs="Arial"/>
                 <w:b w:val="0"/>
@@ -2006,7 +3471,63 @@
                 <w:szCs w:val="24"/>
                 <w:lang w:val="en-US"/>
               </w:rPr>
-              <w:t xml:space="preserve">Informe técnico de decisiones </w:t>
+              <w:t xml:space="preserve">Informe </w:t>
+            </w:r>
+            <w:proofErr w:type="spellStart"/>
+            <w:r>
+              <w:rPr>
+                <w:rFonts w:ascii="Arial" w:eastAsia="Arial" w:hAnsi="Arial" w:cs="Arial"/>
+                <w:b w:val="0"/>
+                <w:bCs w:val="0"/>
+                <w:i w:val="0"/>
+                <w:iCs w:val="0"/>
+                <w:sz w:val="24"/>
+                <w:szCs w:val="24"/>
+                <w:lang w:val="en-US"/>
+              </w:rPr>
+              <w:t>técnico</w:t>
+            </w:r>
+            <w:proofErr w:type="spellEnd"/>
+            <w:r>
+              <w:rPr>
+                <w:rFonts w:ascii="Arial" w:eastAsia="Arial" w:hAnsi="Arial" w:cs="Arial"/>
+                <w:b w:val="0"/>
+                <w:bCs w:val="0"/>
+                <w:i w:val="0"/>
+                <w:iCs w:val="0"/>
+                <w:sz w:val="24"/>
+                <w:szCs w:val="24"/>
+                <w:lang w:val="en-US"/>
+              </w:rPr>
+              <w:t xml:space="preserve"> de </w:t>
+            </w:r>
+            <w:proofErr w:type="spellStart"/>
+            <w:r>
+              <w:rPr>
+                <w:rFonts w:ascii="Arial" w:eastAsia="Arial" w:hAnsi="Arial" w:cs="Arial"/>
+                <w:b w:val="0"/>
+                <w:bCs w:val="0"/>
+                <w:i w:val="0"/>
+                <w:iCs w:val="0"/>
+                <w:sz w:val="24"/>
+                <w:szCs w:val="24"/>
+                <w:lang w:val="en-US"/>
+              </w:rPr>
+              <w:t>decisiones</w:t>
+            </w:r>
+            <w:proofErr w:type="spellEnd"/>
+            <w:r>
+              <w:rPr>
+                <w:rFonts w:ascii="Arial" w:eastAsia="Arial" w:hAnsi="Arial" w:cs="Arial"/>
+                <w:b w:val="0"/>
+                <w:bCs w:val="0"/>
+                <w:i w:val="0"/>
+                <w:iCs w:val="0"/>
+                <w:sz w:val="24"/>
+                <w:szCs w:val="24"/>
+                <w:lang w:val="en-US"/>
+              </w:rPr>
+              <w:t xml:space="preserve"> </w:t>
             </w:r>
           </w:p>
         </w:tc>
@@ -2062,8 +3583,42 @@
                 <w:sz w:val="32"/>
                 <w:szCs w:val="32"/>
               </w:rPr>
-              <w:t>El proyecto no incluye</w:t>
-            </w:r>
+              <w:t xml:space="preserve">El </w:t>
+            </w:r>
+            <w:proofErr w:type="spellStart"/>
+            <w:r>
+              <w:rPr>
+                <w:rFonts w:ascii="Arial" w:eastAsia="Arial" w:hAnsi="Arial" w:cs="Arial"/>
+                <w:i w:val="0"/>
+                <w:iCs w:val="0"/>
+                <w:sz w:val="32"/>
+                <w:szCs w:val="32"/>
+              </w:rPr>
+              <w:t>proyecto</w:t>
+            </w:r>
+            <w:proofErr w:type="spellEnd"/>
+            <w:r>
+              <w:rPr>
+                <w:rFonts w:ascii="Arial" w:eastAsia="Arial" w:hAnsi="Arial" w:cs="Arial"/>
+                <w:i w:val="0"/>
+                <w:iCs w:val="0"/>
+                <w:sz w:val="32"/>
+                <w:szCs w:val="32"/>
+              </w:rPr>
+              <w:t xml:space="preserve"> no </w:t>
+            </w:r>
+            <w:proofErr w:type="spellStart"/>
+            <w:r>
+              <w:rPr>
+                <w:rFonts w:ascii="Arial" w:eastAsia="Arial" w:hAnsi="Arial" w:cs="Arial"/>
+                <w:i w:val="0"/>
+                <w:iCs w:val="0"/>
+                <w:sz w:val="32"/>
+                <w:szCs w:val="32"/>
+              </w:rPr>
+              <w:t>incluye</w:t>
+            </w:r>
+            <w:proofErr w:type="spellEnd"/>
             <w:r>
               <w:rPr>
                 <w:rFonts w:ascii="Arial" w:eastAsia="Arial" w:hAnsi="Arial" w:cs="Arial"/>
@@ -2128,15 +3683,97 @@
                 <w:lang w:val="en-US"/>
               </w:rPr>
             </w:pPr>
-            <w:r>
-              <w:rPr>
-                <w:rFonts w:ascii="Arial" w:eastAsia="Arial" w:hAnsi="Arial" w:cs="Arial"/>
-                <w:sz w:val="24"/>
-                <w:szCs w:val="24"/>
-                <w:lang w:val="en-US"/>
-              </w:rPr>
-              <w:t>Implementación en entornos productivos reales</w:t>
-            </w:r>
+            <w:proofErr w:type="spellStart"/>
+            <w:r>
+              <w:rPr>
+                <w:rFonts w:ascii="Arial" w:eastAsia="Arial" w:hAnsi="Arial" w:cs="Arial"/>
+                <w:sz w:val="24"/>
+                <w:szCs w:val="24"/>
+                <w:lang w:val="en-US"/>
+              </w:rPr>
+              <w:t>Implementación</w:t>
+            </w:r>
+            <w:proofErr w:type="spellEnd"/>
+            <w:r>
+              <w:rPr>
+                <w:rFonts w:ascii="Arial" w:eastAsia="Arial" w:hAnsi="Arial" w:cs="Arial"/>
+                <w:sz w:val="24"/>
+                <w:szCs w:val="24"/>
+                <w:lang w:val="en-US"/>
+              </w:rPr>
+              <w:t xml:space="preserve"> </w:t>
+            </w:r>
+            <w:proofErr w:type="spellStart"/>
+            <w:r>
+              <w:rPr>
+                <w:rFonts w:ascii="Arial" w:eastAsia="Arial" w:hAnsi="Arial" w:cs="Arial"/>
+                <w:sz w:val="24"/>
+                <w:szCs w:val="24"/>
+                <w:lang w:val="en-US"/>
+              </w:rPr>
+              <w:t>en</w:t>
+            </w:r>
+            <w:proofErr w:type="spellEnd"/>
+            <w:r>
+              <w:rPr>
+                <w:rFonts w:ascii="Arial" w:eastAsia="Arial" w:hAnsi="Arial" w:cs="Arial"/>
+                <w:sz w:val="24"/>
+                <w:szCs w:val="24"/>
+                <w:lang w:val="en-US"/>
+              </w:rPr>
+              <w:t xml:space="preserve"> </w:t>
+            </w:r>
+            <w:proofErr w:type="spellStart"/>
+            <w:r>
+              <w:rPr>
+                <w:rFonts w:ascii="Arial" w:eastAsia="Arial" w:hAnsi="Arial" w:cs="Arial"/>
+                <w:sz w:val="24"/>
+                <w:szCs w:val="24"/>
+                <w:lang w:val="en-US"/>
+              </w:rPr>
+              <w:t>entornos</w:t>
+            </w:r>
+            <w:proofErr w:type="spellEnd"/>
+            <w:r>
+              <w:rPr>
+                <w:rFonts w:ascii="Arial" w:eastAsia="Arial" w:hAnsi="Arial" w:cs="Arial"/>
+                <w:sz w:val="24"/>
+                <w:szCs w:val="24"/>
+                <w:lang w:val="en-US"/>
+              </w:rPr>
+              <w:t xml:space="preserve"> </w:t>
+            </w:r>
+            <w:proofErr w:type="spellStart"/>
+            <w:r>
+              <w:rPr>
+                <w:rFonts w:ascii="Arial" w:eastAsia="Arial" w:hAnsi="Arial" w:cs="Arial"/>
+                <w:sz w:val="24"/>
+                <w:szCs w:val="24"/>
+                <w:lang w:val="en-US"/>
+              </w:rPr>
+              <w:t>productivos</w:t>
+            </w:r>
+            <w:proofErr w:type="spellEnd"/>
+            <w:r>
+              <w:rPr>
+                <w:rFonts w:ascii="Arial" w:eastAsia="Arial" w:hAnsi="Arial" w:cs="Arial"/>
+                <w:sz w:val="24"/>
+                <w:szCs w:val="24"/>
+                <w:lang w:val="en-US"/>
+              </w:rPr>
+              <w:t xml:space="preserve"> </w:t>
+            </w:r>
+            <w:proofErr w:type="spellStart"/>
+            <w:r>
+              <w:rPr>
+                <w:rFonts w:ascii="Arial" w:eastAsia="Arial" w:hAnsi="Arial" w:cs="Arial"/>
+                <w:sz w:val="24"/>
+                <w:szCs w:val="24"/>
+                <w:lang w:val="en-US"/>
+              </w:rPr>
+              <w:t>reales</w:t>
+            </w:r>
+            <w:proofErr w:type="spellEnd"/>
           </w:p>
           <w:p>
             <w:pPr>
@@ -2186,6 +3823,7 @@
                 <w:lang w:val="en-US"/>
               </w:rPr>
             </w:pPr>
+            <w:proofErr w:type="spellStart"/>
             <w:r>
               <w:rPr>
                 <w:rFonts w:ascii="Arial" w:eastAsia="Arial" w:hAnsi="Arial" w:cs="Arial"/>
@@ -2196,7 +3834,67 @@
                 <w:lang w:val="en-US"/>
               </w:rPr>
               <w:lastRenderedPageBreak/>
-              <w:t xml:space="preserve">Infraestructura física adicional </w:t>
+              <w:t>Infraestructura</w:t>
+            </w:r>
+            <w:proofErr w:type="spellEnd"/>
+            <w:r>
+              <w:rPr>
+                <w:rFonts w:ascii="Arial" w:eastAsia="Arial" w:hAnsi="Arial" w:cs="Arial"/>
+                <w:i w:val="0"/>
+                <w:iCs w:val="0"/>
+                <w:sz w:val="24"/>
+                <w:szCs w:val="24"/>
+                <w:lang w:val="en-US"/>
+              </w:rPr>
+              <w:t xml:space="preserve"> </w:t>
+            </w:r>
+            <w:proofErr w:type="spellStart"/>
+            <w:r>
+              <w:rPr>
+                <w:rFonts w:ascii="Arial" w:eastAsia="Arial" w:hAnsi="Arial" w:cs="Arial"/>
+                <w:i w:val="0"/>
+                <w:iCs w:val="0"/>
+                <w:sz w:val="24"/>
+                <w:szCs w:val="24"/>
+                <w:lang w:val="en-US"/>
+              </w:rPr>
+              <w:t>física</w:t>
+            </w:r>
+            <w:proofErr w:type="spellEnd"/>
+            <w:r>
+              <w:rPr>
+                <w:rFonts w:ascii="Arial" w:eastAsia="Arial" w:hAnsi="Arial" w:cs="Arial"/>
+                <w:i w:val="0"/>
+                <w:iCs w:val="0"/>
+                <w:sz w:val="24"/>
+                <w:szCs w:val="24"/>
+                <w:lang w:val="en-US"/>
+              </w:rPr>
+              <w:t xml:space="preserve"> </w:t>
+            </w:r>
+            <w:proofErr w:type="spellStart"/>
+            <w:r>
+              <w:rPr>
+                <w:rFonts w:ascii="Arial" w:eastAsia="Arial" w:hAnsi="Arial" w:cs="Arial"/>
+                <w:i w:val="0"/>
+                <w:iCs w:val="0"/>
+                <w:sz w:val="24"/>
+                <w:szCs w:val="24"/>
+                <w:lang w:val="en-US"/>
+              </w:rPr>
+              <w:t>adicional</w:t>
+            </w:r>
+            <w:proofErr w:type="spellEnd"/>
+            <w:r>
+              <w:rPr>
+                <w:rFonts w:ascii="Arial" w:eastAsia="Arial" w:hAnsi="Arial" w:cs="Arial"/>
+                <w:i w:val="0"/>
+                <w:iCs w:val="0"/>
+                <w:sz w:val="24"/>
+                <w:szCs w:val="24"/>
+                <w:lang w:val="en-US"/>
+              </w:rPr>
+              <w:t xml:space="preserve"> </w:t>
             </w:r>
           </w:p>
           <w:p>
@@ -2219,16 +3917,53 @@
                 <w:lang w:val="en-US"/>
               </w:rPr>
             </w:pPr>
-            <w:r>
-              <w:rPr>
-                <w:rFonts w:ascii="Arial" w:eastAsia="Arial" w:hAnsi="Arial" w:cs="Arial"/>
-                <w:i w:val="0"/>
-                <w:iCs w:val="0"/>
-                <w:sz w:val="24"/>
-                <w:szCs w:val="24"/>
-                <w:lang w:val="en-US"/>
-              </w:rPr>
-              <w:t xml:space="preserve">Capacitación institucional formal </w:t>
+            <w:proofErr w:type="spellStart"/>
+            <w:r>
+              <w:rPr>
+                <w:rFonts w:ascii="Arial" w:eastAsia="Arial" w:hAnsi="Arial" w:cs="Arial"/>
+                <w:i w:val="0"/>
+                <w:iCs w:val="0"/>
+                <w:sz w:val="24"/>
+                <w:szCs w:val="24"/>
+                <w:lang w:val="en-US"/>
+              </w:rPr>
+              <w:t>Capacitación</w:t>
+            </w:r>
+            <w:proofErr w:type="spellEnd"/>
+            <w:r>
+              <w:rPr>
+                <w:rFonts w:ascii="Arial" w:eastAsia="Arial" w:hAnsi="Arial" w:cs="Arial"/>
+                <w:i w:val="0"/>
+                <w:iCs w:val="0"/>
+                <w:sz w:val="24"/>
+                <w:szCs w:val="24"/>
+                <w:lang w:val="en-US"/>
+              </w:rPr>
+              <w:t xml:space="preserve"> </w:t>
+            </w:r>
+            <w:proofErr w:type="spellStart"/>
+            <w:r>
+              <w:rPr>
+                <w:rFonts w:ascii="Arial" w:eastAsia="Arial" w:hAnsi="Arial" w:cs="Arial"/>
+                <w:i w:val="0"/>
+                <w:iCs w:val="0"/>
+                <w:sz w:val="24"/>
+                <w:szCs w:val="24"/>
+                <w:lang w:val="en-US"/>
+              </w:rPr>
+              <w:t>institucional</w:t>
+            </w:r>
+            <w:proofErr w:type="spellEnd"/>
+            <w:r>
+              <w:rPr>
+                <w:rFonts w:ascii="Arial" w:eastAsia="Arial" w:hAnsi="Arial" w:cs="Arial"/>
+                <w:i w:val="0"/>
+                <w:iCs w:val="0"/>
+                <w:sz w:val="24"/>
+                <w:szCs w:val="24"/>
+                <w:lang w:val="en-US"/>
+              </w:rPr>
+              <w:t xml:space="preserve"> formal </w:t>
             </w:r>
           </w:p>
         </w:tc>
@@ -2259,6 +3994,7 @@
                 <w:szCs w:val="24"/>
               </w:rPr>
             </w:pPr>
+            <w:proofErr w:type="spellStart"/>
             <w:r>
               <w:rPr>
                 <w:rFonts w:ascii="Arial" w:eastAsia="Arial" w:hAnsi="Arial" w:cs="Arial"/>
@@ -2268,7 +4004,40 @@
                 <w:szCs w:val="32"/>
               </w:rPr>
               <w:lastRenderedPageBreak/>
-              <w:t>Recursos pre-asignados:</w:t>
+              <w:t>Recursos</w:t>
+            </w:r>
+            <w:proofErr w:type="spellEnd"/>
+            <w:r>
+              <w:rPr>
+                <w:rFonts w:ascii="Arial" w:eastAsia="Arial" w:hAnsi="Arial" w:cs="Arial"/>
+                <w:i w:val="0"/>
+                <w:iCs w:val="0"/>
+                <w:sz w:val="32"/>
+                <w:szCs w:val="32"/>
+              </w:rPr>
+              <w:t xml:space="preserve"> pre-</w:t>
+            </w:r>
+            <w:proofErr w:type="spellStart"/>
+            <w:r>
+              <w:rPr>
+                <w:rFonts w:ascii="Arial" w:eastAsia="Arial" w:hAnsi="Arial" w:cs="Arial"/>
+                <w:i w:val="0"/>
+                <w:iCs w:val="0"/>
+                <w:sz w:val="32"/>
+                <w:szCs w:val="32"/>
+              </w:rPr>
+              <w:t>asignados</w:t>
+            </w:r>
+            <w:proofErr w:type="spellEnd"/>
+            <w:r>
+              <w:rPr>
+                <w:rFonts w:ascii="Arial" w:eastAsia="Arial" w:hAnsi="Arial" w:cs="Arial"/>
+                <w:i w:val="0"/>
+                <w:iCs w:val="0"/>
+                <w:sz w:val="32"/>
+                <w:szCs w:val="32"/>
+              </w:rPr>
+              <w:t>:</w:t>
             </w:r>
           </w:p>
         </w:tc>
@@ -2336,16 +4105,77 @@
                 <w:lang w:val="en-US"/>
               </w:rPr>
             </w:pPr>
-            <w:r>
-              <w:rPr>
-                <w:rFonts w:ascii="Arial" w:eastAsia="Arial" w:hAnsi="Arial" w:cs="Arial"/>
-                <w:i w:val="0"/>
-                <w:iCs w:val="0"/>
-                <w:sz w:val="24"/>
-                <w:szCs w:val="24"/>
-                <w:lang w:val="en-US"/>
-              </w:rPr>
-              <w:t xml:space="preserve">Equipos personales de desarrollo </w:t>
+            <w:proofErr w:type="spellStart"/>
+            <w:r>
+              <w:rPr>
+                <w:rFonts w:ascii="Arial" w:eastAsia="Arial" w:hAnsi="Arial" w:cs="Arial"/>
+                <w:i w:val="0"/>
+                <w:iCs w:val="0"/>
+                <w:sz w:val="24"/>
+                <w:szCs w:val="24"/>
+                <w:lang w:val="en-US"/>
+              </w:rPr>
+              <w:t>Equipos</w:t>
+            </w:r>
+            <w:proofErr w:type="spellEnd"/>
+            <w:r>
+              <w:rPr>
+                <w:rFonts w:ascii="Arial" w:eastAsia="Arial" w:hAnsi="Arial" w:cs="Arial"/>
+                <w:i w:val="0"/>
+                <w:iCs w:val="0"/>
+                <w:sz w:val="24"/>
+                <w:szCs w:val="24"/>
+                <w:lang w:val="en-US"/>
+              </w:rPr>
+              <w:t xml:space="preserve"> </w:t>
+            </w:r>
+            <w:proofErr w:type="spellStart"/>
+            <w:r>
+              <w:rPr>
+                <w:rFonts w:ascii="Arial" w:eastAsia="Arial" w:hAnsi="Arial" w:cs="Arial"/>
+                <w:i w:val="0"/>
+                <w:iCs w:val="0"/>
+                <w:sz w:val="24"/>
+                <w:szCs w:val="24"/>
+                <w:lang w:val="en-US"/>
+              </w:rPr>
+              <w:t>personales</w:t>
+            </w:r>
+            <w:proofErr w:type="spellEnd"/>
+            <w:r>
+              <w:rPr>
+                <w:rFonts w:ascii="Arial" w:eastAsia="Arial" w:hAnsi="Arial" w:cs="Arial"/>
+                <w:i w:val="0"/>
+                <w:iCs w:val="0"/>
+                <w:sz w:val="24"/>
+                <w:szCs w:val="24"/>
+                <w:lang w:val="en-US"/>
+              </w:rPr>
+              <w:t xml:space="preserve"> de </w:t>
+            </w:r>
+            <w:proofErr w:type="spellStart"/>
+            <w:r>
+              <w:rPr>
+                <w:rFonts w:ascii="Arial" w:eastAsia="Arial" w:hAnsi="Arial" w:cs="Arial"/>
+                <w:i w:val="0"/>
+                <w:iCs w:val="0"/>
+                <w:sz w:val="24"/>
+                <w:szCs w:val="24"/>
+                <w:lang w:val="en-US"/>
+              </w:rPr>
+              <w:t>desarrollo</w:t>
+            </w:r>
+            <w:proofErr w:type="spellEnd"/>
+            <w:r>
+              <w:rPr>
+                <w:rFonts w:ascii="Arial" w:eastAsia="Arial" w:hAnsi="Arial" w:cs="Arial"/>
+                <w:i w:val="0"/>
+                <w:iCs w:val="0"/>
+                <w:sz w:val="24"/>
+                <w:szCs w:val="24"/>
+                <w:lang w:val="en-US"/>
+              </w:rPr>
+              <w:t xml:space="preserve"> </w:t>
             </w:r>
           </w:p>
           <w:p>
@@ -2375,7 +4205,31 @@
                 <w:szCs w:val="24"/>
                 <w:lang w:val="es-PE"/>
               </w:rPr>
-              <w:t xml:space="preserve">Herramientas de desarrollo (Git, frameworks web) </w:t>
+              <w:t xml:space="preserve">Herramientas de desarrollo (Git, </w:t>
+            </w:r>
+            <w:proofErr w:type="spellStart"/>
+            <w:r>
+              <w:rPr>
+                <w:rFonts w:ascii="Arial" w:eastAsia="Arial" w:hAnsi="Arial" w:cs="Arial"/>
+                <w:i w:val="0"/>
+                <w:iCs w:val="0"/>
+                <w:sz w:val="24"/>
+                <w:szCs w:val="24"/>
+                <w:lang w:val="es-PE"/>
+              </w:rPr>
+              <w:t>frameworks</w:t>
+            </w:r>
+            <w:proofErr w:type="spellEnd"/>
+            <w:r>
+              <w:rPr>
+                <w:rFonts w:ascii="Arial" w:eastAsia="Arial" w:hAnsi="Arial" w:cs="Arial"/>
+                <w:i w:val="0"/>
+                <w:iCs w:val="0"/>
+                <w:sz w:val="24"/>
+                <w:szCs w:val="24"/>
+                <w:lang w:val="es-PE"/>
+              </w:rPr>
+              <w:t xml:space="preserve"> web) </w:t>
             </w:r>
           </w:p>
           <w:p>
@@ -2504,7 +4358,7 @@
           </mc:Choice>
           <mc:Fallback>
             <w:pict>
-              <v:rect w14:anchorId="5633C79C" id="Rectángulo 224" o:spid="_x0000_s1028" style="position:absolute;margin-left:1.75pt;margin-top:37.25pt;width:537.75pt;height:77.7pt;z-index:251659264;visibility:visible;mso-wrap-style:square;mso-wrap-distance-left:9pt;mso-wrap-distance-top:3.6pt;mso-wrap-distance-right:9pt;mso-wrap-distance-bottom:3.6pt;mso-position-horizontal:absolute;mso-position-horizontal-relative:text;mso-position-vertical:absolute;mso-position-vertical-relative:text;v-text-anchor:top" o:gfxdata="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" fillcolor="#59d4eb" stroked="f">
+              <v:rect w14:anchorId="5633C79C" id="Rectángulo 224" o:spid="_x0000_s1028" style="position:absolute;margin-left:1.75pt;margin-top:37.25pt;width:537.75pt;height:77.7pt;z-index:251659264;visibility:visible;mso-wrap-style:square;mso-wrap-distance-left:9pt;mso-wrap-distance-top:3.6pt;mso-wrap-distance-right:9pt;mso-wrap-distance-bottom:3.6pt;mso-position-horizontal:absolute;mso-position-horizontal-relative:text;mso-position-vertical:absolute;mso-position-vertical-relative:text;v-text-anchor:top" o:gfxdata="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" fillcolor="#59d4eb" stroked="f">
                 <v:textbox inset="2.53958mm,1.2694mm,2.53958mm,1.2694mm">
                   <w:txbxContent>
                     <w:p>
@@ -2680,7 +4534,7 @@
                 </mc:Choice>
                 <mc:Fallback>
                   <w:pict>
-                    <v:shape w14:anchorId="38A30DD5" id="Forma libre: forma 221" o:spid="_x0000_s1029" style="width:27.25pt;height:24.4pt;visibility:visible;mso-wrap-style:square;mso-left-percent:-10001;mso-top-percent:-10001;mso-position-horizontal:absolute;mso-position-horizontal-relative:char;mso-position-vertical:absolute;mso-position-vertical-relative:line;mso-left-percent:-10001;mso-top-percent:-10001;v-text-anchor:middle" coordsize="271148,228600" o:spt="100" o:gfxdata="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" adj="-11796480,,5400" path="m,l175897,v25453,3260,42922,10367,58373,25274c249721,40181,262883,55556,268605,89444v5722,33888,,92771,,139156l,228600,,xe" fillcolor="#4f17a8" stroked="f">
+                    <v:shape w14:anchorId="38A30DD5" id="Forma libre: forma 221" o:spid="_x0000_s1029" style="width:27.25pt;height:24.4pt;visibility:visible;mso-wrap-style:square;mso-left-percent:-10001;mso-top-percent:-10001;mso-position-horizontal:absolute;mso-position-horizontal-relative:char;mso-position-vertical:absolute;mso-position-vertical-relative:line;mso-left-percent:-10001;mso-top-percent:-10001;v-text-anchor:middle" coordsize="271148,228600" o:spt="100" o:gfxdata="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" adj="-11796480,,5400" path="m,l175897,v25453,3260,42922,10367,58373,25274c249721,40181,262883,55556,268605,89444v5722,33888,,92771,,139156l,228600,,xe" fillcolor="#4f17a8" stroked="f">
                       <v:stroke joinstyle="miter"/>
                       <v:formulas/>
                       <v:path arrowok="t" o:extrusionok="f" o:connecttype="custom" textboxrect="0,0,271148,228600"/>
@@ -2739,8 +4593,21 @@
                 <w:sz w:val="44"/>
                 <w:szCs w:val="44"/>
               </w:rPr>
-              <w:t>Lista de interesados</w:t>
-            </w:r>
+              <w:t xml:space="preserve">Lista de </w:t>
+            </w:r>
+            <w:proofErr w:type="spellStart"/>
+            <w:r>
+              <w:rPr>
+                <w:rFonts w:ascii="Arial" w:eastAsia="Arial" w:hAnsi="Arial" w:cs="Arial"/>
+                <w:i w:val="0"/>
+                <w:iCs w:val="0"/>
+                <w:color w:val="4F17A8"/>
+                <w:sz w:val="44"/>
+                <w:szCs w:val="44"/>
+              </w:rPr>
+              <w:t>interesados</w:t>
+            </w:r>
+            <w:proofErr w:type="spellEnd"/>
           </w:p>
         </w:tc>
       </w:tr>
@@ -2771,6 +4638,7 @@
                 <w:szCs w:val="32"/>
               </w:rPr>
             </w:pPr>
+            <w:proofErr w:type="spellStart"/>
             <w:r>
               <w:rPr>
                 <w:rFonts w:ascii="Arial" w:eastAsia="Arial" w:hAnsi="Arial" w:cs="Arial"/>
@@ -2781,6 +4649,7 @@
               </w:rPr>
               <w:t>Nombre</w:t>
             </w:r>
+            <w:proofErr w:type="spellEnd"/>
           </w:p>
         </w:tc>
         <w:tc>
@@ -2804,6 +4673,7 @@
                 <w:szCs w:val="32"/>
               </w:rPr>
             </w:pPr>
+            <w:proofErr w:type="spellStart"/>
             <w:r>
               <w:rPr>
                 <w:rFonts w:ascii="Arial" w:eastAsia="Arial" w:hAnsi="Arial" w:cs="Arial"/>
@@ -2812,6 +4682,7 @@
               </w:rPr>
               <w:t>Rol</w:t>
             </w:r>
+            <w:proofErr w:type="spellEnd"/>
           </w:p>
         </w:tc>
         <w:tc>
@@ -2834,6 +4705,7 @@
                 <w:szCs w:val="32"/>
               </w:rPr>
             </w:pPr>
+            <w:proofErr w:type="spellStart"/>
             <w:r>
               <w:rPr>
                 <w:rFonts w:ascii="Arial" w:eastAsia="Arial" w:hAnsi="Arial" w:cs="Arial"/>
@@ -2842,6 +4714,7 @@
               </w:rPr>
               <w:t>Responsabilidad</w:t>
             </w:r>
+            <w:proofErr w:type="spellEnd"/>
           </w:p>
         </w:tc>
       </w:tr>
@@ -2926,13 +4799,47 @@
                 <w:szCs w:val="28"/>
               </w:rPr>
             </w:pPr>
+            <w:proofErr w:type="spellStart"/>
             <w:r>
               <w:rPr>
                 <w:sz w:val="28"/>
                 <w:szCs w:val="28"/>
               </w:rPr>
-              <w:t>Definir visión y requerimientos</w:t>
-            </w:r>
+              <w:t>Definir</w:t>
+            </w:r>
+            <w:proofErr w:type="spellEnd"/>
+            <w:r>
+              <w:rPr>
+                <w:sz w:val="28"/>
+                <w:szCs w:val="28"/>
+              </w:rPr>
+              <w:t xml:space="preserve"> </w:t>
+            </w:r>
+            <w:proofErr w:type="spellStart"/>
+            <w:r>
+              <w:rPr>
+                <w:sz w:val="28"/>
+                <w:szCs w:val="28"/>
+              </w:rPr>
+              <w:t>visión</w:t>
+            </w:r>
+            <w:proofErr w:type="spellEnd"/>
+            <w:r>
+              <w:rPr>
+                <w:sz w:val="28"/>
+                <w:szCs w:val="28"/>
+              </w:rPr>
+              <w:t xml:space="preserve"> y </w:t>
+            </w:r>
+            <w:proofErr w:type="spellStart"/>
+            <w:r>
+              <w:rPr>
+                <w:sz w:val="28"/>
+                <w:szCs w:val="28"/>
+              </w:rPr>
+              <w:t>requerimientos</w:t>
+            </w:r>
+            <w:proofErr w:type="spellEnd"/>
           </w:p>
         </w:tc>
       </w:tr>
@@ -3015,13 +4922,47 @@
                 <w:szCs w:val="28"/>
               </w:rPr>
             </w:pPr>
+            <w:proofErr w:type="spellStart"/>
             <w:r>
               <w:rPr>
                 <w:sz w:val="28"/>
                 <w:szCs w:val="28"/>
               </w:rPr>
-              <w:t>Gestión ágil del proyecto</w:t>
-            </w:r>
+              <w:t>Gestión</w:t>
+            </w:r>
+            <w:proofErr w:type="spellEnd"/>
+            <w:r>
+              <w:rPr>
+                <w:sz w:val="28"/>
+                <w:szCs w:val="28"/>
+              </w:rPr>
+              <w:t xml:space="preserve"> </w:t>
+            </w:r>
+            <w:proofErr w:type="spellStart"/>
+            <w:r>
+              <w:rPr>
+                <w:sz w:val="28"/>
+                <w:szCs w:val="28"/>
+              </w:rPr>
+              <w:t>ágil</w:t>
+            </w:r>
+            <w:proofErr w:type="spellEnd"/>
+            <w:r>
+              <w:rPr>
+                <w:sz w:val="28"/>
+                <w:szCs w:val="28"/>
+              </w:rPr>
+              <w:t xml:space="preserve"> del </w:t>
+            </w:r>
+            <w:proofErr w:type="spellStart"/>
+            <w:r>
+              <w:rPr>
+                <w:sz w:val="28"/>
+                <w:szCs w:val="28"/>
+              </w:rPr>
+              <w:t>proyecto</w:t>
+            </w:r>
+            <w:proofErr w:type="spellEnd"/>
           </w:p>
         </w:tc>
       </w:tr>
@@ -3052,7 +4993,23 @@
                 <w:sz w:val="28"/>
                 <w:szCs w:val="28"/>
               </w:rPr>
-              <w:t>Guzman Choque Fabian</w:t>
+              <w:t xml:space="preserve">Guzman </w:t>
+            </w:r>
+            <w:proofErr w:type="spellStart"/>
+            <w:r>
+              <w:rPr>
+                <w:sz w:val="28"/>
+                <w:szCs w:val="28"/>
+              </w:rPr>
+              <w:t>Choque</w:t>
+            </w:r>
+            <w:proofErr w:type="spellEnd"/>
+            <w:r>
+              <w:rPr>
+                <w:sz w:val="28"/>
+                <w:szCs w:val="28"/>
+              </w:rPr>
+              <w:t xml:space="preserve"> Fabian</w:t>
             </w:r>
           </w:p>
         </w:tc>
@@ -3107,8 +5064,17 @@
                 <w:sz w:val="28"/>
                 <w:szCs w:val="28"/>
               </w:rPr>
-              <w:t>Desarrollo de interfaz</w:t>
-            </w:r>
+              <w:t xml:space="preserve">Desarrollo de </w:t>
+            </w:r>
+            <w:proofErr w:type="spellStart"/>
+            <w:r>
+              <w:rPr>
+                <w:sz w:val="28"/>
+                <w:szCs w:val="28"/>
+              </w:rPr>
+              <w:t>interfaz</w:t>
+            </w:r>
+            <w:proofErr w:type="spellEnd"/>
           </w:p>
         </w:tc>
       </w:tr>
@@ -3136,12 +5102,21 @@
                 <w:szCs w:val="28"/>
               </w:rPr>
             </w:pPr>
+            <w:proofErr w:type="spellStart"/>
             <w:r>
               <w:rPr>
                 <w:sz w:val="28"/>
                 <w:szCs w:val="28"/>
               </w:rPr>
-              <w:t>Quispe Campos Luis Enrique</w:t>
+              <w:t>Quispe</w:t>
+            </w:r>
+            <w:proofErr w:type="spellEnd"/>
+            <w:r>
+              <w:rPr>
+                <w:sz w:val="28"/>
+                <w:szCs w:val="28"/>
+              </w:rPr>
+              <w:t xml:space="preserve"> Campos Luis Enrique</w:t>
             </w:r>
           </w:p>
         </w:tc>
@@ -3258,8 +5233,17 @@
                 <w:sz w:val="28"/>
                 <w:szCs w:val="28"/>
               </w:rPr>
-              <w:t>Calidad/Documentación</w:t>
-            </w:r>
+              <w:t>Calidad/</w:t>
+            </w:r>
+            <w:proofErr w:type="spellStart"/>
+            <w:r>
+              <w:rPr>
+                <w:sz w:val="28"/>
+                <w:szCs w:val="28"/>
+              </w:rPr>
+              <w:t>Documentación</w:t>
+            </w:r>
+            <w:proofErr w:type="spellEnd"/>
           </w:p>
         </w:tc>
         <w:tc>
@@ -3370,7 +5354,15 @@
                                 <w:color w:val="FFFFFF"/>
                                 <w:sz w:val="24"/>
                               </w:rPr>
-                              <w:t>Name the milestone and assign a date. Then, describe the milestone in more detail, so anyone who views this document can understand what the project is all about.</w:t>
+                              <w:t xml:space="preserve">Name the milestone and assign a date. Then, describe the milestone in more detail, so anyone who views this </w:t>
+                            </w:r>
+                            <w:r>
+                              <w:rPr>
+                                <w:rFonts w:ascii="Arial" w:eastAsia="Arial" w:hAnsi="Arial" w:cs="Arial"/>
+                                <w:color w:val="FFFFFF"/>
+                                <w:sz w:val="24"/>
+                              </w:rPr>
+                              <w:t>document can understand what the project is all about.</w:t>
                             </w:r>
                           </w:p>
                         </w:txbxContent>
@@ -3386,7 +5378,7 @@
           </mc:Choice>
           <mc:Fallback>
             <w:pict>
-              <v:rect w14:anchorId="2AD90028" id="Rectángulo 220" o:spid="_x0000_s1030" style="position:absolute;margin-left:1.15pt;margin-top:22.5pt;width:537.75pt;height:77.7pt;z-index:251660288;visibility:visible;mso-wrap-style:square;mso-wrap-distance-left:9pt;mso-wrap-distance-top:3.6pt;mso-wrap-distance-right:9pt;mso-wrap-distance-bottom:3.6pt;mso-position-horizontal:absolute;mso-position-horizontal-relative:text;mso-position-vertical:absolute;mso-position-vertical-relative:text;v-text-anchor:top" o:gfxdata="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" fillcolor="#59d4eb" stroked="f">
+              <v:rect w14:anchorId="2AD90028" id="Rectángulo 220" o:spid="_x0000_s1030" style="position:absolute;margin-left:1.15pt;margin-top:22.5pt;width:537.75pt;height:77.7pt;z-index:251660288;visibility:visible;mso-wrap-style:square;mso-wrap-distance-left:9pt;mso-wrap-distance-top:3.6pt;mso-wrap-distance-right:9pt;mso-wrap-distance-bottom:3.6pt;mso-position-horizontal:absolute;mso-position-horizontal-relative:text;mso-position-vertical:absolute;mso-position-vertical-relative:text;v-text-anchor:top" o:gfxdata="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" fillcolor="#59d4eb" stroked="f">
                 <v:textbox inset="2.53958mm,1.2694mm,2.53958mm,1.2694mm">
                   <w:txbxContent>
                     <w:p>
@@ -3414,7 +5406,15 @@
                           <w:color w:val="FFFFFF"/>
                           <w:sz w:val="24"/>
                         </w:rPr>
-                        <w:t>Name the milestone and assign a date. Then, describe the milestone in more detail, so anyone who views this document can understand what the project is all about.</w:t>
+                        <w:t xml:space="preserve">Name the milestone and assign a date. Then, describe the milestone in more detail, so anyone who views this </w:t>
+                      </w:r>
+                      <w:r>
+                        <w:rPr>
+                          <w:rFonts w:ascii="Arial" w:eastAsia="Arial" w:hAnsi="Arial" w:cs="Arial"/>
+                          <w:color w:val="FFFFFF"/>
+                          <w:sz w:val="24"/>
+                        </w:rPr>
+                        <w:t>document can understand what the project is all about.</w:t>
                       </w:r>
                     </w:p>
                   </w:txbxContent>
@@ -3570,7 +5570,7 @@
                 </mc:Choice>
                 <mc:Fallback>
                   <w:pict>
-                    <v:shape w14:anchorId="13176C35" id="Forma libre: forma 222" o:spid="_x0000_s1031" style="width:27.25pt;height:24.4pt;visibility:visible;mso-wrap-style:square;mso-left-percent:-10001;mso-top-percent:-10001;mso-position-horizontal:absolute;mso-position-horizontal-relative:char;mso-position-vertical:absolute;mso-position-vertical-relative:line;mso-left-percent:-10001;mso-top-percent:-10001;v-text-anchor:middle" coordsize="271148,228600" o:spt="100" o:gfxdata="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" adj="-11796480,,5400" path="m,l175897,v25453,3260,42922,10367,58373,25274c249721,40181,262883,55556,268605,89444v5722,33888,,92771,,139156l,228600,,xe" fillcolor="#4f17a8" stroked="f">
+                    <v:shape w14:anchorId="13176C35" id="Forma libre: forma 222" o:spid="_x0000_s1031" style="width:27.25pt;height:24.4pt;visibility:visible;mso-wrap-style:square;mso-left-percent:-10001;mso-top-percent:-10001;mso-position-horizontal:absolute;mso-position-horizontal-relative:char;mso-position-vertical:absolute;mso-position-vertical-relative:line;mso-left-percent:-10001;mso-top-percent:-10001;v-text-anchor:middle" coordsize="271148,228600" o:spt="100" o:gfxdata="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" adj="-11796480,,5400" path="m,l175897,v25453,3260,42922,10367,58373,25274c249721,40181,262883,55556,268605,89444v5722,33888,,92771,,139156l,228600,,xe" fillcolor="#4f17a8" stroked="f">
                       <v:stroke joinstyle="miter"/>
                       <v:formulas/>
                       <v:path arrowok="t" o:extrusionok="f" o:connecttype="custom" textboxrect="0,0,271148,228600"/>
@@ -3702,6 +5702,7 @@
                 <w:szCs w:val="24"/>
               </w:rPr>
             </w:pPr>
+            <w:proofErr w:type="spellStart"/>
             <w:r>
               <w:rPr>
                 <w:rFonts w:ascii="Arial" w:eastAsia="Arial" w:hAnsi="Arial" w:cs="Arial"/>
@@ -3712,8 +5713,9 @@
                 <w:sz w:val="24"/>
                 <w:szCs w:val="24"/>
               </w:rPr>
-              <w:t xml:space="preserve">Fecha: </w:t>
-            </w:r>
+              <w:t>Fecha</w:t>
+            </w:r>
+            <w:proofErr w:type="spellEnd"/>
             <w:r>
               <w:rPr>
                 <w:rFonts w:ascii="Arial" w:eastAsia="Arial" w:hAnsi="Arial" w:cs="Arial"/>
@@ -3724,7 +5726,45 @@
                 <w:sz w:val="24"/>
                 <w:szCs w:val="24"/>
               </w:rPr>
-              <w:t>26 de marzo de 2026</w:t>
+              <w:t xml:space="preserve">: </w:t>
+            </w:r>
+            <w:r>
+              <w:rPr>
+                <w:rFonts w:ascii="Arial" w:eastAsia="Arial" w:hAnsi="Arial" w:cs="Arial"/>
+                <w:b/>
+                <w:bCs/>
+                <w:i w:val="0"/>
+                <w:iCs w:val="0"/>
+                <w:sz w:val="24"/>
+                <w:szCs w:val="24"/>
+              </w:rPr>
+              <w:t xml:space="preserve">26 de </w:t>
+            </w:r>
+            <w:proofErr w:type="spellStart"/>
+            <w:r>
+              <w:rPr>
+                <w:rFonts w:ascii="Arial" w:eastAsia="Arial" w:hAnsi="Arial" w:cs="Arial"/>
+                <w:b/>
+                <w:bCs/>
+                <w:i w:val="0"/>
+                <w:iCs w:val="0"/>
+                <w:sz w:val="24"/>
+                <w:szCs w:val="24"/>
+              </w:rPr>
+              <w:t>marzo</w:t>
+            </w:r>
+            <w:proofErr w:type="spellEnd"/>
+            <w:r>
+              <w:rPr>
+                <w:rFonts w:ascii="Arial" w:eastAsia="Arial" w:hAnsi="Arial" w:cs="Arial"/>
+                <w:b/>
+                <w:bCs/>
+                <w:i w:val="0"/>
+                <w:iCs w:val="0"/>
+                <w:sz w:val="24"/>
+                <w:szCs w:val="24"/>
+              </w:rPr>
+              <w:t xml:space="preserve"> de 2026</w:t>
             </w:r>
           </w:p>
           <w:p>
@@ -3844,6 +5884,7 @@
                 <w:szCs w:val="24"/>
               </w:rPr>
             </w:pPr>
+            <w:proofErr w:type="spellStart"/>
             <w:r>
               <w:rPr>
                 <w:rFonts w:ascii="Arial" w:eastAsia="Arial" w:hAnsi="Arial" w:cs="Arial"/>
@@ -3854,8 +5895,9 @@
                 <w:sz w:val="24"/>
                 <w:szCs w:val="24"/>
               </w:rPr>
-              <w:t xml:space="preserve">Fecha: </w:t>
-            </w:r>
+              <w:t>Fecha</w:t>
+            </w:r>
+            <w:proofErr w:type="spellEnd"/>
             <w:r>
               <w:rPr>
                 <w:rFonts w:ascii="Arial" w:eastAsia="Arial" w:hAnsi="Arial" w:cs="Arial"/>
@@ -3866,7 +5908,45 @@
                 <w:sz w:val="24"/>
                 <w:szCs w:val="24"/>
               </w:rPr>
-              <w:t>16 de abril de 2026</w:t>
+              <w:t xml:space="preserve">: </w:t>
+            </w:r>
+            <w:r>
+              <w:rPr>
+                <w:rFonts w:ascii="Arial" w:eastAsia="Arial" w:hAnsi="Arial" w:cs="Arial"/>
+                <w:b/>
+                <w:bCs/>
+                <w:i w:val="0"/>
+                <w:iCs w:val="0"/>
+                <w:sz w:val="24"/>
+                <w:szCs w:val="24"/>
+              </w:rPr>
+              <w:t xml:space="preserve">16 de </w:t>
+            </w:r>
+            <w:proofErr w:type="spellStart"/>
+            <w:r>
+              <w:rPr>
+                <w:rFonts w:ascii="Arial" w:eastAsia="Arial" w:hAnsi="Arial" w:cs="Arial"/>
+                <w:b/>
+                <w:bCs/>
+                <w:i w:val="0"/>
+                <w:iCs w:val="0"/>
+                <w:sz w:val="24"/>
+                <w:szCs w:val="24"/>
+              </w:rPr>
+              <w:t>abril</w:t>
+            </w:r>
+            <w:proofErr w:type="spellEnd"/>
+            <w:r>
+              <w:rPr>
+                <w:rFonts w:ascii="Arial" w:eastAsia="Arial" w:hAnsi="Arial" w:cs="Arial"/>
+                <w:b/>
+                <w:bCs/>
+                <w:i w:val="0"/>
+                <w:iCs w:val="0"/>
+                <w:sz w:val="24"/>
+                <w:szCs w:val="24"/>
+              </w:rPr>
+              <w:t xml:space="preserve"> de 2026</w:t>
             </w:r>
           </w:p>
         </w:tc>
@@ -3969,6 +6049,7 @@
                 <w:szCs w:val="24"/>
               </w:rPr>
             </w:pPr>
+            <w:proofErr w:type="spellStart"/>
             <w:r>
               <w:rPr>
                 <w:rFonts w:ascii="Arial" w:eastAsia="Arial" w:hAnsi="Arial" w:cs="Arial"/>
@@ -3979,7 +6060,20 @@
                 <w:sz w:val="24"/>
                 <w:szCs w:val="24"/>
               </w:rPr>
-              <w:t xml:space="preserve">Fecha: </w:t>
+              <w:t>Fecha</w:t>
+            </w:r>
+            <w:proofErr w:type="spellEnd"/>
+            <w:r>
+              <w:rPr>
+                <w:rFonts w:ascii="Arial" w:eastAsia="Arial" w:hAnsi="Arial" w:cs="Arial"/>
+                <w:b/>
+                <w:bCs/>
+                <w:i w:val="0"/>
+                <w:iCs w:val="0"/>
+                <w:sz w:val="24"/>
+                <w:szCs w:val="24"/>
+              </w:rPr>
+              <w:t xml:space="preserve">: </w:t>
             </w:r>
             <w:r>
               <w:rPr>
@@ -4556,7 +6650,7 @@
           </mc:Choice>
           <mc:Fallback>
             <w:pict>
-              <v:rect w14:anchorId="616791D7" id="Rectángulo 218" o:spid="_x0000_s1032" style="position:absolute;margin-left:-3.75pt;margin-top:34.85pt;width:537.75pt;height:77.7pt;z-index:251661312;visibility:visible;mso-wrap-style:square;mso-wrap-distance-left:9pt;mso-wrap-distance-top:3.6pt;mso-wrap-distance-right:9pt;mso-wrap-distance-bottom:3.6pt;mso-position-horizontal:absolute;mso-position-horizontal-relative:text;mso-position-vertical:absolute;mso-position-vertical-relative:text;v-text-anchor:top" o:gfxdata="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" fillcolor="#59d4eb" stroked="f">
+              <v:rect w14:anchorId="616791D7" id="Rectángulo 218" o:spid="_x0000_s1032" style="position:absolute;margin-left:-3.75pt;margin-top:34.85pt;width:537.75pt;height:77.7pt;z-index:251661312;visibility:visible;mso-wrap-style:square;mso-wrap-distance-left:9pt;mso-wrap-distance-top:3.6pt;mso-wrap-distance-right:9pt;mso-wrap-distance-bottom:3.6pt;mso-position-horizontal:absolute;mso-position-horizontal-relative:text;mso-position-vertical:absolute;mso-position-vertical-relative:text;v-text-anchor:top" o:gfxdata="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" fillcolor="#59d4eb" stroked="f">
                 <v:textbox inset="2.53958mm,1.2694mm,2.53958mm,1.2694mm">
                   <w:txbxContent>
                     <w:p>
@@ -4746,7 +6840,7 @@
                 </mc:Choice>
                 <mc:Fallback>
                   <w:pict>
-                    <v:shape w14:anchorId="4E063276" id="Forma libre: forma 223" o:spid="_x0000_s1033" style="width:27.25pt;height:24.4pt;visibility:visible;mso-wrap-style:square;mso-left-percent:-10001;mso-top-percent:-10001;mso-position-horizontal:absolute;mso-position-horizontal-relative:char;mso-position-vertical:absolute;mso-position-vertical-relative:line;mso-left-percent:-10001;mso-top-percent:-10001;v-text-anchor:middle" coordsize="271148,228600" o:spt="100" o:gfxdata="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" adj="-11796480,,5400" path="m,l175897,v25453,3260,42922,10367,58373,25274c249721,40181,262883,55556,268605,89444v5722,33888,,92771,,139156l,228600,,xe" fillcolor="#4f17a8" stroked="f">
+                    <v:shape w14:anchorId="4E063276" id="Forma libre: forma 223" o:spid="_x0000_s1033" style="width:27.25pt;height:24.4pt;visibility:visible;mso-wrap-style:square;mso-left-percent:-10001;mso-top-percent:-10001;mso-position-horizontal:absolute;mso-position-horizontal-relative:char;mso-position-vertical:absolute;mso-position-vertical-relative:line;mso-left-percent:-10001;mso-top-percent:-10001;v-text-anchor:middle" coordsize="271148,228600" o:spt="100" o:gfxdata="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" adj="-11796480,,5400" path="m,l175897,v25453,3260,42922,10367,58373,25274c249721,40181,262883,55556,268605,89444v5722,33888,,92771,,139156l,228600,,xe" fillcolor="#4f17a8" stroked="f">
                       <v:stroke joinstyle="miter"/>
                       <v:formulas/>
                       <v:path arrowok="t" o:extrusionok="f" o:connecttype="custom" textboxrect="0,0,271148,228600"/>
@@ -4795,6 +6889,7 @@
                 <w:szCs w:val="44"/>
               </w:rPr>
             </w:pPr>
+            <w:proofErr w:type="spellStart"/>
             <w:r>
               <w:rPr>
                 <w:rFonts w:ascii="Arial" w:eastAsia="Arial" w:hAnsi="Arial" w:cs="Arial"/>
@@ -4804,8 +6899,33 @@
                 <w:sz w:val="44"/>
                 <w:szCs w:val="44"/>
               </w:rPr>
-              <w:t>Consideraciones de proyecto</w:t>
-            </w:r>
+              <w:t>Consideraciones</w:t>
+            </w:r>
+            <w:proofErr w:type="spellEnd"/>
+            <w:r>
+              <w:rPr>
+                <w:rFonts w:ascii="Arial" w:eastAsia="Arial" w:hAnsi="Arial" w:cs="Arial"/>
+                <w:i w:val="0"/>
+                <w:iCs w:val="0"/>
+                <w:color w:val="4F17A8"/>
+                <w:sz w:val="44"/>
+                <w:szCs w:val="44"/>
+              </w:rPr>
+              <w:t xml:space="preserve"> de </w:t>
+            </w:r>
+            <w:proofErr w:type="spellStart"/>
+            <w:r>
+              <w:rPr>
+                <w:rFonts w:ascii="Arial" w:eastAsia="Arial" w:hAnsi="Arial" w:cs="Arial"/>
+                <w:i w:val="0"/>
+                <w:iCs w:val="0"/>
+                <w:color w:val="4F17A8"/>
+                <w:sz w:val="44"/>
+                <w:szCs w:val="44"/>
+              </w:rPr>
+              <w:t>proyecto</w:t>
+            </w:r>
+            <w:proofErr w:type="spellEnd"/>
           </w:p>
         </w:tc>
       </w:tr>
@@ -4836,6 +6956,7 @@
                 <w:szCs w:val="24"/>
               </w:rPr>
             </w:pPr>
+            <w:proofErr w:type="spellStart"/>
             <w:r>
               <w:rPr>
                 <w:rFonts w:ascii="Arial" w:eastAsia="Arial" w:hAnsi="Arial" w:cs="Arial"/>
@@ -4844,7 +6965,40 @@
                 <w:sz w:val="32"/>
                 <w:szCs w:val="32"/>
               </w:rPr>
-              <w:t>Riesgos de alto nivel:</w:t>
+              <w:t>Riesgos</w:t>
+            </w:r>
+            <w:proofErr w:type="spellEnd"/>
+            <w:r>
+              <w:rPr>
+                <w:rFonts w:ascii="Arial" w:eastAsia="Arial" w:hAnsi="Arial" w:cs="Arial"/>
+                <w:i w:val="0"/>
+                <w:iCs w:val="0"/>
+                <w:sz w:val="32"/>
+                <w:szCs w:val="32"/>
+              </w:rPr>
+              <w:t xml:space="preserve"> de alto </w:t>
+            </w:r>
+            <w:proofErr w:type="spellStart"/>
+            <w:r>
+              <w:rPr>
+                <w:rFonts w:ascii="Arial" w:eastAsia="Arial" w:hAnsi="Arial" w:cs="Arial"/>
+                <w:i w:val="0"/>
+                <w:iCs w:val="0"/>
+                <w:sz w:val="32"/>
+                <w:szCs w:val="32"/>
+              </w:rPr>
+              <w:t>nivel</w:t>
+            </w:r>
+            <w:proofErr w:type="spellEnd"/>
+            <w:r>
+              <w:rPr>
+                <w:rFonts w:ascii="Arial" w:eastAsia="Arial" w:hAnsi="Arial" w:cs="Arial"/>
+                <w:i w:val="0"/>
+                <w:iCs w:val="0"/>
+                <w:sz w:val="32"/>
+                <w:szCs w:val="32"/>
+              </w:rPr>
+              <w:t>:</w:t>
             </w:r>
           </w:p>
         </w:tc>
@@ -4912,16 +7066,77 @@
                 <w:lang w:val="en-US"/>
               </w:rPr>
             </w:pPr>
-            <w:r>
-              <w:rPr>
-                <w:rFonts w:ascii="Arial" w:eastAsia="Arial" w:hAnsi="Arial" w:cs="Arial"/>
-                <w:i w:val="0"/>
-                <w:iCs w:val="0"/>
-                <w:sz w:val="24"/>
-                <w:szCs w:val="24"/>
-                <w:lang w:val="en-US"/>
-              </w:rPr>
-              <w:t xml:space="preserve">Limitaciones de capacidad computacional </w:t>
+            <w:proofErr w:type="spellStart"/>
+            <w:r>
+              <w:rPr>
+                <w:rFonts w:ascii="Arial" w:eastAsia="Arial" w:hAnsi="Arial" w:cs="Arial"/>
+                <w:i w:val="0"/>
+                <w:iCs w:val="0"/>
+                <w:sz w:val="24"/>
+                <w:szCs w:val="24"/>
+                <w:lang w:val="en-US"/>
+              </w:rPr>
+              <w:t>Limitaciones</w:t>
+            </w:r>
+            <w:proofErr w:type="spellEnd"/>
+            <w:r>
+              <w:rPr>
+                <w:rFonts w:ascii="Arial" w:eastAsia="Arial" w:hAnsi="Arial" w:cs="Arial"/>
+                <w:i w:val="0"/>
+                <w:iCs w:val="0"/>
+                <w:sz w:val="24"/>
+                <w:szCs w:val="24"/>
+                <w:lang w:val="en-US"/>
+              </w:rPr>
+              <w:t xml:space="preserve"> de </w:t>
+            </w:r>
+            <w:proofErr w:type="spellStart"/>
+            <w:r>
+              <w:rPr>
+                <w:rFonts w:ascii="Arial" w:eastAsia="Arial" w:hAnsi="Arial" w:cs="Arial"/>
+                <w:i w:val="0"/>
+                <w:iCs w:val="0"/>
+                <w:sz w:val="24"/>
+                <w:szCs w:val="24"/>
+                <w:lang w:val="en-US"/>
+              </w:rPr>
+              <w:t>capacidad</w:t>
+            </w:r>
+            <w:proofErr w:type="spellEnd"/>
+            <w:r>
+              <w:rPr>
+                <w:rFonts w:ascii="Arial" w:eastAsia="Arial" w:hAnsi="Arial" w:cs="Arial"/>
+                <w:i w:val="0"/>
+                <w:iCs w:val="0"/>
+                <w:sz w:val="24"/>
+                <w:szCs w:val="24"/>
+                <w:lang w:val="en-US"/>
+              </w:rPr>
+              <w:t xml:space="preserve"> </w:t>
+            </w:r>
+            <w:proofErr w:type="spellStart"/>
+            <w:r>
+              <w:rPr>
+                <w:rFonts w:ascii="Arial" w:eastAsia="Arial" w:hAnsi="Arial" w:cs="Arial"/>
+                <w:i w:val="0"/>
+                <w:iCs w:val="0"/>
+                <w:sz w:val="24"/>
+                <w:szCs w:val="24"/>
+                <w:lang w:val="en-US"/>
+              </w:rPr>
+              <w:t>computacional</w:t>
+            </w:r>
+            <w:proofErr w:type="spellEnd"/>
+            <w:r>
+              <w:rPr>
+                <w:rFonts w:ascii="Arial" w:eastAsia="Arial" w:hAnsi="Arial" w:cs="Arial"/>
+                <w:i w:val="0"/>
+                <w:iCs w:val="0"/>
+                <w:sz w:val="24"/>
+                <w:szCs w:val="24"/>
+                <w:lang w:val="en-US"/>
+              </w:rPr>
+              <w:t xml:space="preserve"> </w:t>
             </w:r>
           </w:p>
           <w:p>
@@ -5040,6 +7255,7 @@
                 <w:szCs w:val="24"/>
               </w:rPr>
             </w:pPr>
+            <w:proofErr w:type="spellStart"/>
             <w:r>
               <w:rPr>
                 <w:rFonts w:ascii="Arial" w:eastAsia="Arial" w:hAnsi="Arial" w:cs="Arial"/>
@@ -5048,7 +7264,40 @@
                 <w:sz w:val="32"/>
                 <w:szCs w:val="32"/>
               </w:rPr>
-              <w:t>Criterio de aceptación:</w:t>
+              <w:t>Criterio</w:t>
+            </w:r>
+            <w:proofErr w:type="spellEnd"/>
+            <w:r>
+              <w:rPr>
+                <w:rFonts w:ascii="Arial" w:eastAsia="Arial" w:hAnsi="Arial" w:cs="Arial"/>
+                <w:i w:val="0"/>
+                <w:iCs w:val="0"/>
+                <w:sz w:val="32"/>
+                <w:szCs w:val="32"/>
+              </w:rPr>
+              <w:t xml:space="preserve"> de </w:t>
+            </w:r>
+            <w:proofErr w:type="spellStart"/>
+            <w:r>
+              <w:rPr>
+                <w:rFonts w:ascii="Arial" w:eastAsia="Arial" w:hAnsi="Arial" w:cs="Arial"/>
+                <w:i w:val="0"/>
+                <w:iCs w:val="0"/>
+                <w:sz w:val="32"/>
+                <w:szCs w:val="32"/>
+              </w:rPr>
+              <w:t>aceptación</w:t>
+            </w:r>
+            <w:proofErr w:type="spellEnd"/>
+            <w:r>
+              <w:rPr>
+                <w:rFonts w:ascii="Arial" w:eastAsia="Arial" w:hAnsi="Arial" w:cs="Arial"/>
+                <w:i w:val="0"/>
+                <w:iCs w:val="0"/>
+                <w:sz w:val="32"/>
+                <w:szCs w:val="32"/>
+              </w:rPr>
+              <w:t>:</w:t>
             </w:r>
           </w:p>
         </w:tc>
@@ -5267,16 +7516,6 @@
               <w:lastRenderedPageBreak/>
               <w:t>El modelo refleja correctamente el problema real</w:t>
             </w:r>
-          </w:p>
-          <w:p>
-            <w:pPr>
-              <w:rPr>
-                <w:rFonts w:ascii="Arial" w:eastAsia="Arial" w:hAnsi="Arial" w:cs="Arial"/>
-                <w:sz w:val="24"/>
-                <w:szCs w:val="24"/>
-                <w:lang w:val="es-PE"/>
-              </w:rPr>
-            </w:pPr>
           </w:p>
         </w:tc>
       </w:tr>
@@ -5480,8 +7719,8 @@
                 <w:szCs w:val="24"/>
               </w:rPr>
             </w:pPr>
-            <w:bookmarkStart w:id="2" w:name="_heading=h.umu8k36uxkun" w:colFirst="0" w:colLast="0"/>
-            <w:bookmarkEnd w:id="2"/>
+            <w:bookmarkStart w:id="3" w:name="_heading=h.umu8k36uxkun" w:colFirst="0" w:colLast="0"/>
+            <w:bookmarkEnd w:id="3"/>
             <w:r>
               <w:rPr>
                 <w:rFonts w:ascii="Arial" w:eastAsia="Arial" w:hAnsi="Arial" w:cs="Arial"/>
@@ -5537,7 +7776,119 @@
                 <w:szCs w:val="24"/>
                 <w:lang w:val="es-PE"/>
               </w:rPr>
-              <w:t xml:space="preserve">Tiempo limitado (hasta el 25 de junio de 2026) </w:t>
+              <w:t>Disponibilidad de docentes, alumnos e infraestructura.</w:t>
+            </w:r>
+          </w:p>
+          <w:p>
+            <w:pPr>
+              <w:pStyle w:val="Prrafodelista"/>
+              <w:numPr>
+                <w:ilvl w:val="0"/>
+                <w:numId w:val="24"/>
+              </w:numPr>
+              <w:spacing w:before="240" w:after="240"/>
+              <w:jc w:val="left"/>
+              <w:rPr>
+                <w:rFonts w:ascii="Arial" w:eastAsia="Arial" w:hAnsi="Arial" w:cs="Arial"/>
+                <w:i w:val="0"/>
+                <w:iCs w:val="0"/>
+                <w:sz w:val="24"/>
+                <w:szCs w:val="24"/>
+                <w:lang w:val="es-PE"/>
+              </w:rPr>
+            </w:pPr>
+            <w:r>
+              <w:rPr>
+                <w:rFonts w:ascii="Arial" w:eastAsia="Arial" w:hAnsi="Arial" w:cs="Arial"/>
+                <w:i w:val="0"/>
+                <w:iCs w:val="0"/>
+                <w:sz w:val="24"/>
+                <w:szCs w:val="24"/>
+                <w:lang w:val="es-PE"/>
+              </w:rPr>
+              <w:t>Límite de créditos (20–22)</w:t>
+            </w:r>
+          </w:p>
+          <w:p>
+            <w:pPr>
+              <w:pStyle w:val="Prrafodelista"/>
+              <w:numPr>
+                <w:ilvl w:val="0"/>
+                <w:numId w:val="24"/>
+              </w:numPr>
+              <w:spacing w:before="240" w:after="240"/>
+              <w:jc w:val="left"/>
+              <w:rPr>
+                <w:rFonts w:ascii="Arial" w:eastAsia="Arial" w:hAnsi="Arial" w:cs="Arial"/>
+                <w:i w:val="0"/>
+                <w:iCs w:val="0"/>
+                <w:sz w:val="24"/>
+                <w:szCs w:val="24"/>
+                <w:lang w:val="es-PE"/>
+              </w:rPr>
+            </w:pPr>
+            <w:r>
+              <w:rPr>
+                <w:rFonts w:ascii="Arial" w:eastAsia="Arial" w:hAnsi="Arial" w:cs="Arial"/>
+                <w:i w:val="0"/>
+                <w:iCs w:val="0"/>
+                <w:sz w:val="24"/>
+                <w:szCs w:val="24"/>
+                <w:lang w:val="es-PE"/>
+              </w:rPr>
+              <w:t>No solapamiento de horarios</w:t>
+            </w:r>
+          </w:p>
+          <w:p>
+            <w:pPr>
+              <w:pStyle w:val="Prrafodelista"/>
+              <w:numPr>
+                <w:ilvl w:val="0"/>
+                <w:numId w:val="24"/>
+              </w:numPr>
+              <w:spacing w:before="240" w:after="240"/>
+              <w:jc w:val="left"/>
+              <w:rPr>
+                <w:rFonts w:ascii="Arial" w:eastAsia="Arial" w:hAnsi="Arial" w:cs="Arial"/>
+                <w:i w:val="0"/>
+                <w:iCs w:val="0"/>
+                <w:sz w:val="24"/>
+                <w:szCs w:val="24"/>
+                <w:lang w:val="es-PE"/>
+              </w:rPr>
+            </w:pPr>
+            <w:r>
+              <w:rPr>
+                <w:rFonts w:ascii="Arial" w:eastAsia="Arial" w:hAnsi="Arial" w:cs="Arial"/>
+                <w:i w:val="0"/>
+                <w:iCs w:val="0"/>
+                <w:sz w:val="24"/>
+                <w:szCs w:val="24"/>
+                <w:lang w:val="es-PE"/>
+              </w:rPr>
+              <w:t xml:space="preserve">Tiempo limitado (hasta el </w:t>
+            </w:r>
+            <w:r>
+              <w:rPr>
+                <w:rFonts w:ascii="Arial" w:eastAsia="Arial" w:hAnsi="Arial" w:cs="Arial"/>
+                <w:i w:val="0"/>
+                <w:iCs w:val="0"/>
+                <w:sz w:val="24"/>
+                <w:szCs w:val="24"/>
+                <w:lang w:val="es-PE"/>
+              </w:rPr>
+              <w:t>18</w:t>
+            </w:r>
+            <w:r>
+              <w:rPr>
+                <w:rFonts w:ascii="Arial" w:eastAsia="Arial" w:hAnsi="Arial" w:cs="Arial"/>
+                <w:i w:val="0"/>
+                <w:iCs w:val="0"/>
+                <w:sz w:val="24"/>
+                <w:szCs w:val="24"/>
+                <w:lang w:val="es-PE"/>
+              </w:rPr>
+              <w:t xml:space="preserve"> de junio de 2026) </w:t>
             </w:r>
           </w:p>
           <w:p>
@@ -5688,7 +8039,7 @@
 </file>
 
 <file path=word/endnotes.xml><?xml version="1.0" encoding="utf-8"?>
-<w:endnotes xmlns:wpc="http://schemas.microsoft.com/office/word/2010/wordprocessingCanvas" xmlns:cx="http://schemas.microsoft.com/office/drawing/2014/chartex" xmlns:cx1="http://schemas.microsoft.com/office/drawing/2015/9/8/chartex" xmlns:cx2="http://schemas.microsoft.com/office/drawing/2015/10/21/chartex" xmlns:cx3="http://schemas.microsoft.com/office/drawing/2016/5/9/chartex" xmlns:cx4="http://schemas.microsoft.com/office/drawing/2016/5/10/chartex" xmlns:cx5="http://schemas.microsoft.com/office/drawing/2016/5/11/chartex" xmlns:cx6="http://schemas.microsoft.com/office/drawing/2016/5/12/chartex" xmlns:cx7="http://schemas.microsoft.com/office/drawing/2016/5/13/chartex" xmlns:cx8="http://schemas.microsoft.com/office/drawing/2016/5/14/chartex" xmlns:mc="http://schemas.openxmlformats.org/markup-compatibility/2006" xmlns:aink="http://schemas.microsoft.com/office/drawing/2016/ink" xmlns:am3d="http://schemas.microsoft.com/office/drawing/2017/model3d" xmlns:o="urn:schemas-microsoft-com:office:office" xmlns:oel="http://schemas.microsoft.com/office/2019/extlst" xmlns:r="http://schemas.openxmlformats.org/officeDocument/2006/relationships" xmlns:m="http://schemas.openxmlformats.org/officeDocument/2006/math" xmlns:v="urn:schemas-microsoft-com:vml" xmlns:wp14="http://schemas.microsoft.com/office/word/2010/wordprocessingDrawing" xmlns:wp="http://schemas.openxmlformats.org/drawingml/2006/wordprocessingDrawing" xmlns:w10="urn:schemas-microsoft-com:office:word" xmlns:w="http://schemas.openxmlformats.org/wordprocessingml/2006/main" xmlns:w14="http://schemas.microsoft.com/office/word/2010/wordml" xmlns:w15="http://schemas.microsoft.com/office/word/2012/wordml" xmlns:w16cex="http://schemas.microsoft.com/office/word/2018/wordml/cex" xmlns:w16cid="http://schemas.microsoft.com/office/word/2016/wordml/cid" xmlns:w16="http://schemas.microsoft.com/office/word/2018/wordml" xmlns:w16du="http://schemas.microsoft.com/office/word/2023/wordml/word16du" xmlns:w16sdtdh="http://schemas.microsoft.com/office/word/2020/wordml/sdtdatahash" xmlns:w16sdtfl="http://schemas.microsoft.com/office/word/2024/wordml/sdtformatlock" xmlns:w16se="http://schemas.microsoft.com/office/word/2015/wordml/symex" xmlns:wpg="http://schemas.microsoft.com/office/word/2010/wordprocessingGroup" xmlns:wpi="http://schemas.microsoft.com/office/word/2010/wordprocessingInk" xmlns:wne="http://schemas.microsoft.com/office/word/2006/wordml" xmlns:wps="http://schemas.microsoft.com/office/word/2010/wordprocessingShape" mc:Ignorable="w14 w15 w16se w16cid w16 w16cex w16sdtdh w16sdtfl w16du wp14">
+<w:endnotes xmlns:wpc="http://schemas.microsoft.com/office/word/2010/wordprocessingCanvas" xmlns:cx="http://schemas.microsoft.com/office/drawing/2014/chartex" xmlns:cx1="http://schemas.microsoft.com/office/drawing/2015/9/8/chartex" xmlns:cx2="http://schemas.microsoft.com/office/drawing/2015/10/21/chartex" xmlns:cx3="http://schemas.microsoft.com/office/drawing/2016/5/9/chartex" xmlns:cx4="http://schemas.microsoft.com/office/drawing/2016/5/10/chartex" xmlns:cx5="http://schemas.microsoft.com/office/drawing/2016/5/11/chartex" xmlns:cx6="http://schemas.microsoft.com/office/drawing/2016/5/12/chartex" xmlns:cx7="http://schemas.microsoft.com/office/drawing/2016/5/13/chartex" xmlns:cx8="http://schemas.microsoft.com/office/drawing/2016/5/14/chartex" xmlns:mc="http://schemas.openxmlformats.org/markup-compatibility/2006" xmlns:aink="http://schemas.microsoft.com/office/drawing/2016/ink" xmlns:am3d="http://schemas.microsoft.com/office/drawing/2017/model3d" xmlns:o="urn:schemas-microsoft-com:office:office" xmlns:r="http://schemas.openxmlformats.org/officeDocument/2006/relationships" xmlns:m="http://schemas.openxmlformats.org/officeDocument/2006/math" xmlns:v="urn:schemas-microsoft-com:vml" xmlns:wp14="http://schemas.microsoft.com/office/word/2010/wordprocessingDrawing" xmlns:wp="http://schemas.openxmlformats.org/drawingml/2006/wordprocessingDrawing" xmlns:w10="urn:schemas-microsoft-com:office:word" xmlns:w="http://schemas.openxmlformats.org/wordprocessingml/2006/main" xmlns:w14="http://schemas.microsoft.com/office/word/2010/wordml" xmlns:w15="http://schemas.microsoft.com/office/word/2012/wordml" xmlns:w16cid="http://schemas.microsoft.com/office/word/2016/wordml/cid" xmlns:w16se="http://schemas.microsoft.com/office/word/2015/wordml/symex" xmlns:wpg="http://schemas.microsoft.com/office/word/2010/wordprocessingGroup" xmlns:wpi="http://schemas.microsoft.com/office/word/2010/wordprocessingInk" xmlns:wne="http://schemas.microsoft.com/office/word/2006/wordml" xmlns:wps="http://schemas.microsoft.com/office/word/2010/wordprocessingShape" mc:Ignorable="w14 w15 w16se w16cid wp14">
   <w:endnote w:type="separator" w:id="-1">
     <w:p>
       <w:pPr>
@@ -5713,7 +8064,7 @@
 </file>
 
 <file path=word/footer1.xml><?xml version="1.0" encoding="utf-8"?>
-<w:ftr xmlns:wpc="http://schemas.microsoft.com/office/word/2010/wordprocessingCanvas" xmlns:cx="http://schemas.microsoft.com/office/drawing/2014/chartex" xmlns:cx1="http://schemas.microsoft.com/office/drawing/2015/9/8/chartex" xmlns:cx2="http://schemas.microsoft.com/office/drawing/2015/10/21/chartex" xmlns:cx3="http://schemas.microsoft.com/office/drawing/2016/5/9/chartex" xmlns:cx4="http://schemas.microsoft.com/office/drawing/2016/5/10/chartex" xmlns:cx5="http://schemas.microsoft.com/office/drawing/2016/5/11/chartex" xmlns:cx6="http://schemas.microsoft.com/office/drawing/2016/5/12/chartex" xmlns:cx7="http://schemas.microsoft.com/office/drawing/2016/5/13/chartex" xmlns:cx8="http://schemas.microsoft.com/office/drawing/2016/5/14/chartex" xmlns:mc="http://schemas.openxmlformats.org/markup-compatibility/2006" xmlns:aink="http://schemas.microsoft.com/office/drawing/2016/ink" xmlns:am3d="http://schemas.microsoft.com/office/drawing/2017/model3d" xmlns:o="urn:schemas-microsoft-com:office:office" xmlns:oel="http://schemas.microsoft.com/office/2019/extlst" xmlns:r="http://schemas.openxmlformats.org/officeDocument/2006/relationships" xmlns:m="http://schemas.openxmlformats.org/officeDocument/2006/math" xmlns:v="urn:schemas-microsoft-com:vml" xmlns:wp14="http://schemas.microsoft.com/office/word/2010/wordprocessingDrawing" xmlns:wp="http://schemas.openxmlformats.org/drawingml/2006/wordprocessingDrawing" xmlns:w10="urn:schemas-microsoft-com:office:word" xmlns:w="http://schemas.openxmlformats.org/wordprocessingml/2006/main" xmlns:w14="http://schemas.microsoft.com/office/word/2010/wordml" xmlns:w15="http://schemas.microsoft.com/office/word/2012/wordml" xmlns:w16cex="http://schemas.microsoft.com/office/word/2018/wordml/cex" xmlns:w16cid="http://schemas.microsoft.com/office/word/2016/wordml/cid" xmlns:w16="http://schemas.microsoft.com/office/word/2018/wordml" xmlns:w16du="http://schemas.microsoft.com/office/word/2023/wordml/word16du" xmlns:w16sdtdh="http://schemas.microsoft.com/office/word/2020/wordml/sdtdatahash" xmlns:w16sdtfl="http://schemas.microsoft.com/office/word/2024/wordml/sdtformatlock" xmlns:w16se="http://schemas.microsoft.com/office/word/2015/wordml/symex" xmlns:wpg="http://schemas.microsoft.com/office/word/2010/wordprocessingGroup" xmlns:wpi="http://schemas.microsoft.com/office/word/2010/wordprocessingInk" xmlns:wne="http://schemas.microsoft.com/office/word/2006/wordml" xmlns:wps="http://schemas.microsoft.com/office/word/2010/wordprocessingShape" mc:Ignorable="w14 w15 w16se w16cid w16 w16cex w16sdtdh w16sdtfl w16du wp14">
+<w:ftr xmlns:wpc="http://schemas.microsoft.com/office/word/2010/wordprocessingCanvas" xmlns:cx="http://schemas.microsoft.com/office/drawing/2014/chartex" xmlns:cx1="http://schemas.microsoft.com/office/drawing/2015/9/8/chartex" xmlns:cx2="http://schemas.microsoft.com/office/drawing/2015/10/21/chartex" xmlns:cx3="http://schemas.microsoft.com/office/drawing/2016/5/9/chartex" xmlns:cx4="http://schemas.microsoft.com/office/drawing/2016/5/10/chartex" xmlns:cx5="http://schemas.microsoft.com/office/drawing/2016/5/11/chartex" xmlns:cx6="http://schemas.microsoft.com/office/drawing/2016/5/12/chartex" xmlns:cx7="http://schemas.microsoft.com/office/drawing/2016/5/13/chartex" xmlns:cx8="http://schemas.microsoft.com/office/drawing/2016/5/14/chartex" xmlns:mc="http://schemas.openxmlformats.org/markup-compatibility/2006" xmlns:aink="http://schemas.microsoft.com/office/drawing/2016/ink" xmlns:am3d="http://schemas.microsoft.com/office/drawing/2017/model3d" xmlns:o="urn:schemas-microsoft-com:office:office" xmlns:r="http://schemas.openxmlformats.org/officeDocument/2006/relationships" xmlns:m="http://schemas.openxmlformats.org/officeDocument/2006/math" xmlns:v="urn:schemas-microsoft-com:vml" xmlns:wp14="http://schemas.microsoft.com/office/word/2010/wordprocessingDrawing" xmlns:wp="http://schemas.openxmlformats.org/drawingml/2006/wordprocessingDrawing" xmlns:w10="urn:schemas-microsoft-com:office:word" xmlns:w="http://schemas.openxmlformats.org/wordprocessingml/2006/main" xmlns:w14="http://schemas.microsoft.com/office/word/2010/wordml" xmlns:w15="http://schemas.microsoft.com/office/word/2012/wordml" xmlns:w16cid="http://schemas.microsoft.com/office/word/2016/wordml/cid" xmlns:w16se="http://schemas.microsoft.com/office/word/2015/wordml/symex" xmlns:wpg="http://schemas.microsoft.com/office/word/2010/wordprocessingGroup" xmlns:wpi="http://schemas.microsoft.com/office/word/2010/wordprocessingInk" xmlns:wne="http://schemas.microsoft.com/office/word/2006/wordml" xmlns:wps="http://schemas.microsoft.com/office/word/2010/wordprocessingShape" mc:Ignorable="w14 w15 w16se w16cid wp14">
   <w:p>
     <w:pPr>
       <w:widowControl w:val="0"/>
@@ -5854,8 +8205,16 @@
             <w:rPr>
               <w:rFonts w:ascii="Agrandir" w:eastAsia="Agrandir" w:hAnsi="Agrandir" w:cs="Agrandir"/>
             </w:rPr>
-            <w:t>Carta del proyecto</w:t>
+            <w:t xml:space="preserve">Carta del </w:t>
           </w:r>
+          <w:proofErr w:type="spellStart"/>
+          <w:r>
+            <w:rPr>
+              <w:rFonts w:ascii="Agrandir" w:eastAsia="Agrandir" w:hAnsi="Agrandir" w:cs="Agrandir"/>
+            </w:rPr>
+            <w:t>proyecto</w:t>
+          </w:r>
+          <w:proofErr w:type="spellEnd"/>
         </w:p>
         <w:p>
           <w:pPr>
@@ -5965,7 +8324,7 @@
 </file>
 
 <file path=word/footnotes.xml><?xml version="1.0" encoding="utf-8"?>
-<w:footnotes xmlns:wpc="http://schemas.microsoft.com/office/word/2010/wordprocessingCanvas" xmlns:cx="http://schemas.microsoft.com/office/drawing/2014/chartex" xmlns:cx1="http://schemas.microsoft.com/office/drawing/2015/9/8/chartex" xmlns:cx2="http://schemas.microsoft.com/office/drawing/2015/10/21/chartex" xmlns:cx3="http://schemas.microsoft.com/office/drawing/2016/5/9/chartex" xmlns:cx4="http://schemas.microsoft.com/office/drawing/2016/5/10/chartex" xmlns:cx5="http://schemas.microsoft.com/office/drawing/2016/5/11/chartex" xmlns:cx6="http://schemas.microsoft.com/office/drawing/2016/5/12/chartex" xmlns:cx7="http://schemas.microsoft.com/office/drawing/2016/5/13/chartex" xmlns:cx8="http://schemas.microsoft.com/office/drawing/2016/5/14/chartex" xmlns:mc="http://schemas.openxmlformats.org/markup-compatibility/2006" xmlns:aink="http://schemas.microsoft.com/office/drawing/2016/ink" xmlns:am3d="http://schemas.microsoft.com/office/drawing/2017/model3d" xmlns:o="urn:schemas-microsoft-com:office:office" xmlns:oel="http://schemas.microsoft.com/office/2019/extlst" xmlns:r="http://schemas.openxmlformats.org/officeDocument/2006/relationships" xmlns:m="http://schemas.openxmlformats.org/officeDocument/2006/math" xmlns:v="urn:schemas-microsoft-com:vml" xmlns:wp14="http://schemas.microsoft.com/office/word/2010/wordprocessingDrawing" xmlns:wp="http://schemas.openxmlformats.org/drawingml/2006/wordprocessingDrawing" xmlns:w10="urn:schemas-microsoft-com:office:word" xmlns:w="http://schemas.openxmlformats.org/wordprocessingml/2006/main" xmlns:w14="http://schemas.microsoft.com/office/word/2010/wordml" xmlns:w15="http://schemas.microsoft.com/office/word/2012/wordml" xmlns:w16cex="http://schemas.microsoft.com/office/word/2018/wordml/cex" xmlns:w16cid="http://schemas.microsoft.com/office/word/2016/wordml/cid" xmlns:w16="http://schemas.microsoft.com/office/word/2018/wordml" xmlns:w16du="http://schemas.microsoft.com/office/word/2023/wordml/word16du" xmlns:w16sdtdh="http://schemas.microsoft.com/office/word/2020/wordml/sdtdatahash" xmlns:w16sdtfl="http://schemas.microsoft.com/office/word/2024/wordml/sdtformatlock" xmlns:w16se="http://schemas.microsoft.com/office/word/2015/wordml/symex" xmlns:wpg="http://schemas.microsoft.com/office/word/2010/wordprocessingGroup" xmlns:wpi="http://schemas.microsoft.com/office/word/2010/wordprocessingInk" xmlns:wne="http://schemas.microsoft.com/office/word/2006/wordml" xmlns:wps="http://schemas.microsoft.com/office/word/2010/wordprocessingShape" mc:Ignorable="w14 w15 w16se w16cid w16 w16cex w16sdtdh w16sdtfl w16du wp14">
+<w:footnotes xmlns:wpc="http://schemas.microsoft.com/office/word/2010/wordprocessingCanvas" xmlns:cx="http://schemas.microsoft.com/office/drawing/2014/chartex" xmlns:cx1="http://schemas.microsoft.com/office/drawing/2015/9/8/chartex" xmlns:cx2="http://schemas.microsoft.com/office/drawing/2015/10/21/chartex" xmlns:cx3="http://schemas.microsoft.com/office/drawing/2016/5/9/chartex" xmlns:cx4="http://schemas.microsoft.com/office/drawing/2016/5/10/chartex" xmlns:cx5="http://schemas.microsoft.com/office/drawing/2016/5/11/chartex" xmlns:cx6="http://schemas.microsoft.com/office/drawing/2016/5/12/chartex" xmlns:cx7="http://schemas.microsoft.com/office/drawing/2016/5/13/chartex" xmlns:cx8="http://schemas.microsoft.com/office/drawing/2016/5/14/chartex" xmlns:mc="http://schemas.openxmlformats.org/markup-compatibility/2006" xmlns:aink="http://schemas.microsoft.com/office/drawing/2016/ink" xmlns:am3d="http://schemas.microsoft.com/office/drawing/2017/model3d" xmlns:o="urn:schemas-microsoft-com:office:office" xmlns:r="http://schemas.openxmlformats.org/officeDocument/2006/relationships" xmlns:m="http://schemas.openxmlformats.org/officeDocument/2006/math" xmlns:v="urn:schemas-microsoft-com:vml" xmlns:wp14="http://schemas.microsoft.com/office/word/2010/wordprocessingDrawing" xmlns:wp="http://schemas.openxmlformats.org/drawingml/2006/wordprocessingDrawing" xmlns:w10="urn:schemas-microsoft-com:office:word" xmlns:w="http://schemas.openxmlformats.org/wordprocessingml/2006/main" xmlns:w14="http://schemas.microsoft.com/office/word/2010/wordml" xmlns:w15="http://schemas.microsoft.com/office/word/2012/wordml" xmlns:w16cid="http://schemas.microsoft.com/office/word/2016/wordml/cid" xmlns:w16se="http://schemas.microsoft.com/office/word/2015/wordml/symex" xmlns:wpg="http://schemas.microsoft.com/office/word/2010/wordprocessingGroup" xmlns:wpi="http://schemas.microsoft.com/office/word/2010/wordprocessingInk" xmlns:wne="http://schemas.microsoft.com/office/word/2006/wordml" xmlns:wps="http://schemas.microsoft.com/office/word/2010/wordprocessingShape" mc:Ignorable="w14 w15 w16se w16cid wp14">
   <w:footnote w:type="separator" w:id="-1">
     <w:p>
       <w:pPr>
@@ -5990,7 +8349,7 @@
 </file>
 
 <file path=word/header1.xml><?xml version="1.0" encoding="utf-8"?>
-<w:hdr xmlns:wpc="http://schemas.microsoft.com/office/word/2010/wordprocessingCanvas" xmlns:cx="http://schemas.microsoft.com/office/drawing/2014/chartex" xmlns:cx1="http://schemas.microsoft.com/office/drawing/2015/9/8/chartex" xmlns:cx2="http://schemas.microsoft.com/office/drawing/2015/10/21/chartex" xmlns:cx3="http://schemas.microsoft.com/office/drawing/2016/5/9/chartex" xmlns:cx4="http://schemas.microsoft.com/office/drawing/2016/5/10/chartex" xmlns:cx5="http://schemas.microsoft.com/office/drawing/2016/5/11/chartex" xmlns:cx6="http://schemas.microsoft.com/office/drawing/2016/5/12/chartex" xmlns:cx7="http://schemas.microsoft.com/office/drawing/2016/5/13/chartex" xmlns:cx8="http://schemas.microsoft.com/office/drawing/2016/5/14/chartex" xmlns:mc="http://schemas.openxmlformats.org/markup-compatibility/2006" xmlns:aink="http://schemas.microsoft.com/office/drawing/2016/ink" xmlns:am3d="http://schemas.microsoft.com/office/drawing/2017/model3d" xmlns:o="urn:schemas-microsoft-com:office:office" xmlns:oel="http://schemas.microsoft.com/office/2019/extlst" xmlns:r="http://schemas.openxmlformats.org/officeDocument/2006/relationships" xmlns:m="http://schemas.openxmlformats.org/officeDocument/2006/math" xmlns:v="urn:schemas-microsoft-com:vml" xmlns:wp14="http://schemas.microsoft.com/office/word/2010/wordprocessingDrawing" xmlns:wp="http://schemas.openxmlformats.org/drawingml/2006/wordprocessingDrawing" xmlns:w10="urn:schemas-microsoft-com:office:word" xmlns:w="http://schemas.openxmlformats.org/wordprocessingml/2006/main" xmlns:w14="http://schemas.microsoft.com/office/word/2010/wordml" xmlns:w15="http://schemas.microsoft.com/office/word/2012/wordml" xmlns:w16cex="http://schemas.microsoft.com/office/word/2018/wordml/cex" xmlns:w16cid="http://schemas.microsoft.com/office/word/2016/wordml/cid" xmlns:w16="http://schemas.microsoft.com/office/word/2018/wordml" xmlns:w16du="http://schemas.microsoft.com/office/word/2023/wordml/word16du" xmlns:w16sdtdh="http://schemas.microsoft.com/office/word/2020/wordml/sdtdatahash" xmlns:w16sdtfl="http://schemas.microsoft.com/office/word/2024/wordml/sdtformatlock" xmlns:w16se="http://schemas.microsoft.com/office/word/2015/wordml/symex" xmlns:wpg="http://schemas.microsoft.com/office/word/2010/wordprocessingGroup" xmlns:wpi="http://schemas.microsoft.com/office/word/2010/wordprocessingInk" xmlns:wne="http://schemas.microsoft.com/office/word/2006/wordml" xmlns:wps="http://schemas.microsoft.com/office/word/2010/wordprocessingShape" mc:Ignorable="w14 w15 w16se w16cid w16 w16cex w16sdtdh w16sdtfl w16du wp14">
+<w:hdr xmlns:wpc="http://schemas.microsoft.com/office/word/2010/wordprocessingCanvas" xmlns:cx="http://schemas.microsoft.com/office/drawing/2014/chartex" xmlns:cx1="http://schemas.microsoft.com/office/drawing/2015/9/8/chartex" xmlns:cx2="http://schemas.microsoft.com/office/drawing/2015/10/21/chartex" xmlns:cx3="http://schemas.microsoft.com/office/drawing/2016/5/9/chartex" xmlns:cx4="http://schemas.microsoft.com/office/drawing/2016/5/10/chartex" xmlns:cx5="http://schemas.microsoft.com/office/drawing/2016/5/11/chartex" xmlns:cx6="http://schemas.microsoft.com/office/drawing/2016/5/12/chartex" xmlns:cx7="http://schemas.microsoft.com/office/drawing/2016/5/13/chartex" xmlns:cx8="http://schemas.microsoft.com/office/drawing/2016/5/14/chartex" xmlns:mc="http://schemas.openxmlformats.org/markup-compatibility/2006" xmlns:aink="http://schemas.microsoft.com/office/drawing/2016/ink" xmlns:am3d="http://schemas.microsoft.com/office/drawing/2017/model3d" xmlns:o="urn:schemas-microsoft-com:office:office" xmlns:r="http://schemas.openxmlformats.org/officeDocument/2006/relationships" xmlns:m="http://schemas.openxmlformats.org/officeDocument/2006/math" xmlns:v="urn:schemas-microsoft-com:vml" xmlns:wp14="http://schemas.microsoft.com/office/word/2010/wordprocessingDrawing" xmlns:wp="http://schemas.openxmlformats.org/drawingml/2006/wordprocessingDrawing" xmlns:w10="urn:schemas-microsoft-com:office:word" xmlns:w="http://schemas.openxmlformats.org/wordprocessingml/2006/main" xmlns:w14="http://schemas.microsoft.com/office/word/2010/wordml" xmlns:w15="http://schemas.microsoft.com/office/word/2012/wordml" xmlns:w16cid="http://schemas.microsoft.com/office/word/2016/wordml/cid" xmlns:w16se="http://schemas.microsoft.com/office/word/2015/wordml/symex" xmlns:wpg="http://schemas.microsoft.com/office/word/2010/wordprocessingGroup" xmlns:wpi="http://schemas.microsoft.com/office/word/2010/wordprocessingInk" xmlns:wne="http://schemas.microsoft.com/office/word/2006/wordml" xmlns:wps="http://schemas.microsoft.com/office/word/2010/wordprocessingShape" mc:Ignorable="w14 w15 w16se w16cid wp14">
   <w:p>
     <w:pPr>
       <w:widowControl w:val="0"/>
@@ -6190,7 +8549,7 @@
 </file>
 
 <file path=word/numbering.xml><?xml version="1.0" encoding="utf-8"?>
-<w:numbering xmlns:wpc="http://schemas.microsoft.com/office/word/2010/wordprocessingCanvas" xmlns:cx="http://schemas.microsoft.com/office/drawing/2014/chartex" xmlns:cx1="http://schemas.microsoft.com/office/drawing/2015/9/8/chartex" xmlns:cx2="http://schemas.microsoft.com/office/drawing/2015/10/21/chartex" xmlns:cx3="http://schemas.microsoft.com/office/drawing/2016/5/9/chartex" xmlns:cx4="http://schemas.microsoft.com/office/drawing/2016/5/10/chartex" xmlns:cx5="http://schemas.microsoft.com/office/drawing/2016/5/11/chartex" xmlns:cx6="http://schemas.microsoft.com/office/drawing/2016/5/12/chartex" xmlns:cx7="http://schemas.microsoft.com/office/drawing/2016/5/13/chartex" xmlns:cx8="http://schemas.microsoft.com/office/drawing/2016/5/14/chartex" xmlns:mc="http://schemas.openxmlformats.org/markup-compatibility/2006" xmlns:aink="http://schemas.microsoft.com/office/drawing/2016/ink" xmlns:am3d="http://schemas.microsoft.com/office/drawing/2017/model3d" xmlns:o="urn:schemas-microsoft-com:office:office" xmlns:oel="http://schemas.microsoft.com/office/2019/extlst" xmlns:r="http://schemas.openxmlformats.org/officeDocument/2006/relationships" xmlns:m="http://schemas.openxmlformats.org/officeDocument/2006/math" xmlns:v="urn:schemas-microsoft-com:vml" xmlns:wp14="http://schemas.microsoft.com/office/word/2010/wordprocessingDrawing" xmlns:wp="http://schemas.openxmlformats.org/drawingml/2006/wordprocessingDrawing" xmlns:w10="urn:schemas-microsoft-com:office:word" xmlns:w="http://schemas.openxmlformats.org/wordprocessingml/2006/main" xmlns:w14="http://schemas.microsoft.com/office/word/2010/wordml" xmlns:w15="http://schemas.microsoft.com/office/word/2012/wordml" xmlns:w16cex="http://schemas.microsoft.com/office/word/2018/wordml/cex" xmlns:w16cid="http://schemas.microsoft.com/office/word/2016/wordml/cid" xmlns:w16="http://schemas.microsoft.com/office/word/2018/wordml" xmlns:w16du="http://schemas.microsoft.com/office/word/2023/wordml/word16du" xmlns:w16sdtdh="http://schemas.microsoft.com/office/word/2020/wordml/sdtdatahash" xmlns:w16sdtfl="http://schemas.microsoft.com/office/word/2024/wordml/sdtformatlock" xmlns:w16se="http://schemas.microsoft.com/office/word/2015/wordml/symex" xmlns:wpg="http://schemas.microsoft.com/office/word/2010/wordprocessingGroup" xmlns:wpi="http://schemas.microsoft.com/office/word/2010/wordprocessingInk" xmlns:wne="http://schemas.microsoft.com/office/word/2006/wordml" xmlns:wps="http://schemas.microsoft.com/office/word/2010/wordprocessingShape" mc:Ignorable="w14 w15 w16se w16cid w16 w16cex w16sdtdh w16sdtfl w16du wp14">
+<w:numbering xmlns:wpc="http://schemas.microsoft.com/office/word/2010/wordprocessingCanvas" xmlns:cx="http://schemas.microsoft.com/office/drawing/2014/chartex" xmlns:cx1="http://schemas.microsoft.com/office/drawing/2015/9/8/chartex" xmlns:cx2="http://schemas.microsoft.com/office/drawing/2015/10/21/chartex" xmlns:cx3="http://schemas.microsoft.com/office/drawing/2016/5/9/chartex" xmlns:cx4="http://schemas.microsoft.com/office/drawing/2016/5/10/chartex" xmlns:cx5="http://schemas.microsoft.com/office/drawing/2016/5/11/chartex" xmlns:cx6="http://schemas.microsoft.com/office/drawing/2016/5/12/chartex" xmlns:cx7="http://schemas.microsoft.com/office/drawing/2016/5/13/chartex" xmlns:cx8="http://schemas.microsoft.com/office/drawing/2016/5/14/chartex" xmlns:mc="http://schemas.openxmlformats.org/markup-compatibility/2006" xmlns:aink="http://schemas.microsoft.com/office/drawing/2016/ink" xmlns:am3d="http://schemas.microsoft.com/office/drawing/2017/model3d" xmlns:o="urn:schemas-microsoft-com:office:office" xmlns:r="http://schemas.openxmlformats.org/officeDocument/2006/relationships" xmlns:m="http://schemas.openxmlformats.org/officeDocument/2006/math" xmlns:v="urn:schemas-microsoft-com:vml" xmlns:wp14="http://schemas.microsoft.com/office/word/2010/wordprocessingDrawing" xmlns:wp="http://schemas.openxmlformats.org/drawingml/2006/wordprocessingDrawing" xmlns:w10="urn:schemas-microsoft-com:office:word" xmlns:w="http://schemas.openxmlformats.org/wordprocessingml/2006/main" xmlns:w14="http://schemas.microsoft.com/office/word/2010/wordml" xmlns:w15="http://schemas.microsoft.com/office/word/2012/wordml" xmlns:w16cid="http://schemas.microsoft.com/office/word/2016/wordml/cid" xmlns:w16se="http://schemas.microsoft.com/office/word/2015/wordml/symex" xmlns:wpg="http://schemas.microsoft.com/office/word/2010/wordprocessingGroup" xmlns:wpi="http://schemas.microsoft.com/office/word/2010/wordprocessingInk" xmlns:wne="http://schemas.microsoft.com/office/word/2006/wordml" xmlns:wps="http://schemas.microsoft.com/office/word/2010/wordprocessingShape" mc:Ignorable="w14 w15 w16se w16cid wp14">
   <w:abstractNum w:abstractNumId="0" w15:restartNumberingAfterBreak="0">
     <w:nsid w:val="06080130"/>
     <w:multiLevelType w:val="hybridMultilevel"/>
@@ -9191,83 +11550,83 @@
       </w:rPr>
     </w:lvl>
   </w:abstractNum>
-  <w:num w:numId="1" w16cid:durableId="871917350">
+  <w:num w:numId="1">
     <w:abstractNumId w:val="4"/>
   </w:num>
-  <w:num w:numId="2" w16cid:durableId="489906970">
+  <w:num w:numId="2">
     <w:abstractNumId w:val="18"/>
   </w:num>
-  <w:num w:numId="3" w16cid:durableId="1769420599">
+  <w:num w:numId="3">
     <w:abstractNumId w:val="20"/>
   </w:num>
-  <w:num w:numId="4" w16cid:durableId="1797604809">
+  <w:num w:numId="4">
     <w:abstractNumId w:val="19"/>
   </w:num>
-  <w:num w:numId="5" w16cid:durableId="2056081754">
+  <w:num w:numId="5">
     <w:abstractNumId w:val="11"/>
   </w:num>
-  <w:num w:numId="6" w16cid:durableId="63725836">
+  <w:num w:numId="6">
     <w:abstractNumId w:val="23"/>
   </w:num>
-  <w:num w:numId="7" w16cid:durableId="325593615">
+  <w:num w:numId="7">
     <w:abstractNumId w:val="8"/>
   </w:num>
-  <w:num w:numId="8" w16cid:durableId="1684045587">
+  <w:num w:numId="8">
     <w:abstractNumId w:val="17"/>
   </w:num>
-  <w:num w:numId="9" w16cid:durableId="1593932763">
+  <w:num w:numId="9">
     <w:abstractNumId w:val="14"/>
   </w:num>
-  <w:num w:numId="10" w16cid:durableId="1691450443">
+  <w:num w:numId="10">
     <w:abstractNumId w:val="16"/>
   </w:num>
-  <w:num w:numId="11" w16cid:durableId="1280256701">
+  <w:num w:numId="11">
     <w:abstractNumId w:val="3"/>
   </w:num>
-  <w:num w:numId="12" w16cid:durableId="1598947412">
+  <w:num w:numId="12">
     <w:abstractNumId w:val="1"/>
   </w:num>
-  <w:num w:numId="13" w16cid:durableId="220949596">
+  <w:num w:numId="13">
     <w:abstractNumId w:val="13"/>
   </w:num>
-  <w:num w:numId="14" w16cid:durableId="2080904417">
+  <w:num w:numId="14">
     <w:abstractNumId w:val="12"/>
   </w:num>
-  <w:num w:numId="15" w16cid:durableId="173494428">
+  <w:num w:numId="15">
     <w:abstractNumId w:val="15"/>
   </w:num>
-  <w:num w:numId="16" w16cid:durableId="81029837">
+  <w:num w:numId="16">
     <w:abstractNumId w:val="5"/>
   </w:num>
-  <w:num w:numId="17" w16cid:durableId="157886417">
+  <w:num w:numId="17">
     <w:abstractNumId w:val="22"/>
   </w:num>
-  <w:num w:numId="18" w16cid:durableId="1601182343">
+  <w:num w:numId="18">
     <w:abstractNumId w:val="7"/>
   </w:num>
-  <w:num w:numId="19" w16cid:durableId="1313825465">
+  <w:num w:numId="19">
     <w:abstractNumId w:val="9"/>
   </w:num>
-  <w:num w:numId="20" w16cid:durableId="803036859">
+  <w:num w:numId="20">
     <w:abstractNumId w:val="21"/>
   </w:num>
-  <w:num w:numId="21" w16cid:durableId="1527477569">
+  <w:num w:numId="21">
     <w:abstractNumId w:val="0"/>
   </w:num>
-  <w:num w:numId="22" w16cid:durableId="1101267814">
+  <w:num w:numId="22">
     <w:abstractNumId w:val="6"/>
   </w:num>
-  <w:num w:numId="23" w16cid:durableId="626662124">
+  <w:num w:numId="23">
     <w:abstractNumId w:val="10"/>
   </w:num>
-  <w:num w:numId="24" w16cid:durableId="1622802688">
+  <w:num w:numId="24">
     <w:abstractNumId w:val="2"/>
   </w:num>
 </w:numbering>
 </file>
 
 <file path=word/styles.xml><?xml version="1.0" encoding="utf-8"?>
-<w:styles xmlns:mc="http://schemas.openxmlformats.org/markup-compatibility/2006" xmlns:r="http://schemas.openxmlformats.org/officeDocument/2006/relationships" xmlns:w="http://schemas.openxmlformats.org/wordprocessingml/2006/main" xmlns:w14="http://schemas.microsoft.com/office/word/2010/wordml" xmlns:w15="http://schemas.microsoft.com/office/word/2012/wordml" xmlns:w16cex="http://schemas.microsoft.com/office/word/2018/wordml/cex" xmlns:w16cid="http://schemas.microsoft.com/office/word/2016/wordml/cid" xmlns:w16="http://schemas.microsoft.com/office/word/2018/wordml" xmlns:w16du="http://schemas.microsoft.com/office/word/2023/wordml/word16du" xmlns:w16sdtdh="http://schemas.microsoft.com/office/word/2020/wordml/sdtdatahash" xmlns:w16sdtfl="http://schemas.microsoft.com/office/word/2024/wordml/sdtformatlock" xmlns:w16se="http://schemas.microsoft.com/office/word/2015/wordml/symex" mc:Ignorable="w14 w15 w16se w16cid w16 w16cex w16sdtdh w16sdtfl w16du">
+<w:styles xmlns:mc="http://schemas.openxmlformats.org/markup-compatibility/2006" xmlns:r="http://schemas.openxmlformats.org/officeDocument/2006/relationships" xmlns:w="http://schemas.openxmlformats.org/wordprocessingml/2006/main" xmlns:w14="http://schemas.microsoft.com/office/word/2010/wordml" xmlns:w15="http://schemas.microsoft.com/office/word/2012/wordml" xmlns:w16cid="http://schemas.microsoft.com/office/word/2016/wordml/cid" xmlns:w16se="http://schemas.microsoft.com/office/word/2015/wordml/symex" mc:Ignorable="w14 w15 w16se w16cid">
   <w:docDefaults>
     <w:rPrDefault>
       <w:rPr>
@@ -9283,7 +11642,7 @@
       </w:pPr>
     </w:pPrDefault>
   </w:docDefaults>
-  <w:latentStyles w:defLockedState="0" w:defUIPriority="99" w:defSemiHidden="0" w:defUnhideWhenUsed="0" w:defQFormat="0" w:count="376">
+  <w:latentStyles w:defLockedState="0" w:defUIPriority="99" w:defSemiHidden="0" w:defUnhideWhenUsed="0" w:defQFormat="0" w:count="375">
     <w:lsdException w:name="Normal" w:uiPriority="0" w:qFormat="1"/>
     <w:lsdException w:name="heading 1" w:uiPriority="9" w:qFormat="1"/>
     <w:lsdException w:name="heading 2" w:semiHidden="1" w:uiPriority="9" w:unhideWhenUsed="1" w:qFormat="1"/>
@@ -9659,7 +12018,6 @@
     <w:lsdException w:name="Smart Hyperlink" w:semiHidden="1" w:unhideWhenUsed="1"/>
     <w:lsdException w:name="Hashtag" w:semiHidden="1" w:unhideWhenUsed="1"/>
     <w:lsdException w:name="Unresolved Mention" w:semiHidden="1" w:unhideWhenUsed="1"/>
-    <w:lsdException w:name="Smart Link" w:semiHidden="1" w:unhideWhenUsed="1"/>
   </w:latentStyles>
   <w:style w:type="paragraph" w:default="1" w:styleId="Normal">
     <w:name w:val="Normal"/>

</xml_diff>